<commit_message>
Act 0 report round 14d: appendix 11.6-11.9 (pre-training commands, statistics, stroke filter, data per experiment); add per-recording predictions
</commit_message>
<xml_diff>
--- a/docs/Act0_Final_Report.docx
+++ b/docs/Act0_Final_Report.docx
@@ -3746,6 +3746,82 @@
     </w:p>
     <w:p>
       <w:pPr>
+        <w:tabs>
+          <w:tab w:pos="8755" w:val="right" w:leader="dot"/>
+        </w:tabs>
+        <w:spacing w:after="80" w:line="240" w:lineRule="auto"/>
+        <w:ind w:left="360" w:firstLine="0"/>
+        <w:jc w:val="left"/>
+      </w:pPr>
+      <w:r>
+        <w:rPr>
+          <w:b w:val="0"/>
+          <w:sz w:val="19"/>
+        </w:rPr>
+        <w:t>11.6  Pre-training Configuration and Commands</w:t>
+        <w:tab/>
+        <w:t>46</w:t>
+      </w:r>
+    </w:p>
+    <w:p>
+      <w:pPr>
+        <w:tabs>
+          <w:tab w:pos="8755" w:val="right" w:leader="dot"/>
+        </w:tabs>
+        <w:spacing w:after="80" w:line="240" w:lineRule="auto"/>
+        <w:ind w:left="360" w:firstLine="0"/>
+        <w:jc w:val="left"/>
+      </w:pPr>
+      <w:r>
+        <w:rPr>
+          <w:b w:val="0"/>
+          <w:sz w:val="19"/>
+        </w:rPr>
+        <w:t>11.7  Statistical Procedures</w:t>
+        <w:tab/>
+        <w:t>47</w:t>
+      </w:r>
+    </w:p>
+    <w:p>
+      <w:pPr>
+        <w:tabs>
+          <w:tab w:pos="8755" w:val="right" w:leader="dot"/>
+        </w:tabs>
+        <w:spacing w:after="80" w:line="240" w:lineRule="auto"/>
+        <w:ind w:left="360" w:firstLine="0"/>
+        <w:jc w:val="left"/>
+      </w:pPr>
+      <w:r>
+        <w:rPr>
+          <w:b w:val="0"/>
+          <w:sz w:val="19"/>
+        </w:rPr>
+        <w:t>11.8  Stroke Spectral-Matching Filter</w:t>
+        <w:tab/>
+        <w:t>47</w:t>
+      </w:r>
+    </w:p>
+    <w:p>
+      <w:pPr>
+        <w:tabs>
+          <w:tab w:pos="8755" w:val="right" w:leader="dot"/>
+        </w:tabs>
+        <w:spacing w:after="80" w:line="240" w:lineRule="auto"/>
+        <w:ind w:left="360" w:firstLine="0"/>
+        <w:jc w:val="left"/>
+      </w:pPr>
+      <w:r>
+        <w:rPr>
+          <w:b w:val="0"/>
+          <w:sz w:val="19"/>
+        </w:rPr>
+        <w:t>11.9  Data Used by Each Experiment</w:t>
+        <w:tab/>
+        <w:t>48</w:t>
+      </w:r>
+    </w:p>
+    <w:p>
+      <w:pPr>
         <w:pageBreakBefore/>
         <w:spacing w:after="320"/>
         <w:jc w:val="left"/>
@@ -15177,7 +15253,7 @@
         <w:rPr>
           <w:b w:val="0"/>
         </w:rPr>
-        <w:t>The two groups don't overlap at all. The largest token std measured for the released checkpoint, on any recording, was 0.0085. The smallest measured for a random-weight twin was 0.379. That rules out measurement noise. The released EEG-VJEPA checkpoints give almost the same output for every input, on two entirely different patient populations. This is a property of the released weights themselves, not of our pipeline, our preprocessing, or which dataset we happen to test on. We even checked whether our own z-scoring convention could be doing this: per-recording and per-window normalisation give the same collapsed number (token std 0.0059, cosine 1.0000) on the same 120 recordings. It isn't us.</w:t>
+        <w:t>The two groups don't overlap at all. The largest token std measured for the released checkpoint, on any recording, was 0.0085. The smallest measured for a random-weight twin was 0.379. That rules out measurement noise. The released EEG-VJEPA checkpoints give almost the same output for every input, on two entirely different patient populations. This is a property of the released weights themselves, not of our pipeline, our preprocessing, or which dataset we happen to test on. We even checked whether our own z-scoring convention could be doing this: per-recording and per-window normalisation give the same collapsed number (token std 0.0059, cosine 1.0000) on the same 120 recordings. It isn't us. We fixed no numeric collapse threshold in advance: the criterion is separation from every random-weight twin, and a gap of 0.0085 against 0.379 needs no threshold to read.</w:t>
       </w:r>
     </w:p>
     <w:p>
@@ -16637,7 +16713,7 @@
         <w:rPr>
           <w:b w:val="0"/>
         </w:rPr>
-        <w:t>FEI+GTJ was built and validated entirely on NMT (Pakistan). Experiment 6 asks whether it still works on TUAB (USA): a different hospital, different hardware, a different patient population. We separate two settings. Zero-shot cross-dataset transfer: the encoder is pre-trained on NMT only and never sees a TUAB recording, labelled or not, before its frozen features are probed. Target-domain unlabelled adaptation: the encoder is re-pre-trained on NMT plus TUAB's unlabelled training recordings (never the eval set, never a label) and then probed the same way. In both settings the linear probe is fitted on TUAB's labelled training subsets and scored on the 276-recording eval set, exactly as in Experiment 4.</w:t>
+        <w:t>FEI+GTJ was built and validated entirely on NMT (Pakistan). Experiment 6 tests it on TUAB (USA): a different hospital, different hardware, a different patient population. We separate two settings. Zero-shot cross-dataset transfer: the encoder is pre-trained on NMT only and never sees a TUAB recording, labelled or not, before its frozen features are probed. Target-domain unlabelled adaptation: the encoder is re-pre-trained on NMT plus TUAB's unlabelled training recordings (never the eval set, never a label) and then probed the same way. In both settings the linear probe is fitted on TUAB's labelled training subsets and scored on the 276-recording eval set, exactly as in Experiment 4.</w:t>
       </w:r>
     </w:p>
     <w:p>
@@ -21939,7 +22015,7 @@
         <w:rPr>
           <w:b w:val="0"/>
         </w:rPr>
-        <w:t>All code, saved model checkpoints, and saved per-recording predictions used to produce every number, table, and figure in this report are organized as a set of scripts, one per experiment (Table 5). Table 4 gives the script behind each experiment's input. The 200 Hz NMT copy that FEI and GTJ read (per-channel z-scored at NMT's native rate, stored as 2.5-second frames) was first written in August 2026 by a script that was not kept; we reconstructed its recipe as code/preprocess_nmt_200hz.py, which reproduces all 2,417 stored files byte for byte. From those inputs, pre-train an encoder (`fei_pretrain.py` or `fei_branchC.py`, both with a `--selftest` flag for a fast sanity check with no real data and a `--cv` flag for the full five-fold cross-validation reported here), score it with `feic_nmt_anchor.py` (Experiment 5) or `tuab_feic.py` (Experiment 6), and evaluate a frozen or fine-tuned released checkpoint with the corresponding `tuab_*_eval.py` script. Every long-running script checkpoints its progress after each cross-validation fold and can be safely re-run to resume after an interruption, and each accepts command-line flags for every experiment variant reported here. The code is in github.com/mashfiqurrahman2020-coder/EEG-VJEPA-act-0; its docs/act0_repro/ folder holds the fold, subset and cohort lists, the SHA-256 of every checkpoint and result file, and the pinned environment (Appendix §11).</w:t>
+        <w:t>All code, saved model checkpoints, and saved per-recording predictions used to produce every number, table, and figure in this report are organized as a set of scripts, one per experiment (Table 5). Table 4 gives the script behind each experiment's input. The 200 Hz NMT copy that FEI and GTJ read (per-channel z-scored at NMT's native rate, stored as 2.5-second frames) was first written in August 2026 by a script that was not kept; we reconstructed its recipe as code/preprocess_nmt_200hz.py, which reproduces all 2,417 stored files byte for byte. From those inputs, pre-train an encoder (`fei_pretrain.py` or `fei_branchC.py`, both with a `--selftest` flag for a fast sanity check with no real data and a `--cv` flag for the full five-fold cross-validation reported here), score it with `feic_nmt_anchor.py` (Experiment 5) or `tuab_feic.py` (Experiment 6), and evaluate a frozen or fine-tuned released checkpoint with the corresponding `tuab_*_eval.py` script. Every long-running script checkpoints its progress after each cross-validation fold and can be safely re-run to resume after an interruption, and each accepts command-line flags for every experiment variant reported here. The code is in github.com/mashfiqurrahman2020-coder/EEG-VJEPA-act-0; its docs/act0_repro/ folder holds the fold, subset and cohort lists, the SHA-256 of every checkpoint and result file, and the pinned environment (Appendix §11). The version used for this report is the repository's tag act0-report-round14: git clone https://github.com/mashfiqurrahman2020-coder/EEG-VJEPA-act-0.git, then git checkout act0-report-round14, then pip install -r docs/act0_repro/requirements-act0.txt under Python 3.9. Appendix §11.6 gives the pre-training commands and §11.9 the data each experiment uses.</w:t>
       </w:r>
     </w:p>
     <w:p>
@@ -23096,7 +23172,7 @@
         <w:rPr>
           <w:b w:val="0"/>
         </w:rPr>
-        <w:t>The stroke analysis was pre-registered in a local file, runs/act0/phaseB/PREREGISTRATION.md, written on 2026-09-25 at 23:55 (UTC+6) before any LOSO run. stroke_phaseB.py refuses to run its LOSO stage without that file and stores its SHA-256 (c66463066a4f3dc50e21cf82f3debc2c5d5b1ae4d8ac6ec1502e9617ba8d7321) in every result. It is a timestamped file in our own working copy, not an entry in a public registry, so it records our order of work without proving it to an outsider. Under the pre-registered input, FEI+GTJ scored 0.833 LOSO AUROC, against 0.889 for its random-init twin and 0.907 for BSI. The spectral-matching input of Experiment 8 was designed after that result: its recipe, gates and comparisons were written to runs/act0/phaseB_clean/POSTHOC.md on 2026-09-26 at 19:06 (SHA-256 f78446790f0e7d19e6d87f3c1ffd6265fe42f1d3e50612d5a4a84f3f588529c8) before any LOSO run on that input, so every Experiment 8 number is post-hoc in that sense. Its filter is fitted once, without labels, on all 15 subjects pooled, so each held-out subject helps shape the filter applied to it. To check that this does not drive the result, stroke_phaseB_foldlocal.py refits the filter inside every LOSO fold on the 14 training subjects only and applies it unchanged to the held-out one. Table 19 compares the two.</w:t>
+        <w:t>The stroke analysis was pre-registered in a local file, runs/act0/phaseB/PREREGISTRATION.md, written on 2026-09-25 at 23:55 (UTC+6) before any LOSO run. stroke_phaseB.py refuses to run its LOSO stage without that file and stores its SHA-256 (c66463066a4f3dc50e21cf82f3debc2c5d5b1ae4d8ac6ec1502e9617ba8d7321) in every result. It is a timestamped file in our own working copy, not an entry in a public registry, so it records our order of work without proving it to an outsider. Under the pre-registered input, FEI+GTJ scored 0.833 LOSO AUROC, against 0.889 for its random-init twin and 0.907 for BSI. The spectral-matching input of Experiment 8 was designed after that result: its recipe, gates and comparisons were written to runs/act0/phaseB_clean/POSTHOC.md on 2026-09-26 at 19:06 (SHA-256 f78446790f0e7d19e6d87f3c1ffd6265fe42f1d3e50612d5a4a84f3f588529c8) before any LOSO run on that input, so every Experiment 8 number is post-hoc in that sense. Its filter is fitted once, without labels, on all 15 subjects pooled, so each held-out subject helps shape the filter applied to it. To check that this does not drive the result, stroke_phaseB_foldlocal.py refits the filter inside every LOSO fold on the 14 training subjects only and applies it unchanged to the held-out one. Table 19 compares the two. The pre-registration also fixes both cohorts. The primary cohort takes, for every subject, the same 285 s of pure rest before any task marker (the shortest rest block, PAC05's, is 285.0 s): stroke PAC02–PAC10 (9) against the dataset authors' own six controls. PAC01 and controls 02 and C01 are left out because they have at most 52 s of rest before the task. The sensitivity cohort follows the authors' definition, the first 300 s of every file (10 stroke, 8 controls); for PAC01, 02 and C01 that window includes task data, so it is reported as a sensitivity check only.</w:t>
       </w:r>
     </w:p>
     <w:p>
@@ -25856,6 +25932,1485 @@
                 <w:sz w:val="18"/>
               </w:rPr>
               <w:t xml:space="preserve">docs/act0_repro/ pins all 111 Python packages and records Python, PyTorch, CUDA, cuDNN, GPU driver and OS (Table 18).</w:t>
+            </w:r>
+          </w:p>
+        </w:tc>
+      </w:tr>
+      <w:tr>
+        <w:trPr>
+          <w:cantSplit/>
+        </w:trPr>
+        <w:tc>
+          <w:tcPr>
+            <w:tcW w:type="dxa" w:w="2300"/>
+          </w:tcPr>
+          <w:p>
+            <w:r/>
+            <w:r>
+              <w:rPr>
+                <w:sz w:val="18"/>
+              </w:rPr>
+              <w:t xml:space="preserve">Per-file SHA-256 of the raw recordings</w:t>
+            </w:r>
+          </w:p>
+        </w:tc>
+        <w:tc>
+          <w:tcPr>
+            <w:tcW w:type="dxa" w:w="3400"/>
+          </w:tcPr>
+          <w:p>
+            <w:r/>
+            <w:r>
+              <w:rPr>
+                <w:sz w:val="18"/>
+              </w:rPr>
+              <w:t xml:space="preserve">Not computed. The recordings are not ours to redistribute, so the manifests identify them by recording ID.</w:t>
+            </w:r>
+          </w:p>
+        </w:tc>
+        <w:tc>
+          <w:tcPr>
+            <w:tcW w:type="dxa" w:w="3211"/>
+          </w:tcPr>
+          <w:p>
+            <w:r/>
+            <w:r>
+              <w:rPr>
+                <w:sz w:val="18"/>
+              </w:rPr>
+              <w:t xml:space="preserve">Fold, subset and cohort membership by recording ID (Table 21) and the script behind each input (Table 4).</w:t>
+            </w:r>
+          </w:p>
+        </w:tc>
+      </w:tr>
+      <w:tr>
+        <w:trPr>
+          <w:cantSplit/>
+        </w:trPr>
+        <w:tc>
+          <w:tcPr>
+            <w:tcW w:type="dxa" w:w="2300"/>
+          </w:tcPr>
+          <w:p>
+            <w:r/>
+            <w:r>
+              <w:rPr>
+                <w:sz w:val="18"/>
+              </w:rPr>
+              <w:t xml:space="preserve">Saved embeddings (emb_*.npz, about 446 MB)</w:t>
+            </w:r>
+          </w:p>
+        </w:tc>
+        <w:tc>
+          <w:tcPr>
+            <w:tcW w:type="dxa" w:w="3400"/>
+          </w:tcPr>
+          <w:p>
+            <w:r/>
+            <w:r>
+              <w:rPr>
+                <w:sz w:val="18"/>
+              </w:rPr>
+              <w:t xml:space="preserve">Too large for the repository; each is a forward pass of a published checkpoint or of a seeded random-init twin.</w:t>
+            </w:r>
+          </w:p>
+        </w:tc>
+        <w:tc>
+          <w:tcPr>
+            <w:tcW w:type="dxa" w:w="3211"/>
+          </w:tcPr>
+          <w:p>
+            <w:r/>
+            <w:r>
+              <w:rPr>
+                <w:sz w:val="18"/>
+              </w:rPr>
+              <w:t xml:space="preserve">The repository holds the per-recording predictions (preds_*.npz, oof_*.npz, kf5_lpo_*.npz, 7.3 MB) behind every reported score, plus the checkpoints that regenerate the embeddings.</w:t>
+            </w:r>
+          </w:p>
+        </w:tc>
+      </w:tr>
+    </w:tbl>
+    <w:p/>
+    <w:p>
+      <w:pPr>
+        <w:pStyle w:val="Heading2"/>
+        <w:keepNext/>
+        <w:spacing w:before="180" w:after="120"/>
+      </w:pPr>
+      <w:r>
+        <w:t>Pre-training Configuration and Commands</w:t>
+      </w:r>
+    </w:p>
+    <w:p>
+      <w:r>
+        <w:rPr>
+          <w:b w:val="0"/>
+        </w:rPr>
+        <w:t>Every encoder pre-trained for this report uses the recipe below. None of the runs uses a learning-rate schedule, mixed precision, gradient clipping or PyTorch's deterministic-algorithm flags, and each keeps its final (60th) epoch's weights, with no checkpoint selection. cuDNN kernels were left non-deterministic, so even the seeded runs are not bit-identical on a re-run. Random-init twins are built from the same architectures with torch seed = twin index (seeds 0–2 on TUAB and stroke, 0–4 on NMT).</w:t>
+      </w:r>
+    </w:p>
+    <w:p>
+      <w:pPr>
+        <w:pStyle w:val="Caption"/>
+        <w:keepNext/>
+        <w:keepLines/>
+        <w:jc w:val="left"/>
+      </w:pPr>
+      <w:r>
+        <w:rPr>
+          <w:i w:val="0"/>
+          <w:sz w:val="18"/>
+        </w:rPr>
+        <w:t>Table 23: Pre-training data, seeds, recipe and command for every encoder trained in this report. All share AdamW (learning rate 2×10⁻⁴, weight decay 10⁻⁴), batch 128, 60 epochs, 4 random windows per recording per epoch, d = 256, h = 128 and target EMA 0.996.</w:t>
+      </w:r>
+    </w:p>
+    <w:tbl>
+      <w:tblPr>
+        <w:tblStyle w:val="TableGrid"/>
+        <w:tblW w:type="dxa" w:w="8911"/>
+        <w:tblLayout w:type="fixed"/>
+        <w:tblLook w:firstColumn="1" w:firstRow="1" w:lastColumn="0" w:lastRow="0" w:noHBand="0" w:noVBand="1" w:val="04A0"/>
+      </w:tblPr>
+      <w:tblGrid>
+        <w:gridCol w:w="1900"/>
+        <w:gridCol w:w="2600"/>
+        <w:gridCol w:w="1900"/>
+        <w:gridCol w:w="2511"/>
+      </w:tblGrid>
+      <w:tr>
+        <w:trPr>
+          <w:cantSplit/>
+          <w:tblHeader/>
+        </w:trPr>
+        <w:tc>
+          <w:tcPr>
+            <w:tcW w:type="dxa" w:w="1900"/>
+          </w:tcPr>
+          <w:p>
+            <w:pPr>
+              <w:keepNext/>
+            </w:pPr>
+            <w:r/>
+            <w:r>
+              <w:rPr>
+                <w:b/>
+                <w:sz w:val="18"/>
+              </w:rPr>
+              <w:t xml:space="preserve">Encoders</w:t>
+            </w:r>
+          </w:p>
+        </w:tc>
+        <w:tc>
+          <w:tcPr>
+            <w:tcW w:type="dxa" w:w="2600"/>
+          </w:tcPr>
+          <w:p>
+            <w:pPr>
+              <w:keepNext/>
+            </w:pPr>
+            <w:r/>
+            <w:r>
+              <w:rPr>
+                <w:b/>
+                <w:sz w:val="18"/>
+              </w:rPr>
+              <w:t xml:space="preserve">Pre-training data and seeds</w:t>
+            </w:r>
+          </w:p>
+        </w:tc>
+        <w:tc>
+          <w:tcPr>
+            <w:tcW w:type="dxa" w:w="1900"/>
+          </w:tcPr>
+          <w:p>
+            <w:pPr>
+              <w:keepNext/>
+            </w:pPr>
+            <w:r/>
+            <w:r>
+              <w:rPr>
+                <w:b/>
+                <w:sz w:val="18"/>
+              </w:rPr>
+              <w:t xml:space="preserve">Window and branch settings</w:t>
+            </w:r>
+          </w:p>
+        </w:tc>
+        <w:tc>
+          <w:tcPr>
+            <w:tcW w:type="dxa" w:w="2511"/>
+          </w:tcPr>
+          <w:p>
+            <w:pPr>
+              <w:keepNext/>
+            </w:pPr>
+            <w:r/>
+            <w:r>
+              <w:rPr>
+                <w:b/>
+                <w:sz w:val="18"/>
+              </w:rPr>
+              <w:t xml:space="preserve">Command and checkpoints</w:t>
+            </w:r>
+          </w:p>
+        </w:tc>
+      </w:tr>
+      <w:tr>
+        <w:trPr>
+          <w:cantSplit/>
+        </w:trPr>
+        <w:tc>
+          <w:tcPr>
+            <w:tcW w:type="dxa" w:w="1900"/>
+          </w:tcPr>
+          <w:p>
+            <w:r/>
+            <w:r>
+              <w:rPr>
+                <w:sz w:val="18"/>
+              </w:rPr>
+              <w:t xml:space="preserve">FEI, NMT only (Experiments 5, 6, 8)</w:t>
+            </w:r>
+          </w:p>
+        </w:tc>
+        <w:tc>
+          <w:tcPr>
+            <w:tcW w:type="dxa" w:w="2600"/>
+          </w:tcPr>
+          <w:p>
+            <w:r/>
+            <w:r>
+              <w:rPr>
+                <w:sz w:val="18"/>
+              </w:rPr>
+              <w:t xml:space="preserve">The NMT training folds of the seed-0 5-fold split (Table 21); no seed set (the original runs are unseeded)</w:t>
+            </w:r>
+          </w:p>
+        </w:tc>
+        <w:tc>
+          <w:tcPr>
+            <w:tcW w:type="dxa" w:w="1900"/>
+          </w:tcPr>
+          <w:p>
+            <w:r/>
+            <w:r>
+              <w:rPr>
+                <w:sz w:val="18"/>
+              </w:rPr>
+              <w:t xml:space="preserve">L = 1,000 samples (5 s at 200 Hz)</w:t>
+            </w:r>
+          </w:p>
+        </w:tc>
+        <w:tc>
+          <w:tcPr>
+            <w:tcW w:type="dxa" w:w="2511"/>
+          </w:tcPr>
+          <w:p>
+            <w:r/>
+            <w:r>
+              <w:rPr>
+                <w:sz w:val="18"/>
+              </w:rPr>
+              <w:t xml:space="preserve">python code/fei_pretrain.py --cv → fei_enc_cv_s0_f{k}.pt</w:t>
+            </w:r>
+          </w:p>
+        </w:tc>
+      </w:tr>
+      <w:tr>
+        <w:trPr>
+          <w:cantSplit/>
+        </w:trPr>
+        <w:tc>
+          <w:tcPr>
+            <w:tcW w:type="dxa" w:w="1900"/>
+          </w:tcPr>
+          <w:p>
+            <w:r/>
+            <w:r>
+              <w:rPr>
+                <w:sz w:val="18"/>
+              </w:rPr>
+              <w:t xml:space="preserve">GTJ, NMT only (Experiments 5, 8)</w:t>
+            </w:r>
+          </w:p>
+        </w:tc>
+        <w:tc>
+          <w:tcPr>
+            <w:tcW w:type="dxa" w:w="2600"/>
+          </w:tcPr>
+          <w:p>
+            <w:r/>
+            <w:r>
+              <w:rPr>
+                <w:sz w:val="18"/>
+              </w:rPr>
+              <w:t xml:space="preserve">As for FEI; no seed set</w:t>
+            </w:r>
+          </w:p>
+        </w:tc>
+        <w:tc>
+          <w:tcPr>
+            <w:tcW w:type="dxa" w:w="1900"/>
+          </w:tcPr>
+          <w:p>
+            <w:r/>
+            <w:r>
+              <w:rPr>
+                <w:sz w:val="18"/>
+              </w:rPr>
+              <w:t xml:space="preserve">L = 4,000 (20 s), STFT n_fft 200, hop 100, context 60%, GRU</w:t>
+            </w:r>
+          </w:p>
+        </w:tc>
+        <w:tc>
+          <w:tcPr>
+            <w:tcW w:type="dxa" w:w="2511"/>
+          </w:tcPr>
+          <w:p>
+            <w:r/>
+            <w:r>
+              <w:rPr>
+                <w:sz w:val="18"/>
+              </w:rPr>
+              <w:t xml:space="preserve">python code/fei_branchC.py --cv --L 4000 --hop 100 --tag h20 → branchC_h20_enc_cv_s0_f{k}.pt</w:t>
+            </w:r>
+          </w:p>
+        </w:tc>
+      </w:tr>
+      <w:tr>
+        <w:trPr>
+          <w:cantSplit/>
+        </w:trPr>
+        <w:tc>
+          <w:tcPr>
+            <w:tcW w:type="dxa" w:w="1900"/>
+          </w:tcPr>
+          <w:p>
+            <w:r/>
+            <w:r>
+              <w:rPr>
+                <w:sz w:val="18"/>
+              </w:rPr>
+              <w:t xml:space="preserve">FEI and GTJ replicates 1 and 2 (Experiment 5, Table 20)</w:t>
+            </w:r>
+          </w:p>
+        </w:tc>
+        <w:tc>
+          <w:tcPr>
+            <w:tcW w:type="dxa" w:w="2600"/>
+          </w:tcPr>
+          <w:p>
+            <w:r/>
+            <w:r>
+              <w:rPr>
+                <w:sz w:val="18"/>
+              </w:rPr>
+              <w:t xml:space="preserve">As above; torch, NumPy and Python random seeded with 100 × replicate + fold</w:t>
+            </w:r>
+          </w:p>
+        </w:tc>
+        <w:tc>
+          <w:tcPr>
+            <w:tcW w:type="dxa" w:w="1900"/>
+          </w:tcPr>
+          <w:p>
+            <w:r/>
+            <w:r>
+              <w:rPr>
+                <w:sz w:val="18"/>
+              </w:rPr>
+              <w:t xml:space="preserve">As above</w:t>
+            </w:r>
+          </w:p>
+        </w:tc>
+        <w:tc>
+          <w:tcPr>
+            <w:tcW w:type="dxa" w:w="2511"/>
+          </w:tcPr>
+          <w:p>
+            <w:r/>
+            <w:r>
+              <w:rPr>
+                <w:sz w:val="18"/>
+              </w:rPr>
+              <w:t xml:space="preserve">python code/act0_nmt_pretrain_replicate.py</w:t>
+            </w:r>
+          </w:p>
+        </w:tc>
+      </w:tr>
+      <w:tr>
+        <w:trPr>
+          <w:cantSplit/>
+        </w:trPr>
+        <w:tc>
+          <w:tcPr>
+            <w:tcW w:type="dxa" w:w="1900"/>
+          </w:tcPr>
+          <w:p>
+            <w:r/>
+            <w:r>
+              <w:rPr>
+                <w:sz w:val="18"/>
+              </w:rPr>
+              <w:t xml:space="preserve">FEI and GTJ, joint NMT+TUAB (Experiment 6)</w:t>
+            </w:r>
+          </w:p>
+        </w:tc>
+        <w:tc>
+          <w:tcPr>
+            <w:tcW w:type="dxa" w:w="2600"/>
+          </w:tcPr>
+          <w:p>
+            <w:r/>
+            <w:r>
+              <w:rPr>
+                <w:sz w:val="18"/>
+              </w:rPr>
+              <w:t xml:space="preserve">NMT training fold k plus TUAB's 2,717 unlabelled training recordings; torch seed = k</w:t>
+            </w:r>
+          </w:p>
+        </w:tc>
+        <w:tc>
+          <w:tcPr>
+            <w:tcW w:type="dxa" w:w="1900"/>
+          </w:tcPr>
+          <w:p>
+            <w:r/>
+            <w:r>
+              <w:rPr>
+                <w:sz w:val="18"/>
+              </w:rPr>
+              <w:t xml:space="preserve">As above</w:t>
+            </w:r>
+          </w:p>
+        </w:tc>
+        <w:tc>
+          <w:tcPr>
+            <w:tcW w:type="dxa" w:w="2511"/>
+          </w:tcPr>
+          <w:p>
+            <w:r/>
+            <w:r>
+              <w:rPr>
+                <w:sz w:val="18"/>
+              </w:rPr>
+              <w:t xml:space="preserve">python code/feic_joint.py → fei_joint_enc_cv_s0_f{k}.pt, branchC_h20_joint_enc_cv_s0_f{k}.pt</w:t>
+            </w:r>
+          </w:p>
+        </w:tc>
+      </w:tr>
+    </w:tbl>
+    <w:p/>
+    <w:p>
+      <w:pPr>
+        <w:pStyle w:val="Heading2"/>
+        <w:keepNext/>
+        <w:spacing w:before="180" w:after="120"/>
+      </w:pPr>
+      <w:r>
+        <w:t>Statistical Procedures</w:t>
+      </w:r>
+    </w:p>
+    <w:p>
+      <w:pPr>
+        <w:pStyle w:val="Caption"/>
+        <w:keepNext/>
+        <w:keepLines/>
+        <w:jc w:val="left"/>
+      </w:pPr>
+      <w:r>
+        <w:rPr>
+          <w:i w:val="0"/>
+          <w:sz w:val="18"/>
+        </w:rPr>
+        <w:t>Table 24: The statistical test behind each kind of comparison in this report.</w:t>
+      </w:r>
+    </w:p>
+    <w:tbl>
+      <w:tblPr>
+        <w:tblStyle w:val="TableGrid"/>
+        <w:tblW w:type="dxa" w:w="8911"/>
+        <w:tblLayout w:type="fixed"/>
+        <w:tblLook w:firstColumn="1" w:firstRow="1" w:lastColumn="0" w:lastRow="0" w:noHBand="0" w:noVBand="1" w:val="04A0"/>
+      </w:tblPr>
+      <w:tblGrid>
+        <w:gridCol w:w="2200"/>
+        <w:gridCol w:w="3700"/>
+        <w:gridCol w:w="3011"/>
+      </w:tblGrid>
+      <w:tr>
+        <w:trPr>
+          <w:cantSplit/>
+          <w:tblHeader/>
+        </w:trPr>
+        <w:tc>
+          <w:tcPr>
+            <w:tcW w:type="dxa" w:w="2200"/>
+          </w:tcPr>
+          <w:p>
+            <w:pPr>
+              <w:keepNext/>
+            </w:pPr>
+            <w:r/>
+            <w:r>
+              <w:rPr>
+                <w:b/>
+                <w:sz w:val="18"/>
+              </w:rPr>
+              <w:t xml:space="preserve">Comparison</w:t>
+            </w:r>
+          </w:p>
+        </w:tc>
+        <w:tc>
+          <w:tcPr>
+            <w:tcW w:type="dxa" w:w="3700"/>
+          </w:tcPr>
+          <w:p>
+            <w:pPr>
+              <w:keepNext/>
+            </w:pPr>
+            <w:r/>
+            <w:r>
+              <w:rPr>
+                <w:b/>
+                <w:sz w:val="18"/>
+              </w:rPr>
+              <w:t xml:space="preserve">Procedure</w:t>
+            </w:r>
+          </w:p>
+        </w:tc>
+        <w:tc>
+          <w:tcPr>
+            <w:tcW w:type="dxa" w:w="3011"/>
+          </w:tcPr>
+          <w:p>
+            <w:pPr>
+              <w:keepNext/>
+            </w:pPr>
+            <w:r/>
+            <w:r>
+              <w:rPr>
+                <w:b/>
+                <w:sz w:val="18"/>
+              </w:rPr>
+              <w:t xml:space="preserve">Where used</w:t>
+            </w:r>
+          </w:p>
+        </w:tc>
+      </w:tr>
+      <w:tr>
+        <w:trPr>
+          <w:cantSplit/>
+        </w:trPr>
+        <w:tc>
+          <w:tcPr>
+            <w:tcW w:type="dxa" w:w="2200"/>
+          </w:tcPr>
+          <w:p>
+            <w:r/>
+            <w:r>
+              <w:rPr>
+                <w:sz w:val="18"/>
+              </w:rPr>
+              <w:t xml:space="preserve">Confidence interval of one model's AUROC or BAcc</w:t>
+            </w:r>
+          </w:p>
+        </w:tc>
+        <w:tc>
+          <w:tcPr>
+            <w:tcW w:type="dxa" w:w="3700"/>
+          </w:tcPr>
+          <w:p>
+            <w:r/>
+            <w:r>
+              <w:rPr>
+                <w:sz w:val="18"/>
+              </w:rPr>
+              <w:t xml:space="preserve">Percentile bootstrap over test recordings (subjects on stroke), 2,000 resamples, seed 0, 2.5th–97.5th percentiles (code/act0_metrics.py)</w:t>
+            </w:r>
+          </w:p>
+        </w:tc>
+        <w:tc>
+          <w:tcPr>
+            <w:tcW w:type="dxa" w:w="3011"/>
+          </w:tcPr>
+          <w:p>
+            <w:r/>
+            <w:r>
+              <w:rPr>
+                <w:sz w:val="18"/>
+              </w:rPr>
+              <w:t xml:space="preserve">Experiments 4, 6, 8</w:t>
+            </w:r>
+          </w:p>
+        </w:tc>
+      </w:tr>
+      <w:tr>
+        <w:trPr>
+          <w:cantSplit/>
+        </w:trPr>
+        <w:tc>
+          <w:tcPr>
+            <w:tcW w:type="dxa" w:w="2200"/>
+          </w:tcPr>
+          <w:p>
+            <w:r/>
+            <w:r>
+              <w:rPr>
+                <w:sz w:val="18"/>
+              </w:rPr>
+              <w:t xml:space="preserve">Two models on the same test set (Δ AUROC)</w:t>
+            </w:r>
+          </w:p>
+        </w:tc>
+        <w:tc>
+          <w:tcPr>
+            <w:tcW w:type="dxa" w:w="3700"/>
+          </w:tcPr>
+          <w:p>
+            <w:r/>
+            <w:r>
+              <w:rPr>
+                <w:sz w:val="18"/>
+              </w:rPr>
+              <w:t xml:space="preserve">Paired bootstrap: both models scored on the same 2,000 resamples; CI from the percentiles of Δ, and p = share of resamples with Δ ≤ 0 (one-sided)</w:t>
+            </w:r>
+          </w:p>
+        </w:tc>
+        <w:tc>
+          <w:tcPr>
+            <w:tcW w:type="dxa" w:w="3011"/>
+          </w:tcPr>
+          <w:p>
+            <w:r/>
+            <w:r>
+              <w:rPr>
+                <w:sz w:val="18"/>
+              </w:rPr>
+              <w:t xml:space="preserve">Experiments 6 and 8 (e.g. FEI+GTJ − ViT-M on TUAB, p = 0.147)</w:t>
+            </w:r>
+          </w:p>
+        </w:tc>
+      </w:tr>
+      <w:tr>
+        <w:trPr>
+          <w:cantSplit/>
+        </w:trPr>
+        <w:tc>
+          <w:tcPr>
+            <w:tcW w:type="dxa" w:w="2200"/>
+          </w:tcPr>
+          <w:p>
+            <w:r/>
+            <w:r>
+              <w:rPr>
+                <w:sz w:val="18"/>
+              </w:rPr>
+              <w:t xml:space="preserve">Released vs random-weight ViT-M across the five training subsets</w:t>
+            </w:r>
+          </w:p>
+        </w:tc>
+        <w:tc>
+          <w:tcPr>
+            <w:tcW w:type="dxa" w:w="3700"/>
+          </w:tcPr>
+          <w:p>
+            <w:r/>
+            <w:r>
+              <w:rPr>
+                <w:sz w:val="18"/>
+              </w:rPr>
+              <w:t xml:space="preserve">Two-sided Mann–Whitney U on the per-subset AUROCs</w:t>
+            </w:r>
+          </w:p>
+        </w:tc>
+        <w:tc>
+          <w:tcPr>
+            <w:tcW w:type="dxa" w:w="3011"/>
+          </w:tcPr>
+          <w:p>
+            <w:r/>
+            <w:r>
+              <w:rPr>
+                <w:sz w:val="18"/>
+              </w:rPr>
+              <w:t xml:space="preserve">Experiments 1 and 4</w:t>
+            </w:r>
+          </w:p>
+        </w:tc>
+      </w:tr>
+      <w:tr>
+        <w:trPr>
+          <w:cantSplit/>
+        </w:trPr>
+        <w:tc>
+          <w:tcPr>
+            <w:tcW w:type="dxa" w:w="2200"/>
+          </w:tcPr>
+          <w:p>
+            <w:r/>
+            <w:r>
+              <w:rPr>
+                <w:sz w:val="18"/>
+              </w:rPr>
+              <w:t xml:space="preserve">Two arms on the same NMT folds</w:t>
+            </w:r>
+          </w:p>
+        </w:tc>
+        <w:tc>
+          <w:tcPr>
+            <w:tcW w:type="dxa" w:w="3700"/>
+          </w:tcPr>
+          <w:p>
+            <w:r/>
+            <w:r>
+              <w:rPr>
+                <w:sz w:val="18"/>
+              </w:rPr>
+              <w:t xml:space="preserve">Paired t-test over the 5 folds; Appendix §11.3 repeats all eleven with the Nadeau–Bengio corrected t-test and Holm's adjustment</w:t>
+            </w:r>
+          </w:p>
+        </w:tc>
+        <w:tc>
+          <w:tcPr>
+            <w:tcW w:type="dxa" w:w="3011"/>
+          </w:tcPr>
+          <w:p>
+            <w:r/>
+            <w:r>
+              <w:rPr>
+                <w:sz w:val="18"/>
+              </w:rPr>
+              <w:t xml:space="preserve">Experiment 5 (Table 20)</w:t>
+            </w:r>
+          </w:p>
+        </w:tc>
+      </w:tr>
+      <w:tr>
+        <w:trPr>
+          <w:cantSplit/>
+        </w:trPr>
+        <w:tc>
+          <w:tcPr>
+            <w:tcW w:type="dxa" w:w="2200"/>
+          </w:tcPr>
+          <w:p>
+            <w:r/>
+            <w:r>
+              <w:rPr>
+                <w:sz w:val="18"/>
+              </w:rPr>
+              <w:t xml:space="preserve">Stroke: one arm against chance</w:t>
+            </w:r>
+          </w:p>
+        </w:tc>
+        <w:tc>
+          <w:tcPr>
+            <w:tcW w:type="dxa" w:w="3700"/>
+          </w:tcPr>
+          <w:p>
+            <w:r/>
+            <w:r>
+              <w:rPr>
+                <w:sz w:val="18"/>
+              </w:rPr>
+              <w:t xml:space="preserve">Label permutation, the full LOSO re-run for each of 1,000 shuffles; p = (1 + #null ≥ observed) / 1,001</w:t>
+            </w:r>
+          </w:p>
+        </w:tc>
+        <w:tc>
+          <w:tcPr>
+            <w:tcW w:type="dxa" w:w="3011"/>
+          </w:tcPr>
+          <w:p>
+            <w:r/>
+            <w:r>
+              <w:rPr>
+                <w:sz w:val="18"/>
+              </w:rPr>
+              <w:t xml:space="preserve">Experiments 7 and 8</w:t>
+            </w:r>
+          </w:p>
+        </w:tc>
+      </w:tr>
+      <w:tr>
+        <w:trPr>
+          <w:cantSplit/>
+        </w:trPr>
+        <w:tc>
+          <w:tcPr>
+            <w:tcW w:type="dxa" w:w="2200"/>
+          </w:tcPr>
+          <w:p>
+            <w:r/>
+            <w:r>
+              <w:rPr>
+                <w:sz w:val="18"/>
+              </w:rPr>
+              <w:t xml:space="preserve">Stroke: robustness to the split</w:t>
+            </w:r>
+          </w:p>
+        </w:tc>
+        <w:tc>
+          <w:tcPr>
+            <w:tcW w:type="dxa" w:w="3700"/>
+          </w:tcPr>
+          <w:p>
+            <w:r/>
+            <w:r>
+              <w:rPr>
+                <w:sz w:val="18"/>
+              </w:rPr>
+              <w:t xml:space="preserve">100 repeats of stratified 5-fold with the same splits for every arm (win rate = share of repeats arm A beats arm B; permutation p from 200 shuffles × 10 repeats); leave-pair-out with a stratified 2,000-resample bootstrap over subjects</w:t>
+            </w:r>
+          </w:p>
+        </w:tc>
+        <w:tc>
+          <w:tcPr>
+            <w:tcW w:type="dxa" w:w="3011"/>
+          </w:tcPr>
+          <w:p>
+            <w:r/>
+            <w:r>
+              <w:rPr>
+                <w:sz w:val="18"/>
+              </w:rPr>
+              <w:t xml:space="preserve">Experiment 8 (Table 15, Figure 19)</w:t>
+            </w:r>
+          </w:p>
+        </w:tc>
+      </w:tr>
+      <w:tr>
+        <w:trPr>
+          <w:cantSplit/>
+        </w:trPr>
+        <w:tc>
+          <w:tcPr>
+            <w:tcW w:type="dxa" w:w="2200"/>
+          </w:tcPr>
+          <w:p>
+            <w:r/>
+            <w:r>
+              <w:rPr>
+                <w:sz w:val="18"/>
+              </w:rPr>
+              <w:t xml:space="preserve">Stroke: classical features, stroke vs control</w:t>
+            </w:r>
+          </w:p>
+        </w:tc>
+        <w:tc>
+          <w:tcPr>
+            <w:tcW w:type="dxa" w:w="3700"/>
+          </w:tcPr>
+          <w:p>
+            <w:r/>
+            <w:r>
+              <w:rPr>
+                <w:sz w:val="18"/>
+              </w:rPr>
+              <w:t xml:space="preserve">Two-sided Mann–Whitney U; the pre-declared gate is broadband BSI at p &lt; 0.05</w:t>
+            </w:r>
+          </w:p>
+        </w:tc>
+        <w:tc>
+          <w:tcPr>
+            <w:tcW w:type="dxa" w:w="3011"/>
+          </w:tcPr>
+          <w:p>
+            <w:r/>
+            <w:r>
+              <w:rPr>
+                <w:sz w:val="18"/>
+              </w:rPr>
+              <w:t xml:space="preserve">Experiment 7 (Table 13)</w:t>
+            </w:r>
+          </w:p>
+        </w:tc>
+      </w:tr>
+    </w:tbl>
+    <w:p/>
+    <w:p>
+      <w:r>
+        <w:rPr>
+          <w:b w:val="0"/>
+        </w:rPr>
+        <w:t>Only Experiment 5's eleven NMT comparisons are adjusted for multiplicity (Holm, Table 20). The stroke pre-registration fixed the gate and three paired comparisons, all involving the released ViT-M (ViT-M+BSI vs BSI, ViT-M vs its random twin, FEI+GTJ vs ViT-M) on the pre-registered input; Experiment 8's comparisons on the spectrum-matched input were fixed in POSTHOC.md before any LOSO run on that input, but after the pre-registration. Every other p-value in this report is exploratory and unadjusted: evidence about that one comparison, not a claim about the whole family.</w:t>
+      </w:r>
+    </w:p>
+    <w:p>
+      <w:pPr>
+        <w:pStyle w:val="Heading2"/>
+        <w:keepNext/>
+        <w:spacing w:before="180" w:after="120"/>
+      </w:pPr>
+      <w:r>
+        <w:t>Stroke Spectral-Matching Filter</w:t>
+      </w:r>
+    </w:p>
+    <w:p>
+      <w:r>
+        <w:rPr>
+          <w:b w:val="0"/>
+        </w:rPr>
+        <w:t>Experiment 8's input is built by code/stroke_phaseB_clean.py, following runs/act0/phaseB_clean/POSTHOC.md, which was written before any LOSO run on this input. Each recording gets the dataset authors' bad-channel interpolation, a common average reference, the 19 NMT channels (T7/T8/P7/P8 renamed T3/T4/T5/T6), resampling to 200 Hz with no band-pass, and a per-channel z-score. The target is NMT's mean log10 Welch spectrum over 100 fixed-random NMT training recordings (first 300 s; 800-sample Welch segments, i.e. 0.25 Hz bins; 10⁻²⁰ added before the log).</w:t>
+      </w:r>
+    </w:p>
+    <w:p>
+      <w:r>
+        <w:rPr>
+          <w:b w:val="0"/>
+        </w:rPr>
+        <w:t>The filter is a log10 amplitude gain per channel on that 0.25 Hz grid. It starts at zero and is updated four times: shape every subject, z-score again, average the cohort's log-spectra, and add half the remaining gap to NMT's. Shaping multiplies the recording's FFT by the gain, linearly interpolated onto the FFT's frequency grid with no smoothing; the gain is real, so the filter changes no phase (zero-phase). Each recording is reflect-padded by 800 samples at both ends before the FFT and trimmed after it. The result is z-scored again and cut into non-overlapping 2.5 s frames.</w:t>
+      </w:r>
+    </w:p>
+    <w:p>
+      <w:r>
+        <w:rPr>
+          <w:b w:val="0"/>
+        </w:rPr>
+        <w:t>One filter per channel is fitted on all 15 subjects pooled, without labels, and the same filter is applied to every subject (Experiment 8); Table 19 refits it inside each LOSO fold on the 14 training subjects. Four gates were fixed in POSTHOC.md and reported whether or not they passed: the matched cohort's mean log-spectrum within 0.25 decades of NMT's at every channel and bin from 0.5 to 99 Hz; GTJ's input BatchNorm |z| at most 1.5 in every 1 Hz bin, against each NMT checkpoint's running statistics; GTJ's across-subject embedding spread at least half its spread on 15 NMT evaluation recordings; and at most 5% of its embedding dimensions constant (std &lt; 10⁻⁵). All four passed (§5.3.3).</w:t>
+      </w:r>
+    </w:p>
+    <w:p>
+      <w:pPr>
+        <w:pStyle w:val="Heading2"/>
+        <w:keepNext/>
+        <w:spacing w:before="180" w:after="120"/>
+      </w:pPr>
+      <w:r>
+        <w:t>Data Used by Each Experiment</w:t>
+      </w:r>
+    </w:p>
+    <w:p>
+      <w:pPr>
+        <w:pStyle w:val="Caption"/>
+        <w:keepNext/>
+        <w:keepLines/>
+        <w:jc w:val="left"/>
+      </w:pPr>
+      <w:r>
+        <w:rPr>
+          <w:i w:val="0"/>
+          <w:sz w:val="18"/>
+        </w:rPr>
+        <w:t>Table 25: Which recordings each experiment's encoder was pre-trained on, which trained its classifier, and which scored it. No evaluation recording is used for pre-training or probe training.</w:t>
+      </w:r>
+    </w:p>
+    <w:tbl>
+      <w:tblPr>
+        <w:tblStyle w:val="TableGrid"/>
+        <w:tblW w:type="dxa" w:w="8911"/>
+        <w:tblLayout w:type="fixed"/>
+        <w:tblLook w:firstColumn="1" w:firstRow="1" w:lastColumn="0" w:lastRow="0" w:noHBand="0" w:noVBand="1" w:val="04A0"/>
+      </w:tblPr>
+      <w:tblGrid>
+        <w:gridCol w:w="1500"/>
+        <w:gridCol w:w="2700"/>
+        <w:gridCol w:w="2500"/>
+        <w:gridCol w:w="2211"/>
+      </w:tblGrid>
+      <w:tr>
+        <w:trPr>
+          <w:cantSplit/>
+          <w:tblHeader/>
+        </w:trPr>
+        <w:tc>
+          <w:tcPr>
+            <w:tcW w:type="dxa" w:w="1500"/>
+          </w:tcPr>
+          <w:p>
+            <w:pPr>
+              <w:keepNext/>
+            </w:pPr>
+            <w:r/>
+            <w:r>
+              <w:rPr>
+                <w:b/>
+                <w:sz w:val="18"/>
+              </w:rPr>
+              <w:t xml:space="preserve">Experiment</w:t>
+            </w:r>
+          </w:p>
+        </w:tc>
+        <w:tc>
+          <w:tcPr>
+            <w:tcW w:type="dxa" w:w="2700"/>
+          </w:tcPr>
+          <w:p>
+            <w:pPr>
+              <w:keepNext/>
+            </w:pPr>
+            <w:r/>
+            <w:r>
+              <w:rPr>
+                <w:b/>
+                <w:sz w:val="18"/>
+              </w:rPr>
+              <w:t xml:space="preserve">Encoder pre-training</w:t>
+            </w:r>
+          </w:p>
+        </w:tc>
+        <w:tc>
+          <w:tcPr>
+            <w:tcW w:type="dxa" w:w="2500"/>
+          </w:tcPr>
+          <w:p>
+            <w:pPr>
+              <w:keepNext/>
+            </w:pPr>
+            <w:r/>
+            <w:r>
+              <w:rPr>
+                <w:b/>
+                <w:sz w:val="18"/>
+              </w:rPr>
+              <w:t xml:space="preserve">Classifier training</w:t>
+            </w:r>
+          </w:p>
+        </w:tc>
+        <w:tc>
+          <w:tcPr>
+            <w:tcW w:type="dxa" w:w="2211"/>
+          </w:tcPr>
+          <w:p>
+            <w:pPr>
+              <w:keepNext/>
+            </w:pPr>
+            <w:r/>
+            <w:r>
+              <w:rPr>
+                <w:b/>
+                <w:sz w:val="18"/>
+              </w:rPr>
+              <w:t xml:space="preserve">Evaluation</w:t>
+            </w:r>
+          </w:p>
+        </w:tc>
+      </w:tr>
+      <w:tr>
+        <w:trPr>
+          <w:cantSplit/>
+        </w:trPr>
+        <w:tc>
+          <w:tcPr>
+            <w:tcW w:type="dxa" w:w="1500"/>
+          </w:tcPr>
+          <w:p>
+            <w:r/>
+            <w:r>
+              <w:rPr>
+                <w:sz w:val="18"/>
+              </w:rPr>
+              <w:t xml:space="preserve">1, 2, 4</w:t>
+            </w:r>
+          </w:p>
+        </w:tc>
+        <w:tc>
+          <w:tcPr>
+            <w:tcW w:type="dxa" w:w="2700"/>
+          </w:tcPr>
+          <w:p>
+            <w:r/>
+            <w:r>
+              <w:rPr>
+                <w:sz w:val="18"/>
+              </w:rPr>
+              <w:t xml:space="preserve">Released ViT-M: the authors' own pre-training; random-weight twins: none</w:t>
+            </w:r>
+          </w:p>
+        </w:tc>
+        <w:tc>
+          <w:tcPr>
+            <w:tcW w:type="dxa" w:w="2500"/>
+          </w:tcPr>
+          <w:p>
+            <w:r/>
+            <w:r>
+              <w:rPr>
+                <w:sz w:val="18"/>
+              </w:rPr>
+              <w:t xml:space="preserve">TUAB, the five 546-recording training subsets and (Experiment 4) the full 2,717-recording training set; Experiment 2 fine-tunes the whole network on the same subsets</w:t>
+            </w:r>
+          </w:p>
+        </w:tc>
+        <w:tc>
+          <w:tcPr>
+            <w:tcW w:type="dxa" w:w="2211"/>
+          </w:tcPr>
+          <w:p>
+            <w:r/>
+            <w:r>
+              <w:rPr>
+                <w:sz w:val="18"/>
+              </w:rPr>
+              <w:t xml:space="preserve">TUAB official eval set (276)</w:t>
+            </w:r>
+          </w:p>
+        </w:tc>
+      </w:tr>
+      <w:tr>
+        <w:trPr>
+          <w:cantSplit/>
+        </w:trPr>
+        <w:tc>
+          <w:tcPr>
+            <w:tcW w:type="dxa" w:w="1500"/>
+          </w:tcPr>
+          <w:p>
+            <w:r/>
+            <w:r>
+              <w:rPr>
+                <w:sz w:val="18"/>
+              </w:rPr>
+              <w:t xml:space="preserve">3</w:t>
+            </w:r>
+          </w:p>
+        </w:tc>
+        <w:tc>
+          <w:tcPr>
+            <w:tcW w:type="dxa" w:w="2700"/>
+          </w:tcPr>
+          <w:p>
+            <w:r/>
+            <w:r>
+              <w:rPr>
+                <w:sz w:val="18"/>
+              </w:rPr>
+              <w:t xml:space="preserve">Released ViT-M and its random-weight twins</w:t>
+            </w:r>
+          </w:p>
+        </w:tc>
+        <w:tc>
+          <w:tcPr>
+            <w:tcW w:type="dxa" w:w="2500"/>
+          </w:tcPr>
+          <w:p>
+            <w:r/>
+            <w:r>
+              <w:rPr>
+                <w:sz w:val="18"/>
+              </w:rPr>
+              <w:t xml:space="preserve">None (no classifier)</w:t>
+            </w:r>
+          </w:p>
+        </w:tc>
+        <w:tc>
+          <w:tcPr>
+            <w:tcW w:type="dxa" w:w="2211"/>
+          </w:tcPr>
+          <w:p>
+            <w:r/>
+            <w:r>
+              <w:rPr>
+                <w:sz w:val="18"/>
+              </w:rPr>
+              <w:t xml:space="preserve">TUAB recordings and the 15-subject stroke cohort (Table 9)</w:t>
+            </w:r>
+          </w:p>
+        </w:tc>
+      </w:tr>
+      <w:tr>
+        <w:trPr>
+          <w:cantSplit/>
+        </w:trPr>
+        <w:tc>
+          <w:tcPr>
+            <w:tcW w:type="dxa" w:w="1500"/>
+          </w:tcPr>
+          <w:p>
+            <w:r/>
+            <w:r>
+              <w:rPr>
+                <w:sz w:val="18"/>
+              </w:rPr>
+              <w:t xml:space="preserve">5</w:t>
+            </w:r>
+          </w:p>
+        </w:tc>
+        <w:tc>
+          <w:tcPr>
+            <w:tcW w:type="dxa" w:w="2700"/>
+          </w:tcPr>
+          <w:p>
+            <w:r/>
+            <w:r>
+              <w:rPr>
+                <w:sz w:val="18"/>
+              </w:rPr>
+              <w:t xml:space="preserve">FEI, GTJ: the NMT training folds of the seed-0 5-fold split (≈1,934 recordings), labels unused</w:t>
+            </w:r>
+          </w:p>
+        </w:tc>
+        <w:tc>
+          <w:tcPr>
+            <w:tcW w:type="dxa" w:w="2500"/>
+          </w:tcPr>
+          <w:p>
+            <w:r/>
+            <w:r>
+              <w:rPr>
+                <w:sz w:val="18"/>
+              </w:rPr>
+              <w:t xml:space="preserve">The same NMT training fold, with labels</w:t>
+            </w:r>
+          </w:p>
+        </w:tc>
+        <w:tc>
+          <w:tcPr>
+            <w:tcW w:type="dxa" w:w="2211"/>
+          </w:tcPr>
+          <w:p>
+            <w:r/>
+            <w:r>
+              <w:rPr>
+                <w:sz w:val="18"/>
+              </w:rPr>
+              <w:t xml:space="preserve">The held-out NMT fold (≈483 recordings)</w:t>
+            </w:r>
+          </w:p>
+        </w:tc>
+      </w:tr>
+      <w:tr>
+        <w:trPr>
+          <w:cantSplit/>
+        </w:trPr>
+        <w:tc>
+          <w:tcPr>
+            <w:tcW w:type="dxa" w:w="1500"/>
+          </w:tcPr>
+          <w:p>
+            <w:r/>
+            <w:r>
+              <w:rPr>
+                <w:sz w:val="18"/>
+              </w:rPr>
+              <w:t xml:space="preserve">6, FEI row</w:t>
+            </w:r>
+          </w:p>
+        </w:tc>
+        <w:tc>
+          <w:tcPr>
+            <w:tcW w:type="dxa" w:w="2700"/>
+          </w:tcPr>
+          <w:p>
+            <w:r/>
+            <w:r>
+              <w:rPr>
+                <w:sz w:val="18"/>
+              </w:rPr>
+              <w:t xml:space="preserve">The five NMT-only fold encoders of Experiment 5</w:t>
+            </w:r>
+          </w:p>
+        </w:tc>
+        <w:tc>
+          <w:tcPr>
+            <w:tcW w:type="dxa" w:w="2500"/>
+          </w:tcPr>
+          <w:p>
+            <w:r/>
+            <w:r>
+              <w:rPr>
+                <w:sz w:val="18"/>
+              </w:rPr>
+              <w:t xml:space="preserve">As Experiment 4 (TUAB training subsets)</w:t>
+            </w:r>
+          </w:p>
+        </w:tc>
+        <w:tc>
+          <w:tcPr>
+            <w:tcW w:type="dxa" w:w="2211"/>
+          </w:tcPr>
+          <w:p>
+            <w:r/>
+            <w:r>
+              <w:rPr>
+                <w:sz w:val="18"/>
+              </w:rPr>
+              <w:t xml:space="preserve">TUAB official eval set (276)</w:t>
+            </w:r>
+          </w:p>
+        </w:tc>
+      </w:tr>
+      <w:tr>
+        <w:trPr>
+          <w:cantSplit/>
+        </w:trPr>
+        <w:tc>
+          <w:tcPr>
+            <w:tcW w:type="dxa" w:w="1500"/>
+          </w:tcPr>
+          <w:p>
+            <w:r/>
+            <w:r>
+              <w:rPr>
+                <w:sz w:val="18"/>
+              </w:rPr>
+              <w:t xml:space="preserve">6, GTJ and FEI+GTJ rows</w:t>
+            </w:r>
+          </w:p>
+        </w:tc>
+        <w:tc>
+          <w:tcPr>
+            <w:tcW w:type="dxa" w:w="2700"/>
+          </w:tcPr>
+          <w:p>
+            <w:r/>
+            <w:r>
+              <w:rPr>
+                <w:sz w:val="18"/>
+              </w:rPr>
+              <w:t xml:space="preserve">NMT training fold plus TUAB's 2,717 unlabelled training recordings</w:t>
+            </w:r>
+          </w:p>
+        </w:tc>
+        <w:tc>
+          <w:tcPr>
+            <w:tcW w:type="dxa" w:w="2500"/>
+          </w:tcPr>
+          <w:p>
+            <w:r/>
+            <w:r>
+              <w:rPr>
+                <w:sz w:val="18"/>
+              </w:rPr>
+              <w:t xml:space="preserve">As Experiment 4</w:t>
+            </w:r>
+          </w:p>
+        </w:tc>
+        <w:tc>
+          <w:tcPr>
+            <w:tcW w:type="dxa" w:w="2211"/>
+          </w:tcPr>
+          <w:p>
+            <w:r/>
+            <w:r>
+              <w:rPr>
+                <w:sz w:val="18"/>
+              </w:rPr>
+              <w:t xml:space="preserve">TUAB official eval set (276)</w:t>
+            </w:r>
+          </w:p>
+        </w:tc>
+      </w:tr>
+      <w:tr>
+        <w:trPr>
+          <w:cantSplit/>
+        </w:trPr>
+        <w:tc>
+          <w:tcPr>
+            <w:tcW w:type="dxa" w:w="1500"/>
+          </w:tcPr>
+          <w:p>
+            <w:r/>
+            <w:r>
+              <w:rPr>
+                <w:sz w:val="18"/>
+              </w:rPr>
+              <w:t xml:space="preserve">7</w:t>
+            </w:r>
+          </w:p>
+        </w:tc>
+        <w:tc>
+          <w:tcPr>
+            <w:tcW w:type="dxa" w:w="2700"/>
+          </w:tcPr>
+          <w:p>
+            <w:r/>
+            <w:r>
+              <w:rPr>
+                <w:sz w:val="18"/>
+              </w:rPr>
+              <w:t xml:space="preserve">None (BSI and spectral features)</w:t>
+            </w:r>
+          </w:p>
+        </w:tc>
+        <w:tc>
+          <w:tcPr>
+            <w:tcW w:type="dxa" w:w="2500"/>
+          </w:tcPr>
+          <w:p>
+            <w:r/>
+            <w:r>
+              <w:rPr>
+                <w:sz w:val="18"/>
+              </w:rPr>
+              <w:t xml:space="preserve">LOSO: the other 14 stroke-cohort subjects</w:t>
+            </w:r>
+          </w:p>
+        </w:tc>
+        <w:tc>
+          <w:tcPr>
+            <w:tcW w:type="dxa" w:w="2211"/>
+          </w:tcPr>
+          <w:p>
+            <w:r/>
+            <w:r>
+              <w:rPr>
+                <w:sz w:val="18"/>
+              </w:rPr>
+              <w:t xml:space="preserve">The held-out subject, all 15 in turn</w:t>
+            </w:r>
+          </w:p>
+        </w:tc>
+      </w:tr>
+      <w:tr>
+        <w:trPr>
+          <w:cantSplit/>
+        </w:trPr>
+        <w:tc>
+          <w:tcPr>
+            <w:tcW w:type="dxa" w:w="1500"/>
+          </w:tcPr>
+          <w:p>
+            <w:r/>
+            <w:r>
+              <w:rPr>
+                <w:sz w:val="18"/>
+              </w:rPr>
+              <w:t xml:space="preserve">8</w:t>
+            </w:r>
+          </w:p>
+        </w:tc>
+        <w:tc>
+          <w:tcPr>
+            <w:tcW w:type="dxa" w:w="2700"/>
+          </w:tcPr>
+          <w:p>
+            <w:r/>
+            <w:r>
+              <w:rPr>
+                <w:sz w:val="18"/>
+              </w:rPr>
+              <w:t xml:space="preserve">The NMT-only fold encoders of Experiment 5; released ViT-M</w:t>
+            </w:r>
+          </w:p>
+        </w:tc>
+        <w:tc>
+          <w:tcPr>
+            <w:tcW w:type="dxa" w:w="2500"/>
+          </w:tcPr>
+          <w:p>
+            <w:r/>
+            <w:r>
+              <w:rPr>
+                <w:sz w:val="18"/>
+              </w:rPr>
+              <w:t xml:space="preserve">LOSO: the other 14 subjects, after the spectral-matching filter (§11.8)</w:t>
+            </w:r>
+          </w:p>
+        </w:tc>
+        <w:tc>
+          <w:tcPr>
+            <w:tcW w:type="dxa" w:w="2211"/>
+          </w:tcPr>
+          <w:p>
+            <w:r/>
+            <w:r>
+              <w:rPr>
+                <w:sz w:val="18"/>
+              </w:rPr>
+              <w:t xml:space="preserve">The held-out subject; also 100× repeated 5-fold and leave-pair-out</w:t>
             </w:r>
           </w:p>
         </w:tc>

</xml_diff>

<commit_message>
Act 0 report round 15: response to the independent re-audit
Abstract ties +0.027 to the three-run mean 0.861; stroke result called a post-hoc repair,
similar to BSI but neither superior nor equivalent; collapse rests on token spread; Experiment 6
FEI gain shown for all three pre-training runs; 7.2 cites code commit 92b6979ae3d3... and separates
artifact from re-run reproducibility; Table 21 lists the raw-recording SHA-256 manifest; Table 22 updated.
</commit_message>
<xml_diff>
--- a/docs/Act0_Final_Report.docx
+++ b/docs/Act0_Final_Report.docx
@@ -3331,7 +3331,7 @@
         </w:rPr>
         <w:t>5.4  Limitations of Tools (PO(e))</w:t>
         <w:tab/>
-        <w:t>37</w:t>
+        <w:t>38</w:t>
       </w:r>
     </w:p>
     <w:p>
@@ -3369,7 +3369,7 @@
         </w:rPr>
         <w:t>5.6  Sustainability Evaluation (PO(g))</w:t>
         <w:tab/>
-        <w:t>38</w:t>
+        <w:t>39</w:t>
       </w:r>
     </w:p>
     <w:p>
@@ -3388,7 +3388,7 @@
         </w:rPr>
         <w:t>5.7  Ethical Issues (PO(h))</w:t>
         <w:tab/>
-        <w:t>38</w:t>
+        <w:t>39</w:t>
       </w:r>
     </w:p>
     <w:p>
@@ -3407,7 +3407,7 @@
         </w:rPr>
         <w:t>6  Reflection on Individual and Team work (PO(i))</w:t>
         <w:tab/>
-        <w:t>38</w:t>
+        <w:t>39</w:t>
       </w:r>
     </w:p>
     <w:p>
@@ -3426,7 +3426,7 @@
         </w:rPr>
         <w:t>6.1  Individual Contribution of Each Member</w:t>
         <w:tab/>
-        <w:t>38</w:t>
+        <w:t>39</w:t>
       </w:r>
     </w:p>
     <w:p>
@@ -3441,7 +3441,7 @@
       <w:r>
         <w:t>6.2  Mode of TeamWork</w:t>
         <w:tab/>
-        <w:t>39</w:t>
+        <w:t>40</w:t>
       </w:r>
     </w:p>
     <w:p>
@@ -3456,7 +3456,7 @@
       <w:r>
         <w:t>6.3  Diversity Statement of Team</w:t>
         <w:tab/>
-        <w:t>39</w:t>
+        <w:t>40</w:t>
       </w:r>
     </w:p>
     <w:p>
@@ -3475,7 +3475,7 @@
         </w:rPr>
         <w:t>6.4  Log Book of Project Implementation</w:t>
         <w:tab/>
-        <w:t>39</w:t>
+        <w:t>40</w:t>
       </w:r>
     </w:p>
     <w:p>
@@ -3494,7 +3494,7 @@
         </w:rPr>
         <w:t>7  Communication to External Stakeholders (PO(j))</w:t>
         <w:tab/>
-        <w:t>40</w:t>
+        <w:t>41</w:t>
       </w:r>
     </w:p>
     <w:p>
@@ -3513,7 +3513,7 @@
         </w:rPr>
         <w:t>7.1  Executive Summary</w:t>
         <w:tab/>
-        <w:t>40</w:t>
+        <w:t>41</w:t>
       </w:r>
     </w:p>
     <w:p>
@@ -3551,7 +3551,7 @@
         </w:rPr>
         <w:t>8  Project Management and Cost Analysis (PO(k))</w:t>
         <w:tab/>
-        <w:t>41</w:t>
+        <w:t>42</w:t>
       </w:r>
     </w:p>
     <w:p>
@@ -3570,7 +3570,7 @@
         </w:rPr>
         <w:t>8.1  Computational Resources Used</w:t>
         <w:tab/>
-        <w:t>41</w:t>
+        <w:t>42</w:t>
       </w:r>
     </w:p>
     <w:p>
@@ -3589,7 +3589,7 @@
         </w:rPr>
         <w:t>8.2  Timeline of Project Implementation</w:t>
         <w:tab/>
-        <w:t>41</w:t>
+        <w:t>42</w:t>
       </w:r>
     </w:p>
     <w:p>
@@ -3608,7 +3608,7 @@
         </w:rPr>
         <w:t>9  Future Work (PO(l))</w:t>
         <w:tab/>
-        <w:t>41</w:t>
+        <w:t>42</w:t>
       </w:r>
     </w:p>
     <w:p>
@@ -3627,7 +3627,7 @@
         </w:rPr>
         <w:t>10  References</w:t>
         <w:tab/>
-        <w:t>42</w:t>
+        <w:t>43</w:t>
       </w:r>
     </w:p>
     <w:p>
@@ -3646,7 +3646,7 @@
         </w:rPr>
         <w:t>11  Appendix: Reproducibility Records</w:t>
         <w:tab/>
-        <w:t>43</w:t>
+        <w:t>44</w:t>
       </w:r>
     </w:p>
     <w:p>
@@ -3665,7 +3665,7 @@
         </w:rPr>
         <w:t>11.1  Environment and Checkpoint Provenance</w:t>
         <w:tab/>
-        <w:t>43</w:t>
+        <w:t>44</w:t>
       </w:r>
     </w:p>
     <w:p>
@@ -3684,7 +3684,7 @@
         </w:rPr>
         <w:t>11.2  Stroke Cohort: Pre-registration, Post-hoc Input and Fold-local Check</w:t>
         <w:tab/>
-        <w:t>44</w:t>
+        <w:t>45</w:t>
       </w:r>
     </w:p>
     <w:p>
@@ -3703,7 +3703,7 @@
         </w:rPr>
         <w:t>11.3  Experiment 5 Corrected Statistics</w:t>
         <w:tab/>
-        <w:t>44</w:t>
+        <w:t>45</w:t>
       </w:r>
     </w:p>
     <w:p>
@@ -3722,7 +3722,7 @@
         </w:rPr>
         <w:t>11.4  Reproducibility Files</w:t>
         <w:tab/>
-        <w:t>45</w:t>
+        <w:t>46</w:t>
       </w:r>
     </w:p>
     <w:p>
@@ -3741,7 +3741,7 @@
         </w:rPr>
         <w:t>11.5  Checks Not Run</w:t>
         <w:tab/>
-        <w:t>45</w:t>
+        <w:t>46</w:t>
       </w:r>
     </w:p>
     <w:p>
@@ -3760,7 +3760,7 @@
         </w:rPr>
         <w:t>11.6  Pre-training Configuration and Commands</w:t>
         <w:tab/>
-        <w:t>46</w:t>
+        <w:t>47</w:t>
       </w:r>
     </w:p>
     <w:p>
@@ -3779,7 +3779,7 @@
         </w:rPr>
         <w:t>11.7  Statistical Procedures</w:t>
         <w:tab/>
-        <w:t>47</w:t>
+        <w:t>48</w:t>
       </w:r>
     </w:p>
     <w:p>
@@ -3798,7 +3798,7 @@
         </w:rPr>
         <w:t>11.8  Stroke Spectral-Matching Filter</w:t>
         <w:tab/>
-        <w:t>47</w:t>
+        <w:t>48</w:t>
       </w:r>
     </w:p>
     <w:p>
@@ -3817,7 +3817,7 @@
         </w:rPr>
         <w:t>11.9  Data Used by Each Experiment</w:t>
         <w:tab/>
-        <w:t>48</w:t>
+        <w:t>49</w:t>
       </w:r>
     </w:p>
     <w:p>
@@ -6821,7 +6821,7 @@
         <w:rPr>
           <w:b w:val="0"/>
         </w:rPr>
-        <w:t>: on two completely different datasets, almost every recording we fed in came out as nearly the same output vector, so a classifier built on top of it does no better than one built on random, untrained weights. This is not a preprocessing mistake on our side. We matched the paper's own pipeline file-for-file (43 of 48 files byte-identical to the authors' public repository) and still could not reach their reported accuracy.</w:t>
+        <w:t>: on two completely different datasets, almost every recording we fed in came out as nearly the same output vector, so a classifier built on top of it does no better than one built on random, untrained weights. The collapse is not explained by any preprocessing variation we tested and appears to be a property of the released weights. We matched the paper's own pipeline file-for-file (43 of 48 files byte-identical to the authors' public repository) and still could not reach their reported accuracy.</w:t>
       </w:r>
     </w:p>
     <w:p>
@@ -6865,7 +6865,7 @@
         <w:rPr>
           <w:b w:val="0"/>
         </w:rPr>
-        <w:t xml:space="preserve"> on five-fold cross-validation on the NMT dataset (2,417 recordings), ahead of a classical hand-crafted band-power baseline scored on the identical folds (0.786 ± 0.009; better in all 5 folds, Holm-corrected p = 0.029). An untrained twin of the same fused architecture already reaches 0.834, though, so most of that margin comes from the architecture; pre-training adds +0.027 AUROC, better in all 5 folds but not statistically significant after correction. On a completely different hospital's data (TUAB), FEI pre-trained on NMT alone, with no TUAB data at all, scored +0.059 AUROC above a random-weight twin (p = 0.002). GTJ did not survive that zero-shot shift (0.840 vs 0.863 for its random twin), so we also re-pre-trained both encoders on NMT plus TUAB's unlabelled training recordings: the fused model then tied the released ViT-M checkpoint under our linear probe (0.862 vs 0.838, not significant) and beat band power (0.757), but did no better than its own random-weight twin (0.861). We then took the NMT-only encoders to a third, unrelated task: telling stroke patients apart from healthy controls in a small resting-state EEG cohort. There, FEI+GTJ matched the clinical Brain Symmetry Index (BSI) baseline (0.926 vs 0.907 AUROC, leave-one-subject-out: a model is validated on one subject it never saw any data from, repeated once per subject).</w:t>
+        <w:t xml:space="preserve"> on five-fold cross-validation on the NMT dataset (2,417 recordings), ahead of a classical hand-crafted band-power baseline scored on the identical folds (0.786 ± 0.009; better in all 5 folds, Holm-corrected p = 0.029). An untrained twin of the same fused architecture already reaches 0.834, though, so most of that margin comes from the architecture. Averaged over this run and two independently seeded re-runs, the fused model scores 0.861, so pre-training adds +0.027 AUROC over that twin, better in all 5 folds but not statistically significant after correction. On a completely different hospital's data (TUAB), FEI pre-trained on NMT alone, with no TUAB data at all, scored +0.059 AUROC above a random-weight twin (p = 0.002); two independently seeded re-runs of that pre-training gave +0.046 and +0.052 (p = 0.007 and 0.004). GTJ did not survive that zero-shot shift (0.840 vs 0.863 for its random twin), so we also re-pre-trained both encoders on NMT plus TUAB's unlabelled training recordings: the fused model then tied the released ViT-M checkpoint under our linear probe (0.862 vs 0.838, not significant) and beat band power (0.757), but did no better than its own random-weight twin (0.861). We then took the NMT-only encoders to a third, unrelated task: telling stroke patients apart from healthy controls in a small resting-state EEG cohort. There, after a spectrum-matching step we designed post hoc on this same cohort (the input fixed in advance gave 0.833), FEI+GTJ scored close to the clinical Brain Symmetry Index (BSI) baseline (0.926 vs 0.907 AUROC, leave-one-subject-out: a model is validated on one subject it never saw any data from, repeated once per subject). With 15 subjects that difference is far too uncertain to show either superiority or equivalence.</w:t>
       </w:r>
     </w:p>
     <w:p>
@@ -10783,7 +10783,7 @@
         <w:rPr>
           <w:b w:val="0"/>
         </w:rPr>
-        <w:t>The stroke cohort also needed two preprocessing steps the other two datasets do not. First, a purely data-quality step: any channel the dataset's own authors had flagged as bad is rebuilt from its neighbours by spherical-spline interpolation before anything else is done to the recording. Second, a non-obvious step described in full in §5.3.3 (Experiment 8): because its recording hardware and montage differ from NMT's, its raw spectrum does not match what our NMT-trained encoders expect to see, and GTJ in particular is sensitive to this mismatch. We built a label-free, per-channel spectral-matching filter that maps the stroke cohort's mean spectrum onto NMT's before any encoder sees it, fixing this without ever looking at the stroke/control labels. The filter is fitted once on all 15 subjects pooled, so it is transductive (each held-out subject helps shape the filter applied to it), and it was added after the pre-registered analysis had been run; Appendix §11.2 gives the record and a fold-local check.</w:t>
+        <w:t>The stroke cohort also needed two preprocessing steps the other two datasets do not. First, a purely data-quality step: any channel the dataset's own authors had flagged as bad is rebuilt from its neighbours by spherical-spline interpolation before anything else is done to the recording. Second, a non-obvious step described in full in §5.3.3 (Experiment 8): because its recording hardware and montage differ from NMT's, its raw spectrum does not match what our NMT-trained encoders expect to see, and GTJ in particular is sensitive to this mismatch. We built a label-free, per-channel spectral-matching filter that maps the stroke cohort's mean spectrum onto NMT's before any encoder sees it, fixing this without ever looking at the stroke/control labels. The filter is fitted once on all 15 subjects pooled, so it is transductive (each held-out subject helps shape the filter applied to it), and it was added after the pre-registered analysis had been run; Appendix §11.2 gives the record and a fold-local check. Here and throughout, “pre-registered” means a locally timestamped pre-analysis protocol (Appendix §11.2), not an entry in a public registry.</w:t>
       </w:r>
     </w:p>
     <w:p>
@@ -14614,7 +14614,7 @@
           <w:i w:val="0"/>
           <w:sz w:val="18"/>
         </w:rPr>
-        <w:t>Figure 16: Direct evidence of representation collapse — the released checkpoint's per-recording output spread (token std) is about 125× smaller than a random-weight twin's, on both TUAB and the (never-seen-in-pretraining) stroke dataset, and its recordings are almost perfectly cosine-similar to one another (mean 0.999982) regardless of diagnosis.</w:t>
+        <w:t>Figure 16: Direct evidence of representation collapse — the released checkpoint's per-recording output spread (token std) is about 125× smaller than a random-weight twin's, on both TUAB and the (never-seen-in-pretraining) stroke dataset, and its recordings are almost perfectly cosine-similar to one another (mean 0.999982) regardless of diagnosis. Token spread is the deciding measure; random weights also reach a cosine of 0.9991 on the stroke cohort.</w:t>
       </w:r>
     </w:p>
     <w:p>
@@ -15253,7 +15253,7 @@
         <w:rPr>
           <w:b w:val="0"/>
         </w:rPr>
-        <w:t>The two groups don't overlap at all. The largest token std measured for the released checkpoint, on any recording, was 0.0085. The smallest measured for a random-weight twin was 0.379. That rules out measurement noise. The released EEG-VJEPA checkpoints give almost the same output for every input, on two entirely different patient populations. This is a property of the released weights themselves, not of our pipeline, our preprocessing, or which dataset we happen to test on. We even checked whether our own z-scoring convention could be doing this: per-recording and per-window normalisation give the same collapsed number (token std 0.0059, cosine 1.0000) on the same 120 recordings. It isn't us. We fixed no numeric collapse threshold in advance: the criterion is separation from every random-weight twin, and a gap of 0.0085 against 0.379 needs no threshold to read.</w:t>
+        <w:t>The two groups don't overlap at all. The largest token std measured for the released checkpoint, on any recording, was 0.0085. The smallest measured for a random-weight twin was 0.379. That rules out measurement noise. The released EEG-VJEPA checkpoints give almost the same output for every input, on two entirely different patient populations. No preprocessing variation we tested changes this, and it holds on both datasets, so it appears to be a property of the released weights rather than of our pipeline or of which dataset we test on. We even checked whether our own z-scoring convention could be doing this: per-recording and per-window normalisation give the same collapsed number (token std 0.0059, cosine 1.0000) on the same 120 recordings. We fixed no numeric collapse threshold in advance: the criterion is separation from every random-weight twin, and a gap of 0.0085 against 0.379 needs no threshold to read. Token spread is the deciding measure. Cosine alone is not: on the 15-subject stroke cohort even random weights give a cross-recording cosine of 0.9991 (Table 9).</w:t>
       </w:r>
     </w:p>
     <w:p>
@@ -16697,7 +16697,7 @@
         <w:rPr>
           <w:b w:val="0"/>
         </w:rPr>
-        <w:t>Fusion beats FEI alone and GTJ alone in every one of the five folds, a strong sign that the two branches pick up different aspects of the signal. The five training sets overlap (any two share three quarters of their recordings), so an ordinary paired t-test over folds understates the variance; every p-value in this experiment is therefore the Nadeau–Bengio corrected resampled t-test [20], Holm-adjusted [21] over the eleven comparisons of Table 20 (Appendix §11.3). The pre-trained arms there are averaged over three independent pre-training runs, the original plus two re-runs with new seeds (code/act0_nmt_pretrain_replicate.py), whose fused means were 0.865, 0.865 and 0.852. On those means fusion is ahead of FEI by +0.041 (p = 0.027) and of GTJ by +0.030 (p = 0.012 before Holm, 0.082 after). Against band power on the same folds, the fused model is ahead by +0.075 AUROC (all 5 folds, p = 0.029) and GTJ by +0.045 (all 5 folds, p = 0.027); FEI's +0.034 (4 of 5 folds) is not significant (p = 0.45). The random-init twins change how that margin should be read. An untrained fused encoder already reaches 0.834 ± 0.007, itself ahead of band power by +0.048 (all 5 folds, p = 0.026), so most of the fused model's advantage comes from its architecture and input representation. Pre-training adds +0.027 on top, better in all 5 folds but not significant once corrected (p = 0.15 before Holm, 0.45 after); the gain is +0.036 for GTJ (all 5 folds, p = 0.019 before Holm, 0.12 after) and only +0.010 for FEI (3 of 5 folds). This band-power arm is the same relative-band-power feature as Table 10's, recomputed on NMT's own 200 Hz input with its bands running from 0.5 to 45 Hz (code/baseline_bandpower.py).</w:t>
+        <w:t>Fusion beats FEI alone and GTJ alone in every one of the five folds, a strong sign that the two branches pick up different aspects of the signal. The five training sets overlap (any two share three quarters of their recordings), so an ordinary paired t-test over folds understates the variance; every p-value in this experiment is therefore the Nadeau–Bengio corrected resampled t-test [20], Holm-adjusted [21] over the eleven comparisons of Table 20 (Appendix §11.3). The pre-trained arms there are averaged over three independent pre-training runs, the original plus two re-runs with new seeds (code/act0_nmt_pretrain_replicate.py), whose fused means were 0.865, 0.865 and 0.852. On those means fusion is ahead of FEI by +0.041 (p = 0.027) and of GTJ by +0.030 (p = 0.012 before Holm, 0.082 after). Against band power on the same folds, the fused model is ahead by +0.075 AUROC (all 5 folds, p = 0.029) and GTJ by +0.045 (all 5 folds, p = 0.027); FEI's +0.034 (4 of 5 folds) is not significant (p = 0.45). The random-init twins change how that margin should be read. An untrained fused encoder already reaches 0.834 ± 0.007, itself ahead of band power by +0.048 (all 5 folds, p = 0.026), so most of the fused model's advantage comes from its architecture and input representation. Pre-training adds +0.027 on top (three-run mean 0.861 against 0.834), better in all 5 folds but not significant once corrected (p = 0.15 before Holm, 0.45 after); the gain is +0.036 for GTJ (all 5 folds, p = 0.019 before Holm, 0.12 after) and only +0.010 for FEI (3 of 5 folds). This band-power arm is the same relative-band-power feature as Table 10's, recomputed on NMT's own 200 Hz input with its bands running from 0.5 to 45 Hz (code/baseline_bandpower.py).</w:t>
       </w:r>
     </w:p>
     <w:p>
@@ -18205,7 +18205,7 @@
         <w:rPr>
           <w:b w:val="0"/>
         </w:rPr>
-        <w:t>FEI's zero-shot pre-training gain, though, is statistically significant on its own: FEI beats its random-init twin by +0.059 AUROC (95% CI [0.019, 0.097], p = 0.002): so what FEI learned on NMT alone carries information about abnormal EEG on TUAB that its architecture by itself does not supply (one dataset pair, one pre-training run).</w:t>
+        <w:t>FEI's zero-shot pre-training gain, though, is statistically significant on its own: FEI beats its random-init twin by +0.059 AUROC (95% CI [0.019, 0.097], p = 0.002): so what FEI learned on NMT alone carries information about abnormal EEG on TUAB that its architecture by itself does not supply (one dataset pair). That p-value resamples the 276 test recordings for one set of trained encoders (five, one per NMT training fold, ensembled), so it says nothing about how the gain varies between pre-training runs. We therefore scored Experiment 5's two seeded re-runs on TUAB the same way (code/tuab_fei_reps.py), against the same random-init twins: +0.046 (95% CI [0.011, 0.083], p = 0.007) and +0.052 (95% CI [0.016, 0.090], p = 0.004). Of the 15 individual fold encoders across the three runs, 14 score above the random-init ensemble (0.813) and 15 above the best single random-init encoder (0.809). The same script gives the original run's +0.059 again.</w:t>
       </w:r>
     </w:p>
     <w:p>
@@ -19638,7 +19638,7 @@
         <w:rPr>
           <w:b w:val="0"/>
         </w:rPr>
-        <w:t>The fix: a label-free, per-channel zero-phase filter that maps the stroke cohort's mean spectrum onto NMT's, gated on numerical thresholds. This step was not pre-registered: under the pre-registered input, FEI+GTJ had scored 0.833 LOSO AUROC, below its random-init twin's 0.889, and that result is what prompted the fix. The recipe, its gates and the comparisons to run were written to runs/act0/phaseB_clean/POSTHOC.md before any LOSO run on the corrected input (Appendix §11.2), and every gate passed. The largest gap between the stroke and NMT log-spectra fell from 5.81 to 0.18 decades (gate: ≤ 0.25 decades), GTJ's BatchNorm inputs fell from |z| ≈ 4.3 to ≈ 0.37, and no embedding dimension stayed constant across subjects.</w:t>
+        <w:t>The fix: a label-free, per-channel zero-phase filter that maps the stroke cohort's mean spectrum onto NMT's, gated on numerical thresholds. This step was not pre-registered: under the pre-registered input, FEI+GTJ had scored 0.833 LOSO AUROC, below its random-init twin's 0.889, and that result is what prompted the fix. The recipe, its gates and the comparisons to run were written to runs/act0/phaseB_clean/POSTHOC.md before any LOSO run on the corrected input (Appendix §11.2), and every gate passed. The largest gap between the stroke and NMT log-spectra fell from 5.81 to 0.18 decades (gate: ≤ 0.25 decades), GTJ's BatchNorm inputs fell from |z| ≈ 4.3 to ≈ 0.37, and no embedding dimension stayed constant across subjects. Experiment 8 is therefore a post-hoc repair of a distribution shift, tested on the same 15 subjects whose result prompted it, not an independent confirmation. Refitting the filter inside each fold (Table 19) rules out test-subject leakage, but the method itself was shaped by this cohort; whether it carries over needs a new cohort.</w:t>
       </w:r>
     </w:p>
     <w:p>
@@ -20194,7 +20194,7 @@
         <w:rPr>
           <w:b w:val="0"/>
         </w:rPr>
-        <w:t>FEI+GTJ reaches 0.926 LOSO AUROC and matches the BSI baseline (Δ = +0.019, 95% CI [−0.240, 0.280], p = 0.523): not significantly different either way, under every cross-validation scheme we tried. At the default 0.5 threshold, FEI+GTJ, BSI alone, and FEI+GTJ+BSI combined all land on the identical confusion matrix — 8 of 9 stroke cases and all 6 controls called correctly, one stroke case missed (Acc 0.933, BAcc 0.944, F1 0.941, Sens 0.889, Spec 1.000) — differing only in AUROC, i.e. in how confidently each ranks that one missed case; the random-init twin is very slightly worse at this same threshold (one extra false positive: Acc 0.867, BAcc 0.861, F1 0.889, Spec 0.833). It does not show a significant advantage from pre-training as a whole on this task: FEI+GTJ vs. its own random-init twin is −0.019 LOSO AUROC (p = 0.826), a tie. Splitting this by branch (exploratory, single-arm, not pre-registered) shows the same pattern as TUAB: FEI's pre-training clears its random twin in 100% of repeated 5-fold splits; GTJ's does not, only 16% of repeats. The single, deterministic LOSO split (every subject held out exactly once, so there is no fold-assignment randomness to repeat here) tells a more dramatic version of the same branch story: FEI alone reaches a perfect 1.000 LOSO AUROC — a threshold exists with zero errors, 9/9 stroke and 6/6 control — against GTJ alone's 0.833 and the random-init twins' 0.907 (FEI) / 0.852 (GTJ). A perfect score on 15 subjects is still fragile, since one atypically-recorded subject could flip it, which is why the repeated, randomized 5-fold win-rate above, not this single point estimate, is the statistic we'd stand behind. FEI+GTJ combined with BSI (0.963 LOSO) numerically beats BSI alone in 82% of repeated splits — promising, but not statistically significant at 15 subjects. With the spectral-matching filter refitted inside each fold instead (Table 19), FEI+GTJ stays at 0.926 and FEI+GTJ+BSI drops to 0.944, the same as its random-init twin.</w:t>
+        <w:t>FEI+GTJ reaches 0.926 LOSO AUROC against BSI's 0.907 (Δ = +0.019, 95% CI [−0.240, 0.280], p = 0.523): a similar point estimate, not significantly different either way under every cross-validation scheme we tried. We set no equivalence margin in advance, and an interval this wide cannot show equivalence either, so the cohort is simply too small to rank the two. At the default 0.5 threshold, FEI+GTJ, BSI alone, and FEI+GTJ+BSI combined all land on the identical confusion matrix — 8 of 9 stroke cases and all 6 controls called correctly, one stroke case missed (Acc 0.933, BAcc 0.944, F1 0.941, Sens 0.889, Spec 1.000) — differing only in AUROC, i.e. in how confidently each ranks that one missed case; the random-init twin is very slightly worse at this same threshold (one extra false positive: Acc 0.867, BAcc 0.861, F1 0.889, Spec 0.833). It does not show a significant advantage from pre-training as a whole on this task: FEI+GTJ vs. its own random-init twin is −0.019 LOSO AUROC (p = 0.826), a tie. Splitting this by branch (exploratory, single-arm, not pre-registered) shows the same pattern as TUAB: FEI's pre-training clears its random twin in 100% of repeated 5-fold splits; GTJ's does not, only 16% of repeats. The single, deterministic LOSO split (every subject held out exactly once, so there is no fold-assignment randomness to repeat here) tells a more dramatic version of the same branch story: FEI alone reaches a perfect 1.000 LOSO AUROC — a threshold exists with zero errors, 9/9 stroke and 6/6 control — against GTJ alone's 0.833 and the random-init twins' 0.907 (FEI) / 0.852 (GTJ). A perfect score on 15 subjects is still fragile, since one atypically-recorded subject could flip it, which is why the repeated, randomized 5-fold win-rate above, not this single point estimate, is the statistic we'd stand behind. FEI+GTJ combined with BSI (0.963 LOSO) numerically beats BSI alone in 82% of repeated splits — promising, but not statistically significant at 15 subjects. With the spectral-matching filter refitted inside each fold instead (Table 19), FEI+GTJ stays at 0.926 and FEI+GTJ+BSI drops to 0.944, the same as its random-init twin.</w:t>
       </w:r>
     </w:p>
     <w:p>
@@ -20221,7 +20221,7 @@
         <w:rPr>
           <w:b w:val="0"/>
         </w:rPr>
-        <w:t>The released EEG-VJEPA checkpoints don't reproduce the paper's own result, because they're collapsed (Experiments 1–3). No amount of fine-tuning under the authors' own recipe fixes that (Experiment 2), and the simplest possible probe can't rescue it either (Experiment 4). FEI+GTJ, built in response, beats a classical baseline on the data it was trained on, although an untrained twin already accounts for about two-thirds of that margin (Experiment 5); on a different hospital's data, FEI's NMT-only pre-training still gives a significant gain, and the fused model, re-pre-trained with that hospital's unlabelled recordings, ties the released checkpoint and stays ahead of a classical baseline (Experiment 6), and matches a strong clinical baseline on a third, structurally different task (Experiments 7–8). A t-SNE/UMAP visual check, matching our original proposal's promised deliverable, shows that 2-D unsupervised layout is the wrong tool for seeing why any of these encoders work, or why the released one doesn't.</w:t>
+        <w:t>The released EEG-VJEPA checkpoints don't reproduce the paper's own result, because they're collapsed (Experiments 1–3). No amount of fine-tuning under the authors' own recipe fixes that (Experiment 2), and the simplest possible probe can't rescue it either (Experiment 4). FEI+GTJ, built in response, beats a classical baseline on the data it was trained on, although an untrained twin already accounts for about two-thirds of that margin (Experiment 5); on a different hospital's data, FEI's NMT-only pre-training still gives a significant gain, in all three pre-training runs, and the fused model, re-pre-trained with that hospital's unlabelled recordings, ties the released checkpoint and stays ahead of a classical baseline (Experiment 6), and, after a post-hoc input fix, scores close to a strong clinical baseline on a third, structurally different task, too close for 15 subjects to separate (Experiments 7–8). A t-SNE/UMAP visual check, matching our original proposal's promised deliverable, shows that 2-D unsupervised layout is the wrong tool for seeing why any of these encoders work, or why the released one doesn't.</w:t>
       </w:r>
     </w:p>
     <w:p>
@@ -20406,7 +20406,7 @@
         <w:rPr>
           <w:b w:val="0"/>
         </w:rPr>
-        <w:t>The released EEG-VJEPA checkpoints are collapsed and fail to reproduce the paper; our token-spread diagnostic is repeatable, and the released training config gives a likely cause. FEI+GTJ beats our classical baseline on NMT, with pre-training adding a consistent but not significant +0.027 AUROC over an untrained twin, and matches BSI on stroke. Across hospitals, FEI's NMT-only pre-training still gives a significant gain; the fused model, re-pre-trained with TUAB's unlabelled recordings, ties the released ViT-M there, with no significant advantage. On stroke only FEI shows a pre-training gain, and no model here significantly beats BSI. Table 16 compares these outcomes with the original proposal.</w:t>
+        <w:t>The released EEG-VJEPA checkpoints are collapsed and fail to reproduce the paper; our token-spread diagnostic is repeatable, and the released training config gives a likely cause. FEI+GTJ beats our classical baseline on NMT, with pre-training adding a consistent but not significant +0.027 AUROC over an untrained twin (three-run mean 0.861 vs 0.834); on stroke, after a post-hoc input fix, its AUROC is close to BSI's, with far too few subjects to call them equivalent. Across hospitals, FEI's NMT-only pre-training still gives a significant gain, in all three pre-training runs; the fused model, re-pre-trained with TUAB's unlabelled recordings, ties the released ViT-M there, with no significant advantage. On stroke only FEI shows a pre-training gain, and no model here significantly beats BSI. Table 16 compares these outcomes with the original proposal.</w:t>
       </w:r>
     </w:p>
     <w:p>
@@ -20524,7 +20524,7 @@
               <w:rPr>
                 <w:sz w:val="18"/>
               </w:rPr>
-              <w:t>Done faithfully; result not reproduced</w:t>
+              <w:t>Done faithfully, as far as the paper's text specifies; result not reproduced</w:t>
             </w:r>
           </w:p>
         </w:tc>
@@ -20679,7 +20679,7 @@
               <w:rPr>
                 <w:sz w:val="18"/>
               </w:rPr>
-              <w:t xml:space="preserve">0.865 ± 0.024 on NMT vs. band power 0.786 and untrained twin 0.834 (pre-training +0.027, not significant); on TUAB, FEI's NMT-only pre-training +0.059 (p = 0.002); fused, with TUAB's unlabelled recordings added, ties released ViT-M and beats band power (Exp. 5–6)</w:t>
+              <w:t>0.865 ± 0.024 on NMT vs. band power 0.786 and untrained twin 0.834 (three-run mean 0.861: pre-training +0.027, not significant); on TUAB, FEI's NMT-only pre-training +0.059 (p = 0.002; +0.046 and +0.052 in two re-runs); fused, with TUAB's unlabelled recordings added, ties released ViT-M and beats band power (Exp. 5–6)</w:t>
             </w:r>
           </w:p>
         </w:tc>
@@ -20726,7 +20726,7 @@
               <w:rPr>
                 <w:sz w:val="18"/>
               </w:rPr>
-              <w:t>Gate passed p = 0.003; BSI 0.907; FEI+GTJ 0.926 matches BSI (Exp. 7–8)</w:t>
+              <w:t>Gate passed p = 0.003; BSI 0.907; FEI+GTJ 0.926 after a post-hoc input fix, not separable from BSI (Exp. 7–8)</w:t>
             </w:r>
           </w:p>
         </w:tc>
@@ -21997,7 +21997,7 @@
         <w:rPr>
           <w:b w:val="0"/>
         </w:rPr>
-        <w:t>A recently published AI model, EEG-VJEPA, claimed to automatically tell healthy brain recordings apart from abnormal ones by adapting a video-understanding technique to EEG. Our team tested this claim and found that the publicly released version does not actually work as described: it gives almost the same answer for every patient. We could show this directly. We built two smaller models instead: one for frequency content and one for how a signal's rhythm changes over time. Together they beat a simple classical measurement on the dataset they were trained on (an untrained copy of the same design already does most of that) and match an established clinical measurement on a third task: telling stroke patients apart from healthy volunteers. On a different hospital's data, the frequency model's training still helped on its own; the combined model needed that hospital's unlabelled recordings too, and there it only matched the released model.</w:t>
+        <w:t>A recently published AI model, EEG-VJEPA, claimed to automatically tell healthy brain recordings apart from abnormal ones by adapting a video-understanding technique to EEG. Our team tested this claim and found that the publicly released version does not actually work as described: it gives almost the same answer for every patient. We could show this directly. We built two smaller models instead: one for frequency content and one for how a signal's rhythm changes over time. Together they beat a simple classical measurement on the dataset they were trained on (an untrained copy of the same design already does most of that) and score close to an established clinical measurement, with too few patients to tell the two apart, on a third task: telling stroke patients apart from healthy volunteers. On a different hospital's data, the frequency model's training still helped on its own; the combined model needed that hospital's unlabelled recordings too, and there it only scored close to the released model.</w:t>
       </w:r>
     </w:p>
     <w:p>
@@ -22015,7 +22015,7 @@
         <w:rPr>
           <w:b w:val="0"/>
         </w:rPr>
-        <w:t>All code, saved model checkpoints, and saved per-recording predictions used to produce every number, table, and figure in this report are organized as a set of scripts, one per experiment (Table 5). Table 4 gives the script behind each experiment's input. The 200 Hz NMT copy that FEI and GTJ read (per-channel z-scored at NMT's native rate, stored as 2.5-second frames) was first written in August 2026 by a script that was not kept; we reconstructed its recipe as code/preprocess_nmt_200hz.py, which reproduces all 2,417 stored files byte for byte. From those inputs, pre-train an encoder (`fei_pretrain.py` or `fei_branchC.py`, both with a `--selftest` flag for a fast sanity check with no real data and a `--cv` flag for the full five-fold cross-validation reported here), score it with `feic_nmt_anchor.py` (Experiment 5) or `tuab_feic.py` (Experiment 6), and evaluate a frozen or fine-tuned released checkpoint with the corresponding `tuab_*_eval.py` script. Every long-running script checkpoints its progress after each cross-validation fold and can be safely re-run to resume after an interruption, and each accepts command-line flags for every experiment variant reported here. The code is in github.com/mashfiqurrahman2020-coder/EEG-VJEPA-act-0; its docs/act0_repro/ folder holds the fold, subset and cohort lists, the SHA-256 of every checkpoint and result file, and the pinned environment (Appendix §11). The version used for this report is the repository's tag act0-report-round14: git clone https://github.com/mashfiqurrahman2020-coder/EEG-VJEPA-act-0.git, then git checkout act0-report-round14, then pip install -r docs/act0_repro/requirements-act0.txt under Python 3.9. Appendix §11.6 gives the pre-training commands and §11.9 the data each experiment uses.</w:t>
+        <w:t>All code, saved model checkpoints, and saved per-recording predictions used to produce every number, table, and figure in this report are organized as a set of scripts, one per experiment (Table 5). Table 4 gives the script behind each experiment's input. The 200 Hz NMT copy that FEI and GTJ read (per-channel z-scored at NMT's native rate, stored as 2.5-second frames) was first written in August 2026 by a script that was not kept; we reconstructed its recipe as code/preprocess_nmt_200hz.py, which reproduces all 2,417 stored files byte for byte. From those inputs, pre-train an encoder (`fei_pretrain.py` or `fei_branchC.py`, both with a `--selftest` flag for a fast sanity check with no real data and a `--cv` flag for the full five-fold cross-validation reported here), score it with `feic_nmt_anchor.py` (Experiment 5) or `tuab_feic.py` (Experiment 6), and evaluate a frozen or fine-tuned released checkpoint with the corresponding `tuab_*_eval.py` script. Every long-running script checkpoints its progress after each cross-validation fold and can be safely re-run to resume after an interruption, and each accepts command-line flags for every experiment variant reported here. The code is in github.com/mashfiqurrahman2020-coder/EEG-VJEPA-act-0; its docs/act0_repro/ folder holds the fold, subset and cohort lists, the SHA-256 of every checkpoint and result file, and the pinned environment (Appendix §11). The code, checkpoints and results behind this report are commit 14143a8d1a2911322dfe237b90506681506383fc, which unlike a tag cannot be moved: git clone https://github.com/mashfiqurrahman2020-coder/EEG-VJEPA-act-0.git, then git checkout 14143a8d1a29, then pip install -r docs/act0_repro/requirements-act0.txt under Python 3.9. Appendix §11.6 gives the pre-training commands and §11.9 the data each experiment uses. The report itself is added one commit later, under the tag act0-report-round15. All 40 FEI/GTJ checkpoints are committed in the repository (code/*.pt, about 110 MB), so nothing needs a separate download except the data and the released EEG-VJEPA weights. Two kinds of reproduction follow. The saved checkpoints and predictions reproduce every reported number exactly. Re-training does not: the original FEI and GTJ runs set no random seed, so they cannot be regenerated bit for bit, and cuDNN kernels were left non-deterministic, so even the seeded re-runs should be expected to reproduce the results statistically, not bit for bit.</w:t>
       </w:r>
     </w:p>
     <w:p>
@@ -23645,7 +23645,7 @@
         <w:rPr>
           <w:b w:val="0"/>
         </w:rPr>
-        <w:t>Only the combined FEI+GTJ+BSI arm moves (0.963 to 0.944), which removes its small numerical edge over its random-init twin; FEI+GTJ itself, and its tie with BSI that Experiment 8 rests on, are unchanged.</w:t>
+        <w:t>Only the combined FEI+GTJ+BSI arm moves (0.963 to 0.944), which removes its small numerical edge over its random-init twin; FEI+GTJ itself, and its AUROC close to BSI's that Experiment 8 rests on, are unchanged.</w:t>
       </w:r>
     </w:p>
     <w:p>
@@ -23670,7 +23670,7 @@
           <w:i w:val="0"/>
           <w:sz w:val="18"/>
         </w:rPr>
-        <w:t>Table 20: Experiment 5 on NMT, all eleven comparisons. Pre-trained arms are per-fold means over three pre-training runs, random-init arms over five seeds. Corrected p is the Nadeau–Bengio resampled t-test [20] (variance × (1/5 + n_test/n_train), n_train ≈ 1,934, n_test ≈ 483, 4 degrees of freedom); Holm [21] adjusts over all eleven. Naive p is the ordinary paired t-test over folds, shown for comparison only.</w:t>
+        <w:t>Table 20: Experiment 5 on NMT, all eleven comparisons. Pre-trained arms are per-fold means over three pre-training runs, random-init arms over five seeds. Corrected p is the Nadeau–Bengio resampled t-test [20] (variance × (1/5 + n_test/n_train), n_train ≈ 1,934, n_test ≈ 483, 4 degrees of freedom); Holm [21] adjusts over all eleven. Naive p is the ordinary paired t-test over folds, shown for comparison only. Averaging the three runs within each fold before the test folds training-run variation into the fold means; a hierarchical model would estimate the two sources separately.</w:t>
       </w:r>
     </w:p>
     <w:tbl>
@@ -25151,7 +25151,7 @@
           <w:i w:val="0"/>
           <w:sz w:val="18"/>
         </w:rPr>
-        <w:t>Table 21: Files in docs/act0_repro/ (written by code/act0_repro_manifest.py). The raw recordings are not redistributed: NMT [7] and the stroke cohort [13] are public, and TUAB must be obtained from its maintainers under their data use agreement (§5.5.3).</w:t>
+        <w:t>Table 21: Files in docs/act0_repro/ (written by code/act0_repro_manifest.py). The raw recordings are not redistributed: NMT [7] and the stroke cohort [13] are public, and TUAB must be obtained from its maintainers under their data use agreement (§5.5.3). Their per-file SHA-256 are listed instead, so any copy can be checked byte for byte.</w:t>
       </w:r>
     </w:p>
     <w:tbl>
@@ -25442,7 +25442,7 @@
               <w:rPr>
                 <w:sz w:val="18"/>
               </w:rPr>
-              <w:t xml:space="preserve">33</w:t>
+              <w:t xml:space="preserve">34</w:t>
             </w:r>
           </w:p>
         </w:tc>
@@ -25551,6 +25551,53 @@
                 <w:sz w:val="18"/>
               </w:rPr>
               <w:t xml:space="preserve">Table 18's environment lines</w:t>
+            </w:r>
+          </w:p>
+        </w:tc>
+      </w:tr>
+      <w:tr>
+        <w:trPr>
+          <w:cantSplit/>
+        </w:trPr>
+        <w:tc>
+          <w:tcPr>
+            <w:tcW w:type="dxa" w:w="2600"/>
+          </w:tcPr>
+          <w:p>
+            <w:r/>
+            <w:r>
+              <w:rPr>
+                <w:sz w:val="18"/>
+              </w:rPr>
+              <w:t xml:space="preserve">raw_recordings_sha256.csv</w:t>
+            </w:r>
+          </w:p>
+        </w:tc>
+        <w:tc>
+          <w:tcPr>
+            <w:tcW w:type="dxa" w:w="900"/>
+          </w:tcPr>
+          <w:p>
+            <w:r/>
+            <w:r>
+              <w:rPr>
+                <w:sz w:val="18"/>
+              </w:rPr>
+              <w:t xml:space="preserve">5,501</w:t>
+            </w:r>
+          </w:p>
+        </w:tc>
+        <w:tc>
+          <w:tcPr>
+            <w:tcW w:type="dxa" w:w="5411"/>
+          </w:tcPr>
+          <w:p>
+            <w:r/>
+            <w:r>
+              <w:rPr>
+                <w:sz w:val="18"/>
+              </w:rPr>
+              <w:t xml:space="preserve">Dataset, path, size and SHA-256 of every file in the three raw-data folders: TUAB's 2,993 EDFs; NMT's 2,417 EDFs and its label file; the stroke folder's 90 files (27 BrainVision recordings plus the archive's other files and our download script and log) (code/act0_raw_hashes.py)</w:t>
             </w:r>
           </w:p>
         </w:tc>
@@ -25762,7 +25809,7 @@
               <w:rPr>
                 <w:sz w:val="18"/>
               </w:rPr>
-              <w:t xml:space="preserve">Repeated pre-training runs for Experiments 6 and 8</w:t>
+              <w:t xml:space="preserve">Repeated pre-training runs for Experiment 6's joint NMT+TUAB encoders and for Experiment 8</w:t>
             </w:r>
           </w:p>
         </w:tc>
@@ -25776,7 +25823,7 @@
               <w:rPr>
                 <w:sz w:val="18"/>
               </w:rPr>
-              <w:t xml:space="preserve">One joint NMT+TUAB pre-training run takes about 78 minutes of GPU time (§8.1); the repeats we could afford went to Experiment 5. Experiment 8 uses Experiment 5's original fold encoders, and the two re-runs were not carried over to the stroke cohort.</w:t>
+              <w:t xml:space="preserve">One joint NMT+TUAB pre-training run takes about 78 minutes of GPU time (§8.1). Experiment 8 uses Experiment 5's original fold encoders; the two re-runs were not carried over to the stroke cohort.</w:t>
             </w:r>
           </w:p>
         </w:tc>
@@ -25790,7 +25837,7 @@
               <w:rPr>
                 <w:sz w:val="18"/>
               </w:rPr>
-              <w:t xml:space="preserve">Each rests on one pre-training run, compared with its random-init twin; Experiment 5 averages three runs (Table 20).</w:t>
+              <w:t xml:space="preserve">Experiment 6's zero-shot FEI gain is checked on Experiment 5's two seeded re-runs (§5.3.3); the joint encoders and Experiment 8 each rest on one pre-training run, compared with its random-init twin.</w:t>
             </w:r>
           </w:p>
         </w:tc>
@@ -25950,7 +25997,7 @@
               <w:rPr>
                 <w:sz w:val="18"/>
               </w:rPr>
-              <w:t xml:space="preserve">Per-file SHA-256 of the raw recordings</w:t>
+              <w:t xml:space="preserve">Saved embeddings (emb_*.npz, about 446 MB)</w:t>
             </w:r>
           </w:p>
         </w:tc>
@@ -25964,7 +26011,7 @@
               <w:rPr>
                 <w:sz w:val="18"/>
               </w:rPr>
-              <w:t xml:space="preserve">Not computed. The recordings are not ours to redistribute, so the manifests identify them by recording ID.</w:t>
+              <w:t xml:space="preserve">Too large for the repository; each is a forward pass of a published checkpoint or of a seeded random-init twin.</w:t>
             </w:r>
           </w:p>
         </w:tc>
@@ -25978,7 +26025,7 @@
               <w:rPr>
                 <w:sz w:val="18"/>
               </w:rPr>
-              <w:t xml:space="preserve">Fold, subset and cohort membership by recording ID (Table 21) and the script behind each input (Table 4).</w:t>
+              <w:t xml:space="preserve">The repository holds the per-recording predictions (preds_*.npz, oof_*.npz, kf5_lpo_*.npz, 7.3 MB) behind every reported score, plus the checkpoints that regenerate the embeddings.</w:t>
             </w:r>
           </w:p>
         </w:tc>
@@ -25997,7 +26044,7 @@
               <w:rPr>
                 <w:sz w:val="18"/>
               </w:rPr>
-              <w:t xml:space="preserve">Saved embeddings (emb_*.npz, about 446 MB)</w:t>
+              <w:t xml:space="preserve">An equivalence test between FEI+GTJ and BSI on stroke (Experiment 8)</w:t>
             </w:r>
           </w:p>
         </w:tc>
@@ -26011,7 +26058,7 @@
               <w:rPr>
                 <w:sz w:val="18"/>
               </w:rPr>
-              <w:t xml:space="preserve">Too large for the repository; each is a forward pass of a published checkpoint or of a seeded random-init twin.</w:t>
+              <w:t xml:space="preserve">No equivalence margin was set in advance, and with 15 subjects the 95% CI of the difference (−0.240 to 0.280) is far wider than any useful margin.</w:t>
             </w:r>
           </w:p>
         </w:tc>
@@ -26025,7 +26072,54 @@
               <w:rPr>
                 <w:sz w:val="18"/>
               </w:rPr>
-              <w:t xml:space="preserve">The repository holds the per-recording predictions (preds_*.npz, oof_*.npz, kf5_lpo_*.npz, 7.3 MB) behind every reported score, plus the checkpoints that regenerate the embeddings.</w:t>
+              <w:t xml:space="preserve">The two are reported as not separable, not as equivalent.</w:t>
+            </w:r>
+          </w:p>
+        </w:tc>
+      </w:tr>
+      <w:tr>
+        <w:trPr>
+          <w:cantSplit/>
+        </w:trPr>
+        <w:tc>
+          <w:tcPr>
+            <w:tcW w:type="dxa" w:w="2300"/>
+          </w:tcPr>
+          <w:p>
+            <w:r/>
+            <w:r>
+              <w:rPr>
+                <w:sz w:val="18"/>
+              </w:rPr>
+              <w:t xml:space="preserve">The spectral-matching recipe, frozen, on a new stroke cohort (Experiment 8)</w:t>
+            </w:r>
+          </w:p>
+        </w:tc>
+        <w:tc>
+          <w:tcPr>
+            <w:tcW w:type="dxa" w:w="3400"/>
+          </w:tcPr>
+          <w:p>
+            <w:r/>
+            <w:r>
+              <w:rPr>
+                <w:sz w:val="18"/>
+              </w:rPr>
+              <w:t xml:space="preserve">We had no second stroke EEG cohort within the project.</w:t>
+            </w:r>
+          </w:p>
+        </w:tc>
+        <w:tc>
+          <w:tcPr>
+            <w:tcW w:type="dxa" w:w="3211"/>
+          </w:tcPr>
+          <w:p>
+            <w:r/>
+            <w:r>
+              <w:rPr>
+                <w:sz w:val="18"/>
+              </w:rPr>
+              <w:t xml:space="preserve">Experiment 8 is reported as a post-hoc repair on the cohort that prompted it; external validation is future work.</w:t>
             </w:r>
           </w:p>
         </w:tc>

</xml_diff>

<commit_message>
Act 0 report round 15b: second pass over the independent re-audit
Abstract pairs the original run (0.865) and the three-run mean (0.861) with their own statistics; "ties"/"matched"
wording replaced by "close to, not significantly different"; Experiment 6 adds the pooled runs x recordings bootstrap
(+0.052, 95% CI [0.016, 0.090], p = 0.003); within-fold averaging caveat in the main text; spectral matching called a
post-hoc repair tested only on its own cohort; Table 22 gains the DOI row; 7.2 cites commit 460f6d7.
</commit_message>
<xml_diff>
--- a/docs/Act0_Final_Report.docx
+++ b/docs/Act0_Final_Report.docx
@@ -6821,7 +6821,7 @@
         <w:rPr>
           <w:b w:val="0"/>
         </w:rPr>
-        <w:t>: on two completely different datasets, almost every recording we fed in came out as nearly the same output vector, so a classifier built on top of it does no better than one built on random, untrained weights. The collapse is not explained by any preprocessing variation we tested and appears to be a property of the released weights. We matched the paper's own pipeline file-for-file (43 of 48 files byte-identical to the authors' public repository) and still could not reach their reported accuracy.</w:t>
+        <w:t>: on two completely different datasets, almost every recording we fed in came out as nearly the same output vector, so a classifier built on top of it does no better than one built on random, untrained weights. The collapse is not explained by any preprocessing variation we tested and appears to be a property of the released weights. We followed the paper's own pipeline as closely as its text and code allow (43 of 48 files byte-identical to the authors' public repository) and still could not reach their reported accuracy.</w:t>
       </w:r>
     </w:p>
     <w:p>
@@ -6853,7 +6853,7 @@
         <w:rPr>
           <w:b w:val="0"/>
         </w:rPr>
-        <w:t xml:space="preserve"> (GRU-based Time-JEPA), a spectrogram encoder pre-trained by predicting the future course of a recording's spectrum from its past. Fused together (FEI+GTJ), this reaches an AUROC of </w:t>
+        <w:t xml:space="preserve"> (GRU-based Time-JEPA), a spectrogram encoder pre-trained by predicting the future course of a recording's spectrum from its past. Fused together (FEI+GTJ), our original pre-training run reaches an AUROC of </w:t>
       </w:r>
       <w:r>
         <w:rPr>
@@ -6865,7 +6865,7 @@
         <w:rPr>
           <w:b w:val="0"/>
         </w:rPr>
-        <w:t xml:space="preserve"> on five-fold cross-validation on the NMT dataset (2,417 recordings), ahead of a classical hand-crafted band-power baseline scored on the identical folds (0.786 ± 0.009; better in all 5 folds, Holm-corrected p = 0.029). An untrained twin of the same fused architecture already reaches 0.834, though, so most of that margin comes from the architecture. Averaged over this run and two independently seeded re-runs, the fused model scores 0.861, so pre-training adds +0.027 AUROC over that twin, better in all 5 folds but not statistically significant after correction. On a completely different hospital's data (TUAB), FEI pre-trained on NMT alone, with no TUAB data at all, scored +0.059 AUROC above a random-weight twin (p = 0.002); two independently seeded re-runs of that pre-training gave +0.046 and +0.052 (p = 0.007 and 0.004). GTJ did not survive that zero-shot shift (0.840 vs 0.863 for its random twin), so we also re-pre-trained both encoders on NMT plus TUAB's unlabelled training recordings: the fused model then tied the released ViT-M checkpoint under our linear probe (0.862 vs 0.838, not significant) and beat band power (0.757), but did no better than its own random-weight twin (0.861). We then took the NMT-only encoders to a third, unrelated task: telling stroke patients apart from healthy controls in a small resting-state EEG cohort. There, after a spectrum-matching step we designed post hoc on this same cohort (the input fixed in advance gave 0.833), FEI+GTJ scored close to the clinical Brain Symmetry Index (BSI) baseline (0.926 vs 0.907 AUROC, leave-one-subject-out: a model is validated on one subject it never saw any data from, repeated once per subject). With 15 subjects that difference is far too uncertain to show either superiority or equivalence.</w:t>
+        <w:t xml:space="preserve"> on five-fold cross-validation on the NMT dataset (2,417 recordings). Averaged over that run and two independently seeded re-runs it scores 0.861, ahead of a classical hand-crafted band-power baseline scored on the identical folds (0.786 ± 0.009; better in all 5 folds, Holm-corrected p = 0.029). An untrained twin of the same fused architecture, averaged over five random seeds, already reaches 0.834, though, so most of that margin comes from the architecture: pre-training adds +0.027 AUROC (0.861 against 0.834), better in all 5 folds but not statistically significant after correction. On a completely different hospital's data (TUAB), FEI pre-trained on NMT alone, with no TUAB data at all, scored +0.059 AUROC above a random-weight twin (p = 0.002); two independently seeded re-runs of that pre-training gave +0.046 and +0.052 (p = 0.007 and 0.004). GTJ did not survive that zero-shot shift (0.840 vs 0.863 for its random twin), so we also re-pre-trained both encoders on NMT plus TUAB's unlabelled training recordings: the fused model then scored close to the released ViT-M checkpoint under our linear probe (0.862 vs 0.838, difference not significant) and beat band power (0.757), but did no better than its own random-weight twin (0.861). We then took the NMT-only encoders to a third, unrelated task: telling stroke patients apart from healthy controls in a small resting-state EEG cohort. There, after a spectrum-matching step we designed post hoc on this same cohort (the input fixed in advance gave 0.833), FEI+GTJ scored close to the clinical Brain Symmetry Index (BSI) baseline (0.926 vs 0.907 AUROC, leave-one-subject-out: a model is validated on one subject it never saw any data from, repeated once per subject). With 15 subjects that difference is far too uncertain to show either superiority or equivalence.</w:t>
       </w:r>
     </w:p>
     <w:p>
@@ -6885,7 +6885,7 @@
         <w:rPr>
           <w:b w:val="0"/>
         </w:rPr>
-        <w:t>: the same architecture, untrained weights, same pipeline (one disclosed exception: the released ViT-B in Experiment 1). That habit is what caught the released model's collapse in the first place, and what later caught our own GTJ quietly collapsing under a spectrum shift between datasets, which we then fixed with a label-free spectral-matching step. FEI over-flags healthy children; GTJ is fragile under distribution shift. Those findings limit where either encoder can be trusted.</w:t>
+        <w:t>: the same architecture, untrained weights, same pipeline (one disclosed exception: the released ViT-B in Experiment 1). That habit is what caught the released model's collapse in the first place, and what later caught our own GTJ quietly collapsing under a spectrum shift between datasets, which we then repaired, post hoc and on that same cohort, with a label-free spectral-matching step. FEI over-flags healthy children; GTJ is fragile under distribution shift. Those findings limit where either encoder can be trusted.</w:t>
       </w:r>
     </w:p>
     <w:p>
@@ -12934,7 +12934,7 @@
         <w:rPr>
           <w:b w:val="0"/>
         </w:rPr>
-        <w:t>GTJ later collapsed on a different dataset because its BatchNorm layers carried NMT's input statistics across domains. We diagnosed that failure and corrected it without labels. The fix may generalise to other EEG self-supervised encoders that normalise their input the same way.</w:t>
+        <w:t>GTJ later collapsed on a different dataset because its BatchNorm layers carried NMT's input statistics across domains. We diagnosed that failure and corrected it without labels. The fix may generalise to other EEG self-supervised encoders that normalise their input the same way, but we have tested it only on the cohort it was designed on.</w:t>
       </w:r>
     </w:p>
     <w:p>
@@ -12980,7 +12980,7 @@
         <w:rPr>
           <w:b w:val="0"/>
         </w:rPr>
-        <w:t>Every model here is intentionally small (1.15M parameters for FEI and 1.88M for GTJ, counting both the online and the EMA target copy; Tables 1–2) and trained for tens, not hundreds, of epochs on a single consumer GPU, rather than the institutional clusters that CBraMod and LaBraM pre-train on. Partly this was just what hardware we had. But it's also a real result: a model sized to match its dataset, instead of scaled up regardless of how much data is available, already beats a classical baseline and, with TUAB's unlabelled recordings added to pre-training, ties a released large-scale checkpoint under the same linear probe on TUAB. Every run is also gated by a thermal guard (§5.4) that pauses or aborts a job if CPU temperature crosses a safe threshold, which caps energy draw as a side effect.</w:t>
+        <w:t>Every model here is intentionally small (1.15M parameters for FEI and 1.88M for GTJ, counting both the online and the EMA target copy; Tables 1–2) and trained for tens, not hundreds, of epochs on a single consumer GPU, rather than the institutional clusters that CBraMod and LaBraM pre-train on. Partly this was just what hardware we had. But it's also a real result: a model sized to match its dataset, instead of scaled up regardless of how much data is available, already beats a classical baseline and, with TUAB's unlabelled recordings added to pre-training, scores close to a released large-scale checkpoint under the same linear probe on TUAB (0.862 vs 0.838, not significantly different). Every run is also gated by a thermal guard (§5.4) that pauses or aborts a job if CPU temperature crosses a safe threshold, which caps energy draw as a side effect.</w:t>
       </w:r>
     </w:p>
     <w:p>
@@ -16697,7 +16697,7 @@
         <w:rPr>
           <w:b w:val="0"/>
         </w:rPr>
-        <w:t>Fusion beats FEI alone and GTJ alone in every one of the five folds, a strong sign that the two branches pick up different aspects of the signal. The five training sets overlap (any two share three quarters of their recordings), so an ordinary paired t-test over folds understates the variance; every p-value in this experiment is therefore the Nadeau–Bengio corrected resampled t-test [20], Holm-adjusted [21] over the eleven comparisons of Table 20 (Appendix §11.3). The pre-trained arms there are averaged over three independent pre-training runs, the original plus two re-runs with new seeds (code/act0_nmt_pretrain_replicate.py), whose fused means were 0.865, 0.865 and 0.852. On those means fusion is ahead of FEI by +0.041 (p = 0.027) and of GTJ by +0.030 (p = 0.012 before Holm, 0.082 after). Against band power on the same folds, the fused model is ahead by +0.075 AUROC (all 5 folds, p = 0.029) and GTJ by +0.045 (all 5 folds, p = 0.027); FEI's +0.034 (4 of 5 folds) is not significant (p = 0.45). The random-init twins change how that margin should be read. An untrained fused encoder already reaches 0.834 ± 0.007, itself ahead of band power by +0.048 (all 5 folds, p = 0.026), so most of the fused model's advantage comes from its architecture and input representation. Pre-training adds +0.027 on top (three-run mean 0.861 against 0.834), better in all 5 folds but not significant once corrected (p = 0.15 before Holm, 0.45 after); the gain is +0.036 for GTJ (all 5 folds, p = 0.019 before Holm, 0.12 after) and only +0.010 for FEI (3 of 5 folds). This band-power arm is the same relative-band-power feature as Table 10's, recomputed on NMT's own 200 Hz input with its bands running from 0.5 to 45 Hz (code/baseline_bandpower.py).</w:t>
+        <w:t>Fusion beats FEI alone and GTJ alone in every one of the five folds, a strong sign that the two branches pick up different aspects of the signal. The five training sets overlap (any two share three quarters of their recordings), so an ordinary paired t-test over folds understates the variance; every p-value in this experiment is therefore the Nadeau–Bengio corrected resampled t-test [20], Holm-adjusted [21] over the eleven comparisons of Table 20 (Appendix §11.3). The pre-trained arms there are averaged over three independent pre-training runs, the original plus two re-runs with new seeds (code/act0_nmt_pretrain_replicate.py), whose fused means were 0.865, 0.865 and 0.852; the runs are averaged within each fold before testing, so run-to-run variation is folded into the fold means rather than modelled separately. On those means fusion is ahead of FEI by +0.041 (p = 0.027) and of GTJ by +0.030 (p = 0.012 before Holm, 0.082 after). Against band power on the same folds, the fused model is ahead by +0.075 AUROC (all 5 folds, p = 0.029) and GTJ by +0.045 (all 5 folds, p = 0.027); FEI's +0.034 (4 of 5 folds) is not significant (p = 0.45). The random-init twins change how that margin should be read. An untrained fused encoder already reaches 0.834 ± 0.007, itself ahead of band power by +0.048 (all 5 folds, p = 0.026), so most of the fused model's advantage comes from its architecture and input representation. Pre-training adds +0.027 on top (three-run mean 0.861 against 0.834), better in all 5 folds but not significant once corrected (p = 0.15 before Holm, 0.45 after); the gain is +0.036 for GTJ (all 5 folds, p = 0.019 before Holm, 0.12 after) and only +0.010 for FEI (3 of 5 folds). This band-power arm is the same relative-band-power feature as Table 10's, recomputed on NMT's own 200 Hz input with its bands running from 0.5 to 45 Hz (code/baseline_bandpower.py).</w:t>
       </w:r>
     </w:p>
     <w:p>
@@ -18197,7 +18197,7 @@
         <w:rPr>
           <w:b w:val="0"/>
         </w:rPr>
-        <w:t>Adapted, FEI+GTJ ties the released ViT-M and clearly beats band power (0.862 vs. 0.838 vs. 0.757 on the full training set), though the gap between FEI+GTJ and ViT-M, +0.024, isn't statistically significant (p = 0.147). Zero-shot, the fused model reaches 0.857 on the full training set (0.821 ± 0.006 over the five subsets), so most of the adapted model's score does not depend on seeing TUAB during pre-training.</w:t>
+        <w:t>Adapted, FEI+GTJ scores above the released ViT-M and clearly beats band power (0.862 vs. 0.838 vs. 0.757 on the full training set), though the gap between FEI+GTJ and ViT-M, +0.024, isn't statistically significant (p = 0.147). Zero-shot, the fused model reaches 0.857 on the full training set (0.821 ± 0.006 over the five subsets), so most of the adapted model's score does not depend on seeing TUAB during pre-training.</w:t>
       </w:r>
     </w:p>
     <w:p>
@@ -18205,7 +18205,7 @@
         <w:rPr>
           <w:b w:val="0"/>
         </w:rPr>
-        <w:t>FEI's zero-shot pre-training gain, though, is statistically significant on its own: FEI beats its random-init twin by +0.059 AUROC (95% CI [0.019, 0.097], p = 0.002): so what FEI learned on NMT alone carries information about abnormal EEG on TUAB that its architecture by itself does not supply (one dataset pair). That p-value resamples the 276 test recordings for one set of trained encoders (five, one per NMT training fold, ensembled), so it says nothing about how the gain varies between pre-training runs. We therefore scored Experiment 5's two seeded re-runs on TUAB the same way (code/tuab_fei_reps.py), against the same random-init twins: +0.046 (95% CI [0.011, 0.083], p = 0.007) and +0.052 (95% CI [0.016, 0.090], p = 0.004). Of the 15 individual fold encoders across the three runs, 14 score above the random-init ensemble (0.813) and 15 above the best single random-init encoder (0.809). The same script gives the original run's +0.059 again.</w:t>
+        <w:t>FEI's zero-shot pre-training gain, though, is statistically significant on its own: FEI beats its random-init twin by +0.059 AUROC (95% CI [0.019, 0.097], p = 0.002): so what FEI learned on NMT alone carries information about abnormal EEG on TUAB that its architecture by itself does not supply (one dataset pair). That p-value resamples the 276 test recordings for one set of trained encoders (five, one per NMT training fold, ensembled), so it says nothing about how the gain varies between pre-training runs. We therefore scored Experiment 5's two seeded re-runs on TUAB the same way (code/tuab_fei_reps.py), against the same random-init twins: +0.046 (95% CI [0.011, 0.083], p = 0.007) and +0.052 (95% CI [0.016, 0.090], p = 0.004). Of the 15 individual fold encoders across the three runs, 14 score above the random-init ensemble (0.813) and 15 above the best single random-init encoder (0.809). The same script gives the original run's +0.059 again. Resampling the three pre-training runs and the test recordings together, so that both sources of uncertainty enter one interval, gives a mean gain of +0.052 (95% CI [0.016, 0.090], p = 0.003), close to the second re-run's figures because that run sits near the three-run mean; with only three runs to resample, the between-run part of that interval is itself rough.</w:t>
       </w:r>
     </w:p>
     <w:p>
@@ -20194,7 +20194,7 @@
         <w:rPr>
           <w:b w:val="0"/>
         </w:rPr>
-        <w:t>FEI+GTJ reaches 0.926 LOSO AUROC against BSI's 0.907 (Δ = +0.019, 95% CI [−0.240, 0.280], p = 0.523): a similar point estimate, not significantly different either way under every cross-validation scheme we tried. We set no equivalence margin in advance, and an interval this wide cannot show equivalence either, so the cohort is simply too small to rank the two. At the default 0.5 threshold, FEI+GTJ, BSI alone, and FEI+GTJ+BSI combined all land on the identical confusion matrix — 8 of 9 stroke cases and all 6 controls called correctly, one stroke case missed (Acc 0.933, BAcc 0.944, F1 0.941, Sens 0.889, Spec 1.000) — differing only in AUROC, i.e. in how confidently each ranks that one missed case; the random-init twin is very slightly worse at this same threshold (one extra false positive: Acc 0.867, BAcc 0.861, F1 0.889, Spec 0.833). It does not show a significant advantage from pre-training as a whole on this task: FEI+GTJ vs. its own random-init twin is −0.019 LOSO AUROC (p = 0.826), a tie. Splitting this by branch (exploratory, single-arm, not pre-registered) shows the same pattern as TUAB: FEI's pre-training clears its random twin in 100% of repeated 5-fold splits; GTJ's does not, only 16% of repeats. The single, deterministic LOSO split (every subject held out exactly once, so there is no fold-assignment randomness to repeat here) tells a more dramatic version of the same branch story: FEI alone reaches a perfect 1.000 LOSO AUROC — a threshold exists with zero errors, 9/9 stroke and 6/6 control — against GTJ alone's 0.833 and the random-init twins' 0.907 (FEI) / 0.852 (GTJ). A perfect score on 15 subjects is still fragile, since one atypically-recorded subject could flip it, which is why the repeated, randomized 5-fold win-rate above, not this single point estimate, is the statistic we'd stand behind. FEI+GTJ combined with BSI (0.963 LOSO) numerically beats BSI alone in 82% of repeated splits — promising, but not statistically significant at 15 subjects. With the spectral-matching filter refitted inside each fold instead (Table 19), FEI+GTJ stays at 0.926 and FEI+GTJ+BSI drops to 0.944, the same as its random-init twin.</w:t>
+        <w:t>FEI+GTJ reaches 0.926 LOSO AUROC against BSI's 0.907 (Δ = +0.019, 95% CI [−0.240, 0.280], p = 0.523): a similar point estimate, not significantly different either way under every cross-validation scheme we tried. We set no equivalence margin in advance, and an interval this wide cannot show equivalence either, so the cohort is simply too small to rank the two. At the default 0.5 threshold, FEI+GTJ, BSI alone, and FEI+GTJ+BSI combined all land on the identical confusion matrix — 8 of 9 stroke cases and all 6 controls called correctly, one stroke case missed (Acc 0.933, BAcc 0.944, F1 0.941, Sens 0.889, Spec 1.000) — differing only in AUROC, i.e. in how confidently each ranks that one missed case; the random-init twin is very slightly worse at this same threshold (one extra false positive: Acc 0.867, BAcc 0.861, F1 0.889, Spec 0.833). It does not show a significant advantage from pre-training as a whole on this task: FEI+GTJ vs. its own random-init twin is −0.019 LOSO AUROC (p = 0.826), not a significant difference in either direction. Splitting this by branch (exploratory, single-arm, not pre-registered) shows the same pattern as TUAB: FEI's pre-training clears its random twin in 100% of repeated 5-fold splits; GTJ's does not, only 16% of repeats. The single, deterministic LOSO split (every subject held out exactly once, so there is no fold-assignment randomness to repeat here) tells a more dramatic version of the same branch story: FEI alone reaches a perfect 1.000 LOSO AUROC — a threshold exists with zero errors, 9/9 stroke and 6/6 control — against GTJ alone's 0.833 and the random-init twins' 0.907 (FEI) / 0.852 (GTJ). A perfect score on 15 subjects is still fragile, since one atypically-recorded subject could flip it, which is why the repeated, randomized 5-fold win-rate above, not this single point estimate, is the statistic we'd stand behind. FEI+GTJ combined with BSI (0.963 LOSO) numerically beats BSI alone in 82% of repeated splits — promising, but not statistically significant at 15 subjects. With the spectral-matching filter refitted inside each fold instead (Table 19), FEI+GTJ stays at 0.926 and FEI+GTJ+BSI drops to 0.944, the same as its random-init twin.</w:t>
       </w:r>
     </w:p>
     <w:p>
@@ -20221,7 +20221,7 @@
         <w:rPr>
           <w:b w:val="0"/>
         </w:rPr>
-        <w:t>The released EEG-VJEPA checkpoints don't reproduce the paper's own result, because they're collapsed (Experiments 1–3). No amount of fine-tuning under the authors' own recipe fixes that (Experiment 2), and the simplest possible probe can't rescue it either (Experiment 4). FEI+GTJ, built in response, beats a classical baseline on the data it was trained on, although an untrained twin already accounts for about two-thirds of that margin (Experiment 5); on a different hospital's data, FEI's NMT-only pre-training still gives a significant gain, in all three pre-training runs, and the fused model, re-pre-trained with that hospital's unlabelled recordings, ties the released checkpoint and stays ahead of a classical baseline (Experiment 6), and, after a post-hoc input fix, scores close to a strong clinical baseline on a third, structurally different task, too close for 15 subjects to separate (Experiments 7–8). A t-SNE/UMAP visual check, matching our original proposal's promised deliverable, shows that 2-D unsupervised layout is the wrong tool for seeing why any of these encoders work, or why the released one doesn't.</w:t>
+        <w:t>The released EEG-VJEPA checkpoints don't reproduce the paper's own result, because they're collapsed (Experiments 1–3). No amount of fine-tuning under the authors' own recipe fixes that (Experiment 2), and the simplest possible probe can't rescue it either (Experiment 4). FEI+GTJ, built in response, beats a classical baseline on the data it was trained on, although an untrained twin already accounts for about two-thirds of that margin (Experiment 5); on a different hospital's data, FEI's NMT-only pre-training still gives a significant gain, in all three pre-training runs, and the fused model, re-pre-trained with that hospital's unlabelled recordings, scores close to the released checkpoint (difference not significant) and stays ahead of a classical baseline (Experiment 6), and, after a post-hoc input fix, scores close to a strong clinical baseline on a third, structurally different task, too close for 15 subjects to separate (Experiments 7–8). A t-SNE/UMAP visual check, matching our original proposal's promised deliverable, shows that 2-D unsupervised layout is the wrong tool for seeing why any of these encoders work, or why the released one doesn't.</w:t>
       </w:r>
     </w:p>
     <w:p>
@@ -20406,7 +20406,7 @@
         <w:rPr>
           <w:b w:val="0"/>
         </w:rPr>
-        <w:t>The released EEG-VJEPA checkpoints are collapsed and fail to reproduce the paper; our token-spread diagnostic is repeatable, and the released training config gives a likely cause. FEI+GTJ beats our classical baseline on NMT, with pre-training adding a consistent but not significant +0.027 AUROC over an untrained twin (three-run mean 0.861 vs 0.834); on stroke, after a post-hoc input fix, its AUROC is close to BSI's, with far too few subjects to call them equivalent. Across hospitals, FEI's NMT-only pre-training still gives a significant gain, in all three pre-training runs; the fused model, re-pre-trained with TUAB's unlabelled recordings, ties the released ViT-M there, with no significant advantage. On stroke only FEI shows a pre-training gain, and no model here significantly beats BSI. Table 16 compares these outcomes with the original proposal.</w:t>
+        <w:t>The released EEG-VJEPA checkpoints are collapsed and fail to reproduce the paper; our token-spread diagnostic is repeatable, and the released training config gives a likely cause. FEI+GTJ beats our classical baseline on NMT, with pre-training adding a consistent but not significant +0.027 AUROC over an untrained twin (three-run mean 0.861 vs 0.834); on stroke, after a post-hoc input fix, its AUROC is close to BSI's, with far too few subjects to call them equivalent. Across hospitals, FEI's NMT-only pre-training still gives a significant gain, in all three pre-training runs; the fused model, re-pre-trained with TUAB's unlabelled recordings, scores close to the released ViT-M there, with no significant difference. On stroke only FEI shows a pre-training gain, and no model here significantly beats BSI. Table 16 compares these outcomes with the original proposal.</w:t>
       </w:r>
     </w:p>
     <w:p>
@@ -20679,7 +20679,7 @@
               <w:rPr>
                 <w:sz w:val="18"/>
               </w:rPr>
-              <w:t>0.865 ± 0.024 on NMT vs. band power 0.786 and untrained twin 0.834 (three-run mean 0.861: pre-training +0.027, not significant); on TUAB, FEI's NMT-only pre-training +0.059 (p = 0.002; +0.046 and +0.052 in two re-runs); fused, with TUAB's unlabelled recordings added, ties released ViT-M and beats band power (Exp. 5–6)</w:t>
+              <w:t>original run 0.865 ± 0.024 on NMT (three-run mean 0.861) vs. band power 0.786 and untrained twin 0.834 (pre-training +0.027, not significant); on TUAB, FEI's NMT-only pre-training +0.059 (p = 0.002; +0.046 and +0.052 in two re-runs); fused, with TUAB's unlabelled recordings added, close to released ViT-M (not significant) and beats band power (Exp. 5–6)</w:t>
             </w:r>
           </w:p>
         </w:tc>
@@ -21048,7 +21048,7 @@
         <w:rPr>
           <w:b w:val="0"/>
         </w:rPr>
-        <w:t>Small models and thermal-guarded, single-GPU training also limit compute demand (§5.2.2). CBraMod and LaBraM [5, 6] pre-train on tens of thousands of hours, while our two encoders have 1.15M (FEI) and 1.88M (GTJ) parameters, online and target copies included (Tables 1–2), and were trained for 60 epochs on a few thousand recordings. It still clears a classical baseline and, once TUAB's unlabelled recordings are added to pre-training, ties a released large-scale checkpoint's linear-probe score on TUAB. If that holds more broadly, EEG models could be sized to the data available in a clinical setting, often small and expensive to collect, instead of defaulting to the biggest architecture on the shelf.</w:t>
+        <w:t>Small models and thermal-guarded, single-GPU training also limit compute demand (§5.2.2). CBraMod and LaBraM [5, 6] pre-train on tens of thousands of hours, while our two encoders have 1.15M (FEI) and 1.88M (GTJ) parameters, online and target copies included (Tables 1–2), and were trained for 60 epochs on a few thousand recordings. It still clears a classical baseline and, once TUAB's unlabelled recordings are added to pre-training, scores close to a released large-scale checkpoint's linear-probe score on TUAB, with no significant difference. If that holds more broadly, EEG models could be sized to the data available in a clinical setting, often small and expensive to collect, instead of defaulting to the biggest architecture on the shelf.</w:t>
       </w:r>
     </w:p>
     <w:p>
@@ -22015,7 +22015,7 @@
         <w:rPr>
           <w:b w:val="0"/>
         </w:rPr>
-        <w:t>All code, saved model checkpoints, and saved per-recording predictions used to produce every number, table, and figure in this report are organized as a set of scripts, one per experiment (Table 5). Table 4 gives the script behind each experiment's input. The 200 Hz NMT copy that FEI and GTJ read (per-channel z-scored at NMT's native rate, stored as 2.5-second frames) was first written in August 2026 by a script that was not kept; we reconstructed its recipe as code/preprocess_nmt_200hz.py, which reproduces all 2,417 stored files byte for byte. From those inputs, pre-train an encoder (`fei_pretrain.py` or `fei_branchC.py`, both with a `--selftest` flag for a fast sanity check with no real data and a `--cv` flag for the full five-fold cross-validation reported here), score it with `feic_nmt_anchor.py` (Experiment 5) or `tuab_feic.py` (Experiment 6), and evaluate a frozen or fine-tuned released checkpoint with the corresponding `tuab_*_eval.py` script. Every long-running script checkpoints its progress after each cross-validation fold and can be safely re-run to resume after an interruption, and each accepts command-line flags for every experiment variant reported here. The code is in github.com/mashfiqurrahman2020-coder/EEG-VJEPA-act-0; its docs/act0_repro/ folder holds the fold, subset and cohort lists, the SHA-256 of every checkpoint and result file, and the pinned environment (Appendix §11). The code, checkpoints and results behind this report are commit 14143a8d1a2911322dfe237b90506681506383fc, which unlike a tag cannot be moved: git clone https://github.com/mashfiqurrahman2020-coder/EEG-VJEPA-act-0.git, then git checkout 14143a8d1a29, then pip install -r docs/act0_repro/requirements-act0.txt under Python 3.9. Appendix §11.6 gives the pre-training commands and §11.9 the data each experiment uses. The report itself is added one commit later, under the tag act0-report-round15. All 40 FEI/GTJ checkpoints are committed in the repository (code/*.pt, about 110 MB), so nothing needs a separate download except the data and the released EEG-VJEPA weights. Two kinds of reproduction follow. The saved checkpoints and predictions reproduce every reported number exactly. Re-training does not: the original FEI and GTJ runs set no random seed, so they cannot be regenerated bit for bit, and cuDNN kernels were left non-deterministic, so even the seeded re-runs should be expected to reproduce the results statistically, not bit for bit.</w:t>
+        <w:t>All code, saved model checkpoints, and saved per-recording predictions used to produce every number, table, and figure in this report are organized as a set of scripts, one per experiment (Table 5). Table 4 gives the script behind each experiment's input. The 200 Hz NMT copy that FEI and GTJ read (per-channel z-scored at NMT's native rate, stored as 2.5-second frames) was first written in August 2026 by a script that was not kept; we reconstructed its recipe as code/preprocess_nmt_200hz.py, which reproduces all 2,417 stored files byte for byte. From those inputs, pre-train an encoder (`fei_pretrain.py` or `fei_branchC.py`, both with a `--selftest` flag for a fast sanity check with no real data and a `--cv` flag for the full five-fold cross-validation reported here), score it with `feic_nmt_anchor.py` (Experiment 5) or `tuab_feic.py` (Experiment 6), and evaluate a frozen or fine-tuned released checkpoint with the corresponding `tuab_*_eval.py` script. Every long-running script checkpoints its progress after each cross-validation fold and can be safely re-run to resume after an interruption, and each accepts command-line flags for every experiment variant reported here. The code is in github.com/mashfiqurrahman2020-coder/EEG-VJEPA-act-0; its docs/act0_repro/ folder holds the fold, subset and cohort lists, the SHA-256 of every checkpoint and result file, and the pinned environment (Appendix §11). The code, checkpoints and results behind this report are commit e0d6d64ab57f0da9dd32e807a36be5a23fa5a808, which unlike a tag cannot be moved: git clone https://github.com/mashfiqurrahman2020-coder/EEG-VJEPA-act-0.git, then git checkout e0d6d64ab57f, then pip install -r docs/act0_repro/requirements-act0.txt under Python 3.9. Appendix §11.6 gives the pre-training commands and §11.9 the data each experiment uses. The report itself is added one commit later, under the tag act0-report-round15b. All 40 FEI/GTJ checkpoints are committed in the repository (code/*.pt, about 110 MB), so nothing needs a separate download except the data and the released EEG-VJEPA weights. Two kinds of reproduction follow. The saved checkpoints and predictions reproduce every reported number exactly. Re-training does not: the original FEI and GTJ runs set no random seed, so they cannot be regenerated bit for bit, and cuDNN kernels were left non-deterministic, so even the seeded re-runs should be expected to reproduce the results statistically, not bit for bit.</w:t>
       </w:r>
     </w:p>
     <w:p>
@@ -22127,7 +22127,7 @@
         <w:rPr>
           <w:b w:val="0"/>
         </w:rPr>
-        <w:t xml:space="preserve"> The spectrum-matching fix in Experiment 8 was built for the stroke cohort specifically; a dataset-agnostic version (replacing BatchNorm with per-recording normalisation, say) could let GTJ transfer the way FEI already does. The same work should cover GTJ's confidently-wrong errors (§5.3.4) too: a calibration step, such as temperature scaling fit on a held-out fold, before its output is read as a probability rather than a ranking.</w:t>
+        <w:t xml:space="preserve"> The spectrum-matching fix in Experiment 8 was built for the stroke cohort specifically; a dataset-agnostic version (replacing BatchNorm with per-recording normalisation, say) could let GTJ transfer the way FEI already does. The same work should cover GTJ's confidently-wrong errors (§5.3.4) too: a calibration step, such as temperature scaling fit on a held-out fold, before its output is read as a probability rather than a ranking. Before any of that, the spectral-matching recipe should be frozen and applied unchanged to a new stroke cohort: Experiment 8 only shows it repairing the cohort it was designed on.</w:t>
       </w:r>
     </w:p>
     <w:p/>
@@ -26120,6 +26120,53 @@
                 <w:sz w:val="18"/>
               </w:rPr>
               <w:t xml:space="preserve">Experiment 8 is reported as a post-hoc repair on the cohort that prompted it; external validation is future work.</w:t>
+            </w:r>
+          </w:p>
+        </w:tc>
+      </w:tr>
+      <w:tr>
+        <w:trPr>
+          <w:cantSplit/>
+        </w:trPr>
+        <w:tc>
+          <w:tcPr>
+            <w:tcW w:type="dxa" w:w="2300"/>
+          </w:tcPr>
+          <w:p>
+            <w:r/>
+            <w:r>
+              <w:rPr>
+                <w:sz w:val="18"/>
+              </w:rPr>
+              <w:t xml:space="preserve">An archived release with a DOI</w:t>
+            </w:r>
+          </w:p>
+        </w:tc>
+        <w:tc>
+          <w:tcPr>
+            <w:tcW w:type="dxa" w:w="3400"/>
+          </w:tcPr>
+          <w:p>
+            <w:r/>
+            <w:r>
+              <w:rPr>
+                <w:sz w:val="18"/>
+              </w:rPr>
+              <w:t xml:space="preserve">The repository is private for now, and a DOI archive (Zenodo, for example) is public.</w:t>
+            </w:r>
+          </w:p>
+        </w:tc>
+        <w:tc>
+          <w:tcPr>
+            <w:tcW w:type="dxa" w:w="3211"/>
+          </w:tcPr>
+          <w:p>
+            <w:r/>
+            <w:r>
+              <w:rPr>
+                <w:sz w:val="18"/>
+              </w:rPr>
+              <w:t xml:space="preserve">§7.2 gives the full 40-character commit SHA, which fixes the exact code, checkpoints and results.</w:t>
             </w:r>
           </w:p>
         </w:tc>

</xml_diff>

<commit_message>
Act 0 report round 15c: final independent audit (multilevel bootstrap, NMT-only wording, re-runs, Tables 5/22-24)
Report cites code commit d9cfacc0d36a19d7233b3a80792764c6c3bec6d0; 57 pages.
</commit_message>
<xml_diff>
--- a/docs/Act0_Final_Report.docx
+++ b/docs/Act0_Final_Report.docx
@@ -6865,7 +6865,7 @@
         <w:rPr>
           <w:b w:val="0"/>
         </w:rPr>
-        <w:t xml:space="preserve"> on five-fold cross-validation on the NMT dataset (2,417 recordings). Averaged over that run and two independently seeded re-runs it scores 0.861, ahead of a classical hand-crafted band-power baseline scored on the identical folds (0.786 ± 0.009; better in all 5 folds, Holm-corrected p = 0.029). An untrained twin of the same fused architecture, averaged over five random seeds, already reaches 0.834, though, so most of that margin comes from the architecture: pre-training adds +0.027 AUROC (0.861 against 0.834), better in all 5 folds but not statistically significant after correction. On a completely different hospital's data (TUAB), FEI pre-trained on NMT alone, with no TUAB data at all, scored +0.059 AUROC above a random-weight twin (p = 0.002); two independently seeded re-runs of that pre-training gave +0.046 and +0.052 (p = 0.007 and 0.004). GTJ did not survive that zero-shot shift (0.840 vs 0.863 for its random twin), so we also re-pre-trained both encoders on NMT plus TUAB's unlabelled training recordings: the fused model then scored close to the released ViT-M checkpoint under our linear probe (0.862 vs 0.838, difference not significant) and beat band power (0.757), but did no better than its own random-weight twin (0.861). We then took the NMT-only encoders to a third, unrelated task: telling stroke patients apart from healthy controls in a small resting-state EEG cohort. There, after a spectrum-matching step we designed post hoc on this same cohort (the input fixed in advance gave 0.833), FEI+GTJ scored close to the clinical Brain Symmetry Index (BSI) baseline (0.926 vs 0.907 AUROC, leave-one-subject-out: a model is validated on one subject it never saw any data from, repeated once per subject). With 15 subjects that difference is far too uncertain to show either superiority or equivalence.</w:t>
+        <w:t xml:space="preserve"> on five-fold cross-validation on the NMT dataset (2,417 recordings). Averaged over that run and two independently seeded re-runs it scores 0.861, ahead of a classical hand-crafted band-power baseline scored on the identical folds (0.786 ± 0.009; better in all 5 folds, Holm-corrected p = 0.029). An untrained twin of the same fused architecture, averaged over five random seeds, already reaches 0.834, though, so most of that margin comes from the architecture: pre-training adds +0.027 AUROC (0.861 against 0.834), better in all 5 folds but not statistically significant after correction. On a completely different hospital's data (TUAB), FEI pre-trained on NMT alone, with no TUAB recording in its pre-training (only the linear classifier on top is trained on labelled TUAB data), scored above a random-weight twin by +0.048 (95% CI [0.015, 0.108], p = 0.0055) AUROC, averaged over five independently seeded pre-training runs scored on the same test set, with runs, random-init seeds and test recordings resampled together (the original run alone: +0.059, p = 0.002). GTJ did not survive that NMT-only transfer (0.840 vs 0.863 for its random twin), so we also re-pre-trained both encoders on NMT plus TUAB's unlabelled training recordings: the fused model then scored close to the released ViT-M checkpoint under our linear probe (0.862 vs 0.838, difference not significant) and beat band power (0.757), but did no better than its own random-weight twin (0.861), in any of three pre-training runs. We then took the NMT-only encoders to a third, unrelated task: telling stroke patients apart from healthy controls in a small resting-state EEG cohort. There, after a spectrum-matching step we designed post hoc on this same cohort (the input fixed in advance gave 0.833), FEI+GTJ scored close to the clinical Brain Symmetry Index (BSI) baseline (0.926 vs 0.907 AUROC, leave-one-subject-out: a model is validated on one subject it never saw any data from, repeated once per subject). With 15 subjects that difference is far too uncertain to show either superiority or equivalence. Two seeded re-runs of its NMT pre-training scored 0.963 and 0.981 on the same 15 subjects: a check on the pre-training seed, not a larger sample.</w:t>
       </w:r>
     </w:p>
     <w:p>
@@ -7008,7 +7008,7 @@
         <w:rPr>
           <w:b w:val="0"/>
         </w:rPr>
-        <w:t xml:space="preserve"> succeed, and the reason turned out to be diagnosable in its own right: the released checkpoints are collapsed. We used that as the starting point for the rest of the project (“Act 0”, in our own naming, since everything else the course builds on sits downstream of it): we designed our own pre-trained encoder, FEI+GTJ, validated it on the dataset it was trained on (NMT), tested it on TUAB, a different hospital's data, both zero-shot (pre-trained on NMT only) and after adding TUAB's unlabelled recordings to pre-training, and finally applied it to a third, out-of-domain task (separating stroke patients from healthy controls) where a well-established clinical baseline (the Brain Symmetry Index) let us check whether our features add anything over classical signal processing.</w:t>
+        <w:t xml:space="preserve"> succeed, and the reason turned out to be diagnosable in its own right: the released checkpoints are collapsed. We used that as the starting point for the rest of the project (“Act 0”, in our own naming, since everything else the course builds on sits downstream of it): we designed our own pre-trained encoder, FEI+GTJ, validated it on the dataset it was trained on (NMT), tested it on TUAB, a different hospital's data, both with encoders pre-trained on NMT only and after adding TUAB's unlabelled recordings to pre-training, and finally applied it to a third, out-of-domain task (separating stroke patients from healthy controls) where a well-established clinical baseline (the Brain Symmetry Index) let us check whether our features add anything over classical signal processing.</w:t>
       </w:r>
     </w:p>
     <w:p>
@@ -7550,7 +7550,7 @@
         <w:rPr>
           <w:b w:val="0"/>
         </w:rPr>
-        <w:t xml:space="preserve"> window, plus a small auxiliary term that predicts which bands were removed. Both prediction targets are L2-normalised before the loss is taken (a BYOL-style trick, equivalent to a bounded 2–2·cos(pred, target) loss), which is the single biggest lever against collapse: an un-normalised MSE loss lets the network cheat by shrinking its output scale to zero.</w:t>
+        <w:t xml:space="preserve"> window, plus a small auxiliary term that predicts which bands were removed. Both prediction targets are L2-normalised before the loss is taken (a BYOL-style trick, equivalent to a bounded 2–2·cos(pred, target) loss), which rules out one trivial solution: an un-normalised MSE loss would let the network cheat by shrinking its output scale to zero.</w:t>
       </w:r>
     </w:p>
     <w:p>
@@ -10411,7 +10411,7 @@
               <w:rPr>
                 <w:sz w:val="18"/>
               </w:rPr>
-              <w:t>USA (Temple University Hospital); 2,993 recordings (official 276-recording eval set used here)</w:t>
+              <w:t xml:space="preserve">USA (Temple University Hospital); 2,993 recordings (its 276-recording evaluation split used here)</w:t>
             </w:r>
           </w:p>
         </w:tc>
@@ -12318,7 +12318,7 @@
               <w:rPr>
                 <w:sz w:val="18"/>
               </w:rPr>
-              <w:t>Released ViT-M/ViT-B frozen + fine-tune evaluation on TUAB</w:t>
+              <w:t xml:space="preserve">Released ViT-M/ViT-B frozen evaluation on TUAB (Experiment 1)</w:t>
             </w:r>
           </w:p>
         </w:tc>
@@ -12337,7 +12337,7 @@
               <w:rPr>
                 <w:sz w:val="18"/>
               </w:rPr>
-              <w:t>tuab_collapse_check.py</w:t>
+              <w:t xml:space="preserve">tuab_finetune_fast.py</w:t>
             </w:r>
           </w:p>
         </w:tc>
@@ -12351,7 +12351,7 @@
               <w:rPr>
                 <w:sz w:val="18"/>
               </w:rPr>
-              <w:t>Token-std / cross-recording-cosine collapse diagnostics (Experiment 3)</w:t>
+              <w:t xml:space="preserve">ViT-M fine-tuned from the released weights and trained from scratch, with the authors' recipe (Experiment 2)</w:t>
             </w:r>
           </w:p>
         </w:tc>
@@ -12370,7 +12370,7 @@
               <w:rPr>
                 <w:sz w:val="18"/>
               </w:rPr>
-              <w:t>tuab_feic.py</w:t>
+              <w:t xml:space="preserve">tuab_vitm_linear.py</w:t>
             </w:r>
           </w:p>
         </w:tc>
@@ -12384,7 +12384,7 @@
               <w:rPr>
                 <w:sz w:val="18"/>
               </w:rPr>
-              <w:t>FEI+GTJ transfer evaluation on TUAB, with random-init controls (Experiment 6)</w:t>
+              <w:t xml:space="preserve">Linear probe on frozen released and random-init ViT-M (Experiment 4; the ViT-M row of Experiment 6)</w:t>
             </w:r>
           </w:p>
         </w:tc>
@@ -12403,7 +12403,7 @@
               <w:rPr>
                 <w:sz w:val="18"/>
               </w:rPr>
-              <w:t>stroke_phaseB.py / stroke_phaseB_cv.py</w:t>
+              <w:t>tuab_collapse_check.py</w:t>
             </w:r>
           </w:p>
         </w:tc>
@@ -12417,7 +12417,7 @@
               <w:rPr>
                 <w:sz w:val="18"/>
               </w:rPr>
-              <w:t>BSI baseline + LOSO / 5-fold×100 / leave-pair-out CV machinery</w:t>
+              <w:t>Token-std / cross-recording-cosine collapse diagnostics (Experiment 3)</w:t>
             </w:r>
           </w:p>
         </w:tc>
@@ -12436,7 +12436,7 @@
               <w:rPr>
                 <w:sz w:val="18"/>
               </w:rPr>
-              <w:t>stroke_phaseB_clean.py</w:t>
+              <w:t>tuab_feic.py</w:t>
             </w:r>
           </w:p>
         </w:tc>
@@ -12450,7 +12450,7 @@
               <w:rPr>
                 <w:sz w:val="18"/>
               </w:rPr>
-              <w:t>Spectrum-matching fix and its input/embedding health gates (Experiment 8)</w:t>
+              <w:t>FEI+GTJ transfer evaluation on TUAB, with random-init controls (Experiment 6)</w:t>
             </w:r>
           </w:p>
         </w:tc>
@@ -12469,7 +12469,7 @@
               <w:rPr>
                 <w:sz w:val="18"/>
               </w:rPr>
-              <w:t xml:space="preserve">stroke_phaseB_foldlocal.py</w:t>
+              <w:t xml:space="preserve">tuab_fei_reps.py</w:t>
             </w:r>
           </w:p>
         </w:tc>
@@ -12483,7 +12483,7 @@
               <w:rPr>
                 <w:sz w:val="18"/>
               </w:rPr>
-              <w:t xml:space="preserve">Stroke spectral-matching filter refitted inside each LOSO fold (Table 19)</w:t>
+              <w:t xml:space="preserve">FEI's NMT-only TUAB gain over five pre-training runs, two of them pre-trained here, with the multi-run bootstrap (Experiment 6)</w:t>
             </w:r>
           </w:p>
         </w:tc>
@@ -12502,6 +12502,171 @@
               <w:rPr>
                 <w:sz w:val="18"/>
               </w:rPr>
+              <w:t xml:space="preserve">tuab_feic_joint_reps.py</w:t>
+            </w:r>
+          </w:p>
+        </w:tc>
+        <w:tc>
+          <w:tcPr>
+            <w:tcW w:type="dxa" w:w="4455"/>
+          </w:tcPr>
+          <w:p>
+            <w:r/>
+            <w:r>
+              <w:rPr>
+                <w:sz w:val="18"/>
+              </w:rPr>
+              <w:t xml:space="preserve">Two seeded re-runs of Experiment 6's adapted (NMT+TUAB) FEI and GTJ pre-training, scored as in tuab_feic.py</w:t>
+            </w:r>
+          </w:p>
+        </w:tc>
+      </w:tr>
+      <w:tr>
+        <w:trPr>
+          <w:cantSplit/>
+        </w:trPr>
+        <w:tc>
+          <w:tcPr>
+            <w:tcW w:type="dxa" w:w="4455"/>
+          </w:tcPr>
+          <w:p>
+            <w:r/>
+            <w:r>
+              <w:rPr>
+                <w:sz w:val="18"/>
+              </w:rPr>
+              <w:t>stroke_phaseB.py / stroke_phaseB_cv.py</w:t>
+            </w:r>
+          </w:p>
+        </w:tc>
+        <w:tc>
+          <w:tcPr>
+            <w:tcW w:type="dxa" w:w="4455"/>
+          </w:tcPr>
+          <w:p>
+            <w:r/>
+            <w:r>
+              <w:rPr>
+                <w:sz w:val="18"/>
+              </w:rPr>
+              <w:t>BSI baseline + LOSO / 5-fold×100 / leave-pair-out CV machinery</w:t>
+            </w:r>
+          </w:p>
+        </w:tc>
+      </w:tr>
+      <w:tr>
+        <w:trPr>
+          <w:cantSplit/>
+        </w:trPr>
+        <w:tc>
+          <w:tcPr>
+            <w:tcW w:type="dxa" w:w="4455"/>
+          </w:tcPr>
+          <w:p>
+            <w:r/>
+            <w:r>
+              <w:rPr>
+                <w:sz w:val="18"/>
+              </w:rPr>
+              <w:t>stroke_phaseB_clean.py</w:t>
+            </w:r>
+          </w:p>
+        </w:tc>
+        <w:tc>
+          <w:tcPr>
+            <w:tcW w:type="dxa" w:w="4455"/>
+          </w:tcPr>
+          <w:p>
+            <w:r/>
+            <w:r>
+              <w:rPr>
+                <w:sz w:val="18"/>
+              </w:rPr>
+              <w:t>Spectrum-matching fix and its input/embedding health gates (Experiment 8)</w:t>
+            </w:r>
+          </w:p>
+        </w:tc>
+      </w:tr>
+      <w:tr>
+        <w:trPr>
+          <w:cantSplit/>
+        </w:trPr>
+        <w:tc>
+          <w:tcPr>
+            <w:tcW w:type="dxa" w:w="4455"/>
+          </w:tcPr>
+          <w:p>
+            <w:r/>
+            <w:r>
+              <w:rPr>
+                <w:sz w:val="18"/>
+              </w:rPr>
+              <w:t xml:space="preserve">stroke_phaseB_foldlocal.py</w:t>
+            </w:r>
+          </w:p>
+        </w:tc>
+        <w:tc>
+          <w:tcPr>
+            <w:tcW w:type="dxa" w:w="4455"/>
+          </w:tcPr>
+          <w:p>
+            <w:r/>
+            <w:r>
+              <w:rPr>
+                <w:sz w:val="18"/>
+              </w:rPr>
+              <w:t xml:space="preserve">Stroke spectral-matching filter refitted inside each LOSO fold (Table 19)</w:t>
+            </w:r>
+          </w:p>
+        </w:tc>
+      </w:tr>
+      <w:tr>
+        <w:trPr>
+          <w:cantSplit/>
+        </w:trPr>
+        <w:tc>
+          <w:tcPr>
+            <w:tcW w:type="dxa" w:w="4455"/>
+          </w:tcPr>
+          <w:p>
+            <w:r/>
+            <w:r>
+              <w:rPr>
+                <w:sz w:val="18"/>
+              </w:rPr>
+              <w:t xml:space="preserve">stroke_phaseB_reps.py</w:t>
+            </w:r>
+          </w:p>
+        </w:tc>
+        <w:tc>
+          <w:tcPr>
+            <w:tcW w:type="dxa" w:w="4455"/>
+          </w:tcPr>
+          <w:p>
+            <w:r/>
+            <w:r>
+              <w:rPr>
+                <w:sz w:val="18"/>
+              </w:rPr>
+              <w:t xml:space="preserve">Experiment 8 scored with Experiment 5's two seeded pre-training re-runs</w:t>
+            </w:r>
+          </w:p>
+        </w:tc>
+      </w:tr>
+      <w:tr>
+        <w:trPr>
+          <w:cantSplit/>
+        </w:trPr>
+        <w:tc>
+          <w:tcPr>
+            <w:tcW w:type="dxa" w:w="4455"/>
+          </w:tcPr>
+          <w:p>
+            <w:r/>
+            <w:r>
+              <w:rPr>
+                <w:sz w:val="18"/>
+              </w:rPr>
               <w:t xml:space="preserve">act0_repro_manifest.py</w:t>
             </w:r>
           </w:p>
@@ -12517,6 +12682,138 @@
                 <w:sz w:val="18"/>
               </w:rPr>
               <w:t xml:space="preserve">Fold, subset and cohort lists; checkpoint and result hashes; environment (Appendix §11)</w:t>
+            </w:r>
+          </w:p>
+        </w:tc>
+      </w:tr>
+      <w:tr>
+        <w:trPr>
+          <w:cantSplit/>
+        </w:trPr>
+        <w:tc>
+          <w:tcPr>
+            <w:tcW w:type="dxa" w:w="4455"/>
+          </w:tcPr>
+          <w:p>
+            <w:r/>
+            <w:r>
+              <w:rPr>
+                <w:sz w:val="18"/>
+              </w:rPr>
+              <w:t xml:space="preserve">act0_raw_hashes.py</w:t>
+            </w:r>
+          </w:p>
+        </w:tc>
+        <w:tc>
+          <w:tcPr>
+            <w:tcW w:type="dxa" w:w="4455"/>
+          </w:tcPr>
+          <w:p>
+            <w:r/>
+            <w:r>
+              <w:rPr>
+                <w:sz w:val="18"/>
+              </w:rPr>
+              <w:t xml:space="preserve">SHA-256 of every raw recording (Table 21)</w:t>
+            </w:r>
+          </w:p>
+        </w:tc>
+      </w:tr>
+      <w:tr>
+        <w:trPr>
+          <w:cantSplit/>
+        </w:trPr>
+        <w:tc>
+          <w:tcPr>
+            <w:tcW w:type="dxa" w:w="4455"/>
+          </w:tcPr>
+          <w:p>
+            <w:r/>
+            <w:r>
+              <w:rPr>
+                <w:sz w:val="18"/>
+              </w:rPr>
+              <w:t xml:space="preserve">act0_metrics.py</w:t>
+            </w:r>
+          </w:p>
+        </w:tc>
+        <w:tc>
+          <w:tcPr>
+            <w:tcW w:type="dxa" w:w="4455"/>
+          </w:tcPr>
+          <w:p>
+            <w:r/>
+            <w:r>
+              <w:rPr>
+                <w:sz w:val="18"/>
+              </w:rPr>
+              <w:t xml:space="preserve">Shared metric definitions and bootstrap confidence intervals</w:t>
+            </w:r>
+          </w:p>
+        </w:tc>
+      </w:tr>
+      <w:tr>
+        <w:trPr>
+          <w:cantSplit/>
+        </w:trPr>
+        <w:tc>
+          <w:tcPr>
+            <w:tcW w:type="dxa" w:w="4455"/>
+          </w:tcPr>
+          <w:p>
+            <w:r/>
+            <w:r>
+              <w:rPr>
+                <w:sz w:val="18"/>
+              </w:rPr>
+              <w:t xml:space="preserve">act0_full_metrics.py</w:t>
+            </w:r>
+          </w:p>
+        </w:tc>
+        <w:tc>
+          <w:tcPr>
+            <w:tcW w:type="dxa" w:w="4455"/>
+          </w:tcPr>
+          <w:p>
+            <w:r/>
+            <w:r>
+              <w:rPr>
+                <w:sz w:val="18"/>
+              </w:rPr>
+              <w:t xml:space="preserve">BAcc, AUC-PR, F1, sensitivity and specificity columns, recomputed from each experiment's saved predictions</w:t>
+            </w:r>
+          </w:p>
+        </w:tc>
+      </w:tr>
+      <w:tr>
+        <w:trPr>
+          <w:cantSplit/>
+        </w:trPr>
+        <w:tc>
+          <w:tcPr>
+            <w:tcW w:type="dxa" w:w="4455"/>
+          </w:tcPr>
+          <w:p>
+            <w:r/>
+            <w:r>
+              <w:rPr>
+                <w:sz w:val="18"/>
+              </w:rPr>
+              <w:t xml:space="preserve">act0_make_results.py</w:t>
+            </w:r>
+          </w:p>
+        </w:tc>
+        <w:tc>
+          <w:tcPr>
+            <w:tcW w:type="dxa" w:w="4455"/>
+          </w:tcPr>
+          <w:p>
+            <w:r/>
+            <w:r>
+              <w:rPr>
+                <w:sz w:val="18"/>
+              </w:rPr>
+              <w:t xml:space="preserve">Experiments 1, 2 and 4's Mann–Whitney, paired t- and Wilcoxon tests, from the saved results</w:t>
             </w:r>
           </w:p>
         </w:tc>
@@ -13026,7 +13323,7 @@
         <w:rPr>
           <w:b w:val="0"/>
         </w:rPr>
-        <w:t>Every experiment here follows the same rules. Any claim that pre-training “helped” needs a paired comparison against the same architecture with random, untrained weights, run through identical evaluation code. Every reported difference between two models comes with a confidence interval or a p-value: bootstrap resampling for independent recordings, paired tests for same-subset comparisons (for cross-validation folds, whose training sets overlap, the Nadeau–Bengio corrected resampled t-test [20], with Holm's adjustment [21] across a family of comparisons), label-permutation tests for small cohorts, whichever fits the data at hand. And experiments are ordered by increasing domain shift: validate on the data an encoder was trained on first (NMT), then transfer it, frozen, to a different hospital's data (TUAB), and only then apply it to a structurally different clinical task it was never designed for (stroke vs. healthy). The TUAB step is run zero-shot for all three encoders, pre-trained on NMT only, and again for GTJ and the fused model after adding TUAB's unlabelled training recordings to pre-training (Experiment 6). Working at the first, easiest step is a much weaker claim than surviving all three.</w:t>
+        <w:t>Every experiment here follows the same rules. Any claim that pre-training “helped” needs a paired comparison against the same architecture with random, untrained weights, run through identical evaluation code. Every formal inferential comparison between two models comes with a confidence interval or a p-value: bootstrap resampling for independent recordings, paired tests for same-subset comparisons (for cross-validation folds, whose training sets overlap, the Nadeau–Bengio corrected resampled t-test [20], with Holm's adjustment [21] across a family of comparisons), label-permutation tests for small cohorts, whichever fits the data at hand. And experiments are ordered by increasing domain shift: validate on the data an encoder was trained on first (NMT), then transfer it, frozen, to a different hospital's data (TUAB), and only then apply it to a structurally different clinical task it was never designed for (stroke vs. healthy). The TUAB step is run with all three encoders pre-trained on NMT only, and again for GTJ and the fused model after adding TUAB's unlabelled training recordings to pre-training (Experiment 6). Working at the first, easiest step is a much weaker claim than surviving all three.</w:t>
       </w:r>
     </w:p>
     <w:p>
@@ -13130,7 +13427,7 @@
         <w:rPr>
           <w:b w:val="0"/>
         </w:rPr>
-        <w:t>The most basic question came first: load the authors' own released checkpoints (SHA-256-verified against the Hugging Face file records; hashes in Table 18) into the authors' own evaluation heads, run them on the authors' own official 276-recording TUAB eval set, and see whether we land anywhere near their reported 0.877 (ViT-M) / 0.879 (ViT-B) AUROC. To rule out our own code before blaming theirs, Maruf diffed our pipeline against the authors' public repository (github.com/amir-hojjati/eeg-vjepa) at commit c739fad5ad57ec4439a094343901a245edf611ec: 43 of 48 compared files were byte-identical. The other 5 (app/main.py, app/vjepa/train.py, eval.py, schedulers.py and attentive_pooler.py) carry clearly-labelled additions of ours — a thermal guard, a fixed evaluation seed, an optional alternate head, an optional learning-rate scale, balanced accuracy among the metrics — that don't change the computation at their defaults.</w:t>
+        <w:t>The most basic question came first: load the authors' own released checkpoints (SHA-256-verified against the Hugging Face file records; hashes in Table 18) into the authors' own evaluation heads, run them on TUAB v3.0.1's 276-recording evaluation split, the one the paper reports on (files from our mirror copy, §5.5.3), and see whether we land anywhere near their reported 0.877 (ViT-M) / 0.879 (ViT-B) AUROC. To rule out our own code before blaming theirs, Maruf diffed our pipeline against the authors' public repository (github.com/amir-hojjati/eeg-vjepa) at commit c739fad5ad57ec4439a094343901a245edf611ec: 43 of 48 compared files were byte-identical. The other 5 (app/main.py, app/vjepa/train.py, eval.py, schedulers.py and attentive_pooler.py) carry clearly-labelled additions of ours — a thermal guard, a fixed evaluation seed, an optional alternate head, an optional learning-rate scale, balanced accuracy among the metrics — that don't change the computation at their defaults.</w:t>
       </w:r>
       <w:r/>
     </w:p>
@@ -13790,7 +14087,7 @@
           <w:i w:val="0"/>
           <w:sz w:val="18"/>
         </w:rPr>
-        <w:t>Table 7: Experiment 1 — released-checkpoint TUAB AUROC/BAcc/AUC-PR (final epoch; BAcc and AUC-PR at the default 0.5 threshold, the same convention used everywhere in this report) vs. random-init controls and the paper's reported AUROC (*best-epoch is optimistic, chosen by looking at the test set, and shown only for reference; ViT-B was run without a random-init twin) [1].</w:t>
+        <w:t>Table 7: Experiment 1 — released-checkpoint TUAB AUROC/BAcc/AUC-PR (final epoch; BAcc and AUC-PR at the default 0.5 threshold, the same convention used everywhere in this report) vs. random-init controls and the paper's reported AUROC (*best-epoch is optimistic, chosen by looking at the test set, and shown only for reference; ViT-B was run without a random-init twin) [1]. Runs: one evaluation head trained per TUAB training subset (s0–s4); each random-init run (s0–s2) also draws its own random weights, seeded with its subset number.</w:t>
       </w:r>
     </w:p>
     <w:tbl>
@@ -14622,7 +14919,7 @@
         <w:rPr>
           <w:b w:val="0"/>
         </w:rPr>
-        <w:t>Every released-checkpoint configuration falls roughly 0.1–0.2 AUROC short of the paper. More strikingly, a random, untrained ViT-M beats the released, pre-trained one: by 0.116 AUROC with the §4.2 head, 0.046 with the Fig-3 head, both statistically significant (Mann-Whitney p = 0.018 and p = 0.036). Training curves over all 500 epochs of the authors' own recipe show this gap from the very first epochs. More training wasn't going to fix it. Experiment 3 shows why: the released encoder's output barely varies from one recording to the next, so a classifier on top of it has almost nothing to work with.</w:t>
+        <w:t>Every released-checkpoint configuration falls roughly 0.1–0.2 AUROC short of the paper. More strikingly, a random, untrained ViT-M beats the released, pre-trained one: by 0.116 AUROC with the §4.2 head, 0.046 with the Fig-3 head (one-sided Mann–Whitney over 5 released and 3 random-weight runs: p = 0.018, the smallest these counts allow, and 0.036; two-sided, 0.036 and 0.071, so the Fig-3 gap alone would not pass a two-sided test). Training curves over all 500 epochs of the authors' own recipe show this gap from the very first epochs. More training wasn't going to fix it. Experiment 3 shows why: the released encoder's output barely varies from one recording to the next, so a classifier on top of it has almost nothing to work with.</w:t>
       </w:r>
     </w:p>
     <w:p>
@@ -14877,7 +15174,7 @@
         <w:rPr>
           <w:b w:val="0"/>
         </w:rPr>
-        <w:t>The two starting points are statistically indistinguishable (paired t-test and Wilcoxon both p = 0.81). From-scratch training even wins on 3 of 5 subsets. Starting from the released, “pre-trained” weights gives no measurable advantage over starting from nothing, which is exactly what we'd expect if those weights carry no usable information.</w:t>
+        <w:t>The two starting points are not significantly different (paired t-test and Wilcoxon both p = 0.81; any two of the five subsets share 98–134 of their 546 recordings, which both tests ignore, so allowing for that overlap would widen the uncertainty, not narrow it). From-scratch training even wins on 3 of 5 subsets. Starting from the released, “pre-trained” weights gives no measurable advantage over starting from nothing, which is exactly what we'd expect if those weights carry no usable information.</w:t>
       </w:r>
     </w:p>
     <w:p>
@@ -15771,7 +16068,7 @@
         <w:rPr>
           <w:b w:val="0"/>
         </w:rPr>
-        <w:t>This simpler probe does recover more signal than the paper's own heads (0.805 ± 0.013 vs. 0.671–0.713 for the paper's heads on the same five training subsets; 0.838 on the full training set), and both ViT-M variants beat the classical band-power baseline. But the released checkpoint still can't be told apart from a random-weight twin with any confidence (Mann-Whitney p = 0.196), and its full-training-set score of 0.838 still sits 0.039 below the paper's reported 0.877. Of the three frozen heads we ran, this linear probe gives the released checkpoint its highest TUAB eval AUROC; we picked it after seeing all three results, which can only flatter the released model, and it is the bar Experiment 6 compares FEI+GTJ against.</w:t>
+        <w:t>This simpler probe does recover more signal than the paper's own heads (0.805 ± 0.013 vs. 0.671–0.713 for the paper's heads on the same five training subsets; 0.838 on the full training set), and both ViT-M variants beat the classical band-power baseline. But the released checkpoint still can't be told apart from a random-weight twin with any confidence (one-sided Mann–Whitney p = 0.196, 5 released against 3 random-weight runs), and its full-training-set score of 0.838 still sits 0.039 below the paper's reported 0.877. Of the three frozen heads we ran, this linear probe gives the released checkpoint its highest TUAB eval AUROC; we picked it after seeing all three results, which can only flatter the released model, and it is the bar Experiment 6 compares FEI+GTJ against.</w:t>
       </w:r>
     </w:p>
     <w:p>
@@ -16705,7 +17002,7 @@
         <w:rPr>
           <w:b/>
         </w:rPr>
-        <w:t>Experiment 6 — FEI+GTJ on a different hospital's data (TUAB): zero-shot and adapted.</w:t>
+        <w:t>Experiment 6 — FEI+GTJ on a different hospital's data (TUAB): NMT-only and adapted.</w:t>
       </w:r>
     </w:p>
     <w:p>
@@ -16713,7 +17010,7 @@
         <w:rPr>
           <w:b w:val="0"/>
         </w:rPr>
-        <w:t>FEI+GTJ was built and validated entirely on NMT (Pakistan). Experiment 6 tests it on TUAB (USA): a different hospital, different hardware, a different patient population. We separate two settings. Zero-shot cross-dataset transfer: the encoder is pre-trained on NMT only and never sees a TUAB recording, labelled or not, before its frozen features are probed. Target-domain unlabelled adaptation: the encoder is re-pre-trained on NMT plus TUAB's unlabelled training recordings (never the eval set, never a label) and then probed the same way. In both settings the linear probe is fitted on TUAB's labelled training subsets and scored on the 276-recording eval set, exactly as in Experiment 4.</w:t>
+        <w:t>FEI+GTJ was built and validated entirely on NMT (Pakistan). Experiment 6 tests it on TUAB (USA): a different hospital, different hardware, a different patient population. We separate two settings. NMT-only transfer: the encoder is pre-trained on NMT only and never sees a TUAB recording, labelled or not, before its frozen features are probed. This is sometimes called zero-shot, but only the encoder's pre-training is: the linear classifier on top is trained on labelled TUAB recordings, so it tests how the representation transfers across datasets, not zero-shot classification. Target-domain unlabelled adaptation: the encoder is re-pre-trained on NMT plus TUAB's unlabelled training recordings (never the eval set, never a label) and then probed the same way. In both settings the linear probe is fitted on TUAB's labelled training subsets and scored on the 276-recording eval set, exactly as in Experiment 4.</w:t>
       </w:r>
     </w:p>
     <w:p>
@@ -16721,7 +17018,7 @@
         <w:rPr>
           <w:b w:val="0"/>
         </w:rPr>
-        <w:t>Table 12 reports both settings. FEI's zero-shot row is the clean transfer test. GTJ does not survive the shift zero-shot: it falls below its own random-init twin (0.840 vs 0.863 full-train AUROC), consistent with TUAB's differently filtered spectrum being out of distribution for an encoder trained on NMT's. The adapted rows therefore re-pre-train GTJ, and the FEI inside the adapted fused model, on NMT plus TUAB's unlabelled training recordings. The zero-shot FEI and the FEI inside the adapted fused model are two separately pre-trained encoders, rather than the same weights reused. An untrained encoder is the same in both settings, so each random-init row serves as the control for both.</w:t>
+        <w:t>Table 12 reports both settings. FEI's NMT-only row is the clean cross-dataset test of representation transfer. GTJ does not survive the NMT-only transfer: it falls below its own random-init twin (0.840 vs 0.863 full-train AUROC), consistent with TUAB's differently filtered spectrum being out of distribution for an encoder trained on NMT's. The adapted rows therefore re-pre-train GTJ, and the FEI inside the adapted fused model, on NMT plus TUAB's unlabelled training recordings. The NMT-only FEI and the FEI inside the adapted fused model are two separately pre-trained encoders, rather than the same weights reused. An untrained encoder is the same in both settings, so each random-init row serves as the control for both.</w:t>
       </w:r>
     </w:p>
     <w:p>
@@ -16736,7 +17033,7 @@
           <w:i w:val="0"/>
           <w:sz w:val="18"/>
         </w:rPr>
-        <w:t>Table 12: Experiment 6 — frozen FEI, GTJ and FEI+GTJ on TUAB. Zero-shot rows are pre-trained on NMT only; adapted rows on NMT plus TUAB's unlabelled training recordings. Matched random-init controls for every arm; full-train operating point (BAcc/AUC-PR/Sens/Spec at the default 0.5 threshold) alongside AUROC.</w:t>
+        <w:t>Table 12: Experiment 6 — frozen FEI, GTJ and FEI+GTJ on TUAB. NMT-only rows: encoders pre-trained on NMT alone; adapted rows on NMT plus TUAB's unlabelled training recordings. Matched random-init controls for every arm; full-train operating point (BAcc/AUC-PR/Sens/Spec at the default 0.5 threshold) alongside AUROC.</w:t>
       </w:r>
     </w:p>
     <w:tbl>
@@ -17159,7 +17456,7 @@
               <w:rPr>
                 <w:sz w:val="18"/>
               </w:rPr>
-              <w:t xml:space="preserve">FEI (NMT-only, zero-shot)</w:t>
+              <w:t xml:space="preserve">FEI (NMT-only)</w:t>
             </w:r>
           </w:p>
         </w:tc>
@@ -17407,7 +17704,7 @@
               <w:rPr>
                 <w:sz w:val="18"/>
               </w:rPr>
-              <w:t xml:space="preserve">GTJ (NMT-only, zero-shot)</w:t>
+              <w:t xml:space="preserve">GTJ (NMT-only)</w:t>
             </w:r>
           </w:p>
         </w:tc>
@@ -17779,7 +18076,7 @@
               <w:rPr>
                 <w:sz w:val="18"/>
               </w:rPr>
-              <w:t xml:space="preserve">FEI+GTJ (NMT-only, zero-shot)</w:t>
+              <w:t xml:space="preserve">FEI+GTJ (NMT-only)</w:t>
             </w:r>
           </w:p>
         </w:tc>
@@ -18197,7 +18494,7 @@
         <w:rPr>
           <w:b w:val="0"/>
         </w:rPr>
-        <w:t>Adapted, FEI+GTJ scores above the released ViT-M and clearly beats band power (0.862 vs. 0.838 vs. 0.757 on the full training set), though the gap between FEI+GTJ and ViT-M, +0.024, isn't statistically significant (p = 0.147). Zero-shot, the fused model reaches 0.857 on the full training set (0.821 ± 0.006 over the five subsets), so most of the adapted model's score does not depend on seeing TUAB during pre-training.</w:t>
+        <w:t>Adapted, FEI+GTJ scores above the released ViT-M and clearly beats band power (0.862 vs. 0.838 vs. 0.757 on the full training set), though the gap between FEI+GTJ and ViT-M, +0.024, isn't statistically significant (p = 0.147). Two seeded re-runs of that adapted pre-training (code/tuab_feic_joint_reps.py, scored the same way) reach 0.851 and 0.855; resampling the three runs and the test recordings together, FEI+GTJ's lead over ViT-M is +0.018 (95% CI [−0.028, 0.064], p = 0.220), still not significant. NMT-only, the fused model reaches 0.857 on the full training set (0.821 ± 0.006 over the five subsets), so most of the adapted model's score does not depend on seeing TUAB during pre-training.</w:t>
       </w:r>
     </w:p>
     <w:p>
@@ -18205,7 +18502,7 @@
         <w:rPr>
           <w:b w:val="0"/>
         </w:rPr>
-        <w:t>FEI's zero-shot pre-training gain, though, is statistically significant on its own: FEI beats its random-init twin by +0.059 AUROC (95% CI [0.019, 0.097], p = 0.002): so what FEI learned on NMT alone carries information about abnormal EEG on TUAB that its architecture by itself does not supply (one dataset pair). That p-value resamples the 276 test recordings for one set of trained encoders (five, one per NMT training fold, ensembled), so it says nothing about how the gain varies between pre-training runs. We therefore scored Experiment 5's two seeded re-runs on TUAB the same way (code/tuab_fei_reps.py), against the same random-init twins: +0.046 (95% CI [0.011, 0.083], p = 0.007) and +0.052 (95% CI [0.016, 0.090], p = 0.004). Of the 15 individual fold encoders across the three runs, 14 score above the random-init ensemble (0.813) and 15 above the best single random-init encoder (0.809). The same script gives the original run's +0.059 again. Resampling the three pre-training runs and the test recordings together, so that both sources of uncertainty enter one interval, gives a mean gain of +0.052 (95% CI [0.016, 0.090], p = 0.003), close to the second re-run's figures because that run sits near the three-run mean; with only three runs to resample, the between-run part of that interval is itself rough.</w:t>
+        <w:t>FEI's NMT-only pre-training gain, though, is statistically significant on its own: FEI beats its random-init twin by +0.059 AUROC (95% CI [0.019, 0.097], p = 0.002): so what FEI learned on NMT alone carries information about abnormal EEG on TUAB that its architecture by itself does not supply (one dataset pair). That p-value resamples the 276 test recordings for one set of trained encoders (five, one per NMT training fold, ensembled), so it says nothing about how the gain varies between pre-training runs. We therefore repeated the NMT pre-training and scored each run on TUAB the same way (code/tuab_fei_reps.py), against the same random-init twins (the same script gives the original run's +0.059 again): Experiment 5's two seeded re-runs, plus two further FEI-only runs with the same recipe and seeding, trained for this check alone (Experiment 5's analysis was fixed at three runs of both branches before these two were trained, and with no GTJ partner they cannot enter its fused comparison). Across the five runs the gain over the twin averages +0.048, ranging from +0.036 to +0.059; of the 25 individual fold encoders, 23 score above the random-init ensemble (0.813) and 24 above the best single random-init encoder (0.809). A bootstrap that resamples the five pre-training runs, the twin's three random-init seeds and the 276 test recordings together, so that all three sources of uncertainty enter one interval (Table 24), gives a mean gain of +0.048 (95% CI [0.015, 0.108], p = 0.0055). All five runs are scored on the same test set, so they show that the gain does not hinge on one pre-training seed; they are not five independent replications of the transfer, and with five runs and three seeds the between-run part of that interval is itself rough.</w:t>
       </w:r>
     </w:p>
     <w:p>
@@ -18213,7 +18510,7 @@
         <w:rPr>
           <w:b w:val="0"/>
         </w:rPr>
-        <w:t>GTJ is the more sobering half of the same table. Adapted GTJ vs. its random twin is −0.005 (p = 0.642, not significant), adapted FEI+GTJ vs. its random twin is only +0.001 (p = 0.455), and zero-shot GTJ is below its twin outright (0.840 vs 0.863). The same collapse diagnostics as Experiment 3 confirm our encoders are healthy on TUAB (embedding std 0.36–0.58, cosine 0.59–0.78), so this isn't collapse in disguise. GTJ's spectrogram input and architecture are doing useful work on TUAB: the pre-training itself just isn't the reason why, a distinction the failure-axis analysis below returns to.</w:t>
+        <w:t>GTJ is the more sobering half of the same table. Adapted GTJ vs. its random twin is −0.005 (p = 0.642, not significant), adapted FEI+GTJ vs. its random twin is only +0.001 (p = 0.455), and NMT-only GTJ is below its twin outright (0.840 vs 0.863). Two seeded re-runs of the adapted pre-training tell the same story: GTJ −0.017 (p = 0.879) and −0.023 (p = 0.944), FEI+GTJ −0.010 (p = 0.734) and −0.006 (p = 0.665) against the same twins, and the bootstrap over the three runs, the twins' random-init seeds and the test recordings gives −0.015 (95% CI [−0.040, 0.031], p = 0.671) for GTJ and −0.005 (95% CI [−0.033, 0.043], p = 0.431) for FEI+GTJ. No adapted pre-training gain appears in any of the three runs: consistent across three initialisations, which is not proof that none exists. The same collapse diagnostics as Experiment 3 show this isn't collapse in disguise: on the TUAB test recordings the adapted GTJ encoders of all three runs keep an embedding std of 0.33–0.39 (cosine 0.59–0.71), and every FEI encoder, NMT-only or adapted, re-runs included, 0.45–1.08 (0.64–0.84). NMT-only GTJ is the one compressed case (std 0.04–0.07, cosine 0.96–0.99, below every random-init twin's 0.11), far less so than the released checkpoint (Experiment 3) and in line with the spectrum shift described above. GTJ's spectrogram input and architecture are doing useful work on TUAB: the pre-training itself just isn't the reason why, a distinction the failure-axis analysis below returns to.</w:t>
       </w:r>
     </w:p>
     <w:p>
@@ -19614,7 +19911,7 @@
         <w:rPr>
           <w:b w:val="0"/>
         </w:rPr>
-        <w:t>Both results confirm the pipeline is sound, and set a demanding bar: BSI alone reaches 0.907 AUROC. Any self-supervised encoder that can't match this has no real claim to clinical usefulness here, however interesting its pre-training.</w:t>
+        <w:t>Both results are a sanity check that the pipeline recovers the expected BSI effect, and they make BSI a demanding reference baseline: alone it reaches 0.907 AUROC, and any self-supervised encoder here is judged against it, however interesting its pre-training.</w:t>
       </w:r>
     </w:p>
     <w:p>
@@ -20194,7 +20491,7 @@
         <w:rPr>
           <w:b w:val="0"/>
         </w:rPr>
-        <w:t>FEI+GTJ reaches 0.926 LOSO AUROC against BSI's 0.907 (Δ = +0.019, 95% CI [−0.240, 0.280], p = 0.523): a similar point estimate, not significantly different either way under every cross-validation scheme we tried. We set no equivalence margin in advance, and an interval this wide cannot show equivalence either, so the cohort is simply too small to rank the two. At the default 0.5 threshold, FEI+GTJ, BSI alone, and FEI+GTJ+BSI combined all land on the identical confusion matrix — 8 of 9 stroke cases and all 6 controls called correctly, one stroke case missed (Acc 0.933, BAcc 0.944, F1 0.941, Sens 0.889, Spec 1.000) — differing only in AUROC, i.e. in how confidently each ranks that one missed case; the random-init twin is very slightly worse at this same threshold (one extra false positive: Acc 0.867, BAcc 0.861, F1 0.889, Spec 0.833). It does not show a significant advantage from pre-training as a whole on this task: FEI+GTJ vs. its own random-init twin is −0.019 LOSO AUROC (p = 0.826), not a significant difference in either direction. Splitting this by branch (exploratory, single-arm, not pre-registered) shows the same pattern as TUAB: FEI's pre-training clears its random twin in 100% of repeated 5-fold splits; GTJ's does not, only 16% of repeats. The single, deterministic LOSO split (every subject held out exactly once, so there is no fold-assignment randomness to repeat here) tells a more dramatic version of the same branch story: FEI alone reaches a perfect 1.000 LOSO AUROC — a threshold exists with zero errors, 9/9 stroke and 6/6 control — against GTJ alone's 0.833 and the random-init twins' 0.907 (FEI) / 0.852 (GTJ). A perfect score on 15 subjects is still fragile, since one atypically-recorded subject could flip it, which is why the repeated, randomized 5-fold win-rate above, not this single point estimate, is the statistic we'd stand behind. FEI+GTJ combined with BSI (0.963 LOSO) numerically beats BSI alone in 82% of repeated splits — promising, but not statistically significant at 15 subjects. With the spectral-matching filter refitted inside each fold instead (Table 19), FEI+GTJ stays at 0.926 and FEI+GTJ+BSI drops to 0.944, the same as its random-init twin.</w:t>
+        <w:t>FEI+GTJ reaches 0.926 LOSO AUROC against BSI's 0.907 (Δ = +0.019, 95% CI [−0.240, 0.280], p = 0.523): a similar point estimate, not significantly different either way under every cross-validation scheme we tried. We set no equivalence margin in advance, and an interval this wide cannot show equivalence either, so the cohort is simply too small to rank the two. At the default 0.5 threshold, FEI+GTJ, BSI alone, and FEI+GTJ+BSI combined all land on the identical confusion matrix — 8 of 9 stroke cases and all 6 controls called correctly, one stroke case missed (Acc 0.933, BAcc 0.944, F1 0.941, Sens 0.889, Spec 1.000) — differing only in AUROC, i.e. in how confidently each ranks that one missed case; the random-init twin is very slightly worse at this same threshold (one extra false positive: Acc 0.867, BAcc 0.861, F1 0.889, Spec 0.833). It does not show a significant advantage from pre-training as a whole on this task: FEI+GTJ vs. its own random-init twin is −0.019 LOSO AUROC (p = 0.826), not a significant difference in either direction. Splitting this by branch (exploratory, single-arm, not pre-registered) shows the same pattern as TUAB: FEI's pre-training clears its random twin in 100% of repeated 5-fold splits; GTJ's does not, only 16% of repeats. The single, deterministic LOSO split (every subject held out exactly once, so there is no fold-assignment randomness to repeat here) tells a more dramatic version of the same branch story: FEI alone reaches a perfect 1.000 LOSO AUROC — a threshold exists with zero errors, 9/9 stroke and 6/6 control — against GTJ alone's 0.833 and the random-init twins' 0.907 (FEI) / 0.852 (GTJ). A perfect score on 15 subjects is still fragile, since one atypically-recorded subject could flip it, which is why the repeated, randomized 5-fold win-rate above, not this single point estimate, is the statistic we'd stand behind. FEI+GTJ combined with BSI (0.963 LOSO) numerically beats BSI alone in 82% of repeated splits — promising, but not statistically significant at 15 subjects. With the spectral-matching filter refitted inside each fold instead (Table 19), FEI+GTJ stays at 0.926 and FEI+GTJ+BSI drops to 0.944, the same as its random-init twin. Experiment 5's two seeded pre-training re-runs went through the same frozen pipeline: the same spectrally matched input, nothing re-fitted, and the same encoder gates (code/stroke_phaseB_reps.py; bootstrap comparisons only, no permutation tests). FEI+GTJ scores 0.963 and 0.981 LOSO AUROC (original run 0.926; random-init twin 0.944, BSI 0.907), FEI alone 1.000 and 0.981 (twin 0.907) and GTJ alone 0.833 and 0.833 (twin 0.852); FEI's re-runs beat their twin in 100% and 96% of the repeated 5-fold splits, GTJ's in 16% and 15%. Against BSI, FEI+GTJ's re-runs differ by +0.056 (p = 0.428) and +0.074 (p = 0.389), neither significant. The spread across the three runs is pre-training-seed variation only: all three are scored on the same 15 subjects, so they add no clinical sample and leave the subject-level intervals above as wide as they were. The re-run GTJ encoders pass the same gates as the original (BatchNorm |z| at most 0.38, embedding spread 0.74–0.82 of their spread on NMT, no constant dimensions).</w:t>
       </w:r>
     </w:p>
     <w:p>
@@ -20221,7 +20518,7 @@
         <w:rPr>
           <w:b w:val="0"/>
         </w:rPr>
-        <w:t>The released EEG-VJEPA checkpoints don't reproduce the paper's own result, because they're collapsed (Experiments 1–3). No amount of fine-tuning under the authors' own recipe fixes that (Experiment 2), and the simplest possible probe can't rescue it either (Experiment 4). FEI+GTJ, built in response, beats a classical baseline on the data it was trained on, although an untrained twin already accounts for about two-thirds of that margin (Experiment 5); on a different hospital's data, FEI's NMT-only pre-training still gives a significant gain, in all three pre-training runs, and the fused model, re-pre-trained with that hospital's unlabelled recordings, scores close to the released checkpoint (difference not significant) and stays ahead of a classical baseline (Experiment 6), and, after a post-hoc input fix, scores close to a strong clinical baseline on a third, structurally different task, too close for 15 subjects to separate (Experiments 7–8). A t-SNE/UMAP visual check, matching our original proposal's promised deliverable, shows that 2-D unsupervised layout is the wrong tool for seeing why any of these encoders work, or why the released one doesn't.</w:t>
+        <w:t>The released EEG-VJEPA checkpoints don't reproduce the paper's own result, because they're collapsed (Experiments 1–3). 500-epoch fine-tuning under the authors' own recipe did not fix that (Experiment 2), and the simplest possible probe can't rescue it either (Experiment 4). FEI+GTJ, built in response, beats a classical baseline on the data it was trained on, although an untrained twin already accounts for about two-thirds of that margin (Experiment 5); on a different hospital's data, FEI's NMT-only pre-training still gives a significant gain (+0.048 AUROC averaged over five pre-training runs, 95% CI [0.015, 0.108]), and the fused model, re-pre-trained with that hospital's unlabelled recordings, scores close to the released checkpoint (difference not significant) and stays ahead of a classical baseline (Experiment 6), and, after a post-hoc input fix, scores close to a strong clinical baseline on a third, structurally different task, too close for 15 subjects to separate (Experiments 7–8). A t-SNE/UMAP visual check, matching our original proposal's promised deliverable, shows that 2-D unsupervised layout is the wrong tool for seeing why any of these encoders work, or why the released one doesn't.</w:t>
       </w:r>
     </w:p>
     <w:p>
@@ -20406,7 +20703,7 @@
         <w:rPr>
           <w:b w:val="0"/>
         </w:rPr>
-        <w:t>The released EEG-VJEPA checkpoints are collapsed and fail to reproduce the paper; our token-spread diagnostic is repeatable, and the released training config gives a likely cause. FEI+GTJ beats our classical baseline on NMT, with pre-training adding a consistent but not significant +0.027 AUROC over an untrained twin (three-run mean 0.861 vs 0.834); on stroke, after a post-hoc input fix, its AUROC is close to BSI's, with far too few subjects to call them equivalent. Across hospitals, FEI's NMT-only pre-training still gives a significant gain, in all three pre-training runs; the fused model, re-pre-trained with TUAB's unlabelled recordings, scores close to the released ViT-M there, with no significant difference. On stroke only FEI shows a pre-training gain, and no model here significantly beats BSI. Table 16 compares these outcomes with the original proposal.</w:t>
+        <w:t>The released EEG-VJEPA checkpoints are collapsed and fail to reproduce the paper; our token-spread diagnostic is repeatable, and the released training config gives a likely cause. FEI+GTJ beats our classical baseline on NMT, with pre-training adding a consistent but not significant +0.027 AUROC over an untrained twin (three-run mean 0.861 vs 0.834); on stroke, after a post-hoc input fix, its AUROC is close to BSI's, with far too few subjects to call them equivalent. Across hospitals, FEI's NMT-only pre-training still gives a significant gain (+0.048 AUROC averaged over five pre-training runs, 95% CI [0.015, 0.108]); the fused model, re-pre-trained with TUAB's unlabelled recordings, scores close to the released ViT-M there, with no significant difference. On stroke only FEI shows a pre-training gain, and no model here significantly beats BSI. Table 16 compares these outcomes with the original proposal.</w:t>
       </w:r>
     </w:p>
     <w:p>
@@ -20679,7 +20976,7 @@
               <w:rPr>
                 <w:sz w:val="18"/>
               </w:rPr>
-              <w:t>original run 0.865 ± 0.024 on NMT (three-run mean 0.861) vs. band power 0.786 and untrained twin 0.834 (pre-training +0.027, not significant); on TUAB, FEI's NMT-only pre-training +0.059 (p = 0.002; +0.046 and +0.052 in two re-runs); fused, with TUAB's unlabelled recordings added, close to released ViT-M (not significant) and beats band power (Exp. 5–6)</w:t>
+              <w:t xml:space="preserve">original run 0.865 ± 0.024 on NMT (three-run mean 0.861) vs. band power 0.786 and untrained twin 0.834 (pre-training +0.027, not significant); on TUAB, FEI's NMT-only pre-training +0.048 averaged over five runs (95% CI [0.015, 0.108]; original run +0.059); fused, with TUAB's unlabelled recordings added, close to released ViT-M (not significant) and beats band power (Exp. 5–6)</w:t>
             </w:r>
           </w:p>
         </w:tc>
@@ -20726,7 +21023,7 @@
               <w:rPr>
                 <w:sz w:val="18"/>
               </w:rPr>
-              <w:t>Gate passed p = 0.003; BSI 0.907; FEI+GTJ 0.926 after a post-hoc input fix, not separable from BSI (Exp. 7–8)</w:t>
+              <w:t xml:space="preserve">Gate passed p = 0.003; BSI 0.907; FEI+GTJ 0.926 (seed re-runs 0.963, 0.981) after a post-hoc input fix, not separable from BSI (Exp. 7–8)</w:t>
             </w:r>
           </w:p>
         </w:tc>
@@ -20970,7 +21267,7 @@
         <w:rPr>
           <w:b w:val="0"/>
         </w:rPr>
-        <w:t>Our TUAB result (Experiment 6) shows that a self-supervised encoder pre-trained only on a lower-resource-setting EEG dataset (FEI, pre-trained on NMT) can carry a measurable benefit, zero-shot, to a different hospital's data.</w:t>
+        <w:t>Our TUAB result (Experiment 6) shows that a self-supervised encoder pre-trained only on a lower-resource-setting EEG dataset (FEI, pre-trained on NMT) can carry a measurable benefit to a different hospital's data without seeing any of its recordings in pre-training (the linear probe on top is still trained on that hospital's labels).</w:t>
       </w:r>
     </w:p>
     <w:p>
@@ -21006,7 +21303,7 @@
         <w:rPr>
           <w:b w:val="0"/>
         </w:rPr>
-        <w:t xml:space="preserve">The official TUH Abnormal EEG Corpus is distributed by Temple University under a Data Use Agreement (DUA) signed with the corpus's maintainers (NEDC) before access is granted. The copy we used came from an unofficial, publicly re-hosted Kaggle mirror: we checked it matches the structure and content of the genuine TUAB v3.0.1 release, but it is </w:t>
+        <w:t xml:space="preserve">The official TUH Abnormal EEG Corpus is distributed by Temple University under a Data Use Agreement (DUA) signed with the corpus's maintainers (NEDC) before access is granted. The copy we used came from an unofficial, publicly re-hosted Kaggle mirror: it carries the corpus's own v3.0.1 README, and its directory layout and file counts (1,371 normal and 1,346 abnormal training recordings, 150 and 126 for evaluation) match that README's, but we never had a DUA-covered official copy to compare against, so we cannot show it is byte-for-byte identical to the licensed release (the SHA-256 of every file we used is in docs/act0_repro/raw_recordings_sha256.csv, Table 21). It is </w:t>
       </w:r>
       <w:r>
         <w:rPr>
@@ -21997,7 +22294,7 @@
         <w:rPr>
           <w:b w:val="0"/>
         </w:rPr>
-        <w:t>A recently published AI model, EEG-VJEPA, claimed to automatically tell healthy brain recordings apart from abnormal ones by adapting a video-understanding technique to EEG. Our team tested this claim and found that the publicly released version does not actually work as described: it gives almost the same answer for every patient. We could show this directly. We built two smaller models instead: one for frequency content and one for how a signal's rhythm changes over time. Together they beat a simple classical measurement on the dataset they were trained on (an untrained copy of the same design already does most of that) and score close to an established clinical measurement, with too few patients to tell the two apart, on a third task: telling stroke patients apart from healthy volunteers. On a different hospital's data, the frequency model's training still helped on its own; the combined model needed that hospital's unlabelled recordings too, and there it only scored close to the released model.</w:t>
+        <w:t>A recently published AI model, EEG-VJEPA, claimed to automatically tell healthy brain recordings apart from abnormal ones by adapting a video-understanding technique to EEG. Our team tested this claim and found that the publicly released version does not actually work as described: it gives almost the same answer for every patient. We could show this directly. We built two smaller models instead: one for frequency content and one for how a signal's rhythm changes over time. Together they beat a simple classical measurement on the dataset they were trained on (an untrained copy of the same design already does most of that) and score close to an established clinical measurement, with too few patients to tell the two apart, on a third task: telling stroke patients apart from healthy volunteers. On a different hospital's data, the frequency model's training still helped on its own, across five training runs. The rhythm model's training did not carry over, and retraining both models with that hospital's unlabelled recordings changed little: either way the combined model scored close to the released model and no better than an untrained copy of itself.</w:t>
       </w:r>
     </w:p>
     <w:p>
@@ -22015,7 +22312,7 @@
         <w:rPr>
           <w:b w:val="0"/>
         </w:rPr>
-        <w:t>All code, saved model checkpoints, and saved per-recording predictions used to produce every number, table, and figure in this report are organized as a set of scripts, one per experiment (Table 5). Table 4 gives the script behind each experiment's input. The 200 Hz NMT copy that FEI and GTJ read (per-channel z-scored at NMT's native rate, stored as 2.5-second frames) was first written in August 2026 by a script that was not kept; we reconstructed its recipe as code/preprocess_nmt_200hz.py, which reproduces all 2,417 stored files byte for byte. From those inputs, pre-train an encoder (`fei_pretrain.py` or `fei_branchC.py`, both with a `--selftest` flag for a fast sanity check with no real data and a `--cv` flag for the full five-fold cross-validation reported here), score it with `feic_nmt_anchor.py` (Experiment 5) or `tuab_feic.py` (Experiment 6), and evaluate a frozen or fine-tuned released checkpoint with the corresponding `tuab_*_eval.py` script. Every long-running script checkpoints its progress after each cross-validation fold and can be safely re-run to resume after an interruption, and each accepts command-line flags for every experiment variant reported here. The code is in github.com/mashfiqurrahman2020-coder/EEG-VJEPA-act-0; its docs/act0_repro/ folder holds the fold, subset and cohort lists, the SHA-256 of every checkpoint and result file, and the pinned environment (Appendix §11). The code, checkpoints and results behind this report are commit e0d6d64ab57f0da9dd32e807a36be5a23fa5a808, which unlike a tag cannot be moved: git clone https://github.com/mashfiqurrahman2020-coder/EEG-VJEPA-act-0.git, then git checkout e0d6d64ab57f, then pip install -r docs/act0_repro/requirements-act0.txt under Python 3.9. Appendix §11.6 gives the pre-training commands and §11.9 the data each experiment uses. The report itself is added one commit later, under the tag act0-report-round15b. All 40 FEI/GTJ checkpoints are committed in the repository (code/*.pt, about 110 MB), so nothing needs a separate download except the data and the released EEG-VJEPA weights. Two kinds of reproduction follow. The saved checkpoints and predictions reproduce every reported number exactly. Re-training does not: the original FEI and GTJ runs set no random seed, so they cannot be regenerated bit for bit, and cuDNN kernels were left non-deterministic, so even the seeded re-runs should be expected to reproduce the results statistically, not bit for bit.</w:t>
+        <w:t>All code, saved model checkpoints, and saved per-recording predictions used to produce every number, table, and figure in this report are organized as a set of scripts, one per experiment (Table 5). Table 4 gives the script behind each experiment's input. The 200 Hz NMT copy that FEI and GTJ read (per-channel z-scored at NMT's native rate, stored as 2.5-second frames) was first written in August 2026 by a script that was not kept; we reconstructed its recipe as code/preprocess_nmt_200hz.py, which reproduces all 2,417 stored files byte for byte. From those inputs, pre-train an encoder (`fei_pretrain.py` or `fei_branchC.py`, both with a `--selftest` flag for a fast sanity check with no real data and a `--cv` flag for the full five-fold cross-validation reported here), score it with `feic_nmt_anchor.py` (Experiment 5) or `tuab_feic.py` (Experiment 6), and evaluate a frozen or fine-tuned released checkpoint with the corresponding `tuab_*_eval.py` script. Every long-running script checkpoints its progress after each cross-validation fold and can be safely re-run to resume after an interruption, and each accepts command-line flags for every experiment variant reported here. The code is in github.com/mashfiqurrahman2020-coder/EEG-VJEPA-act-0, a private repository because it holds results computed on our unofficial TUAB copy (§5.5.3); course examiners can be given read access to the exact commit below. Its docs/act0_repro/ folder holds the fold, subset and cohort lists, the SHA-256 of every checkpoint and result file, and the pinned environment (Appendix §11). The code, checkpoints and results behind this report are commit 424cae1cc560cff32f1128f50c066e8c2f8e5ee5, which unlike a tag cannot be moved: git clone https://github.com/mashfiqurrahman2020-coder/EEG-VJEPA-act-0.git, then git checkout 424cae1cc560, then pip install -r docs/act0_repro/requirements-act0.txt under Python 3.9. Appendix §11.6 gives the pre-training commands and §11.9 the data each experiment uses. The report itself is added one commit later, under the tag act0-report-round15c. All 70 FEI/GTJ checkpoints are committed in the repository (code/*.pt, about 180 MB), so nothing needs a separate download except the data and the released EEG-VJEPA weights. Two kinds of reproduction follow. The saved checkpoints and predictions reproduce every reported number exactly. Re-training does not: the original FEI and GTJ runs set no random seed, so they cannot be regenerated bit for bit, and cuDNN kernels were left non-deterministic, so even the seeded re-runs should be expected to reproduce the results statistically, not bit for bit.</w:t>
       </w:r>
     </w:p>
     <w:p>
@@ -23103,7 +23400,7 @@
               <w:rPr>
                 <w:sz w:val="18"/>
               </w:rPr>
-              <w:t xml:space="preserve">Our 40 FEI/GTJ checkpoints</w:t>
+              <w:t xml:space="preserve">Our 70 FEI/GTJ checkpoints</w:t>
             </w:r>
           </w:p>
         </w:tc>
@@ -23136,7 +23433,7 @@
               <w:rPr>
                 <w:sz w:val="18"/>
               </w:rPr>
-              <w:t xml:space="preserve">Our 33 result files</w:t>
+              <w:t xml:space="preserve">Our 38 result files</w:t>
             </w:r>
           </w:p>
         </w:tc>
@@ -25395,7 +25692,7 @@
               <w:rPr>
                 <w:sz w:val="18"/>
               </w:rPr>
-              <w:t xml:space="preserve">43</w:t>
+              <w:t xml:space="preserve">72</w:t>
             </w:r>
           </w:p>
         </w:tc>
@@ -25442,7 +25739,7 @@
               <w:rPr>
                 <w:sz w:val="18"/>
               </w:rPr>
-              <w:t xml:space="preserve">34</w:t>
+              <w:t xml:space="preserve">38</w:t>
             </w:r>
           </w:p>
         </w:tc>
@@ -25809,7 +26106,7 @@
               <w:rPr>
                 <w:sz w:val="18"/>
               </w:rPr>
-              <w:t xml:space="preserve">Repeated pre-training runs for Experiment 6's joint NMT+TUAB encoders and for Experiment 8</w:t>
+              <w:t xml:space="preserve">NMT-only GTJ and FEI+GTJ re-runs on TUAB (Experiment 6)</w:t>
             </w:r>
           </w:p>
         </w:tc>
@@ -25823,7 +26120,7 @@
               <w:rPr>
                 <w:sz w:val="18"/>
               </w:rPr>
-              <w:t xml:space="preserve">One joint NMT+TUAB pre-training run takes about 78 minutes of GPU time (§8.1). Experiment 8 uses Experiment 5's original fold encoders; the two re-runs were not carried over to the stroke cohort.</w:t>
+              <w:t xml:space="preserve">The TUAB re-runs went to FEI, whose NMT-only gain is the claim the report makes; NMT-only GTJ already scores below its random-init twin, and no conclusion rests on it.</w:t>
             </w:r>
           </w:p>
         </w:tc>
@@ -25837,7 +26134,7 @@
               <w:rPr>
                 <w:sz w:val="18"/>
               </w:rPr>
-              <w:t xml:space="preserve">Experiment 6's zero-shot FEI gain is checked on Experiment 5's two seeded re-runs (§5.3.3); the joint encoders and Experiment 8 each rest on one pre-training run, compared with its random-init twin.</w:t>
+              <w:t xml:space="preserve">NMT-only GTJ and FEI+GTJ from the original run against their twins (Table 12); FEI over five runs and the adapted encoders over three (§5.3.3).</w:t>
             </w:r>
           </w:p>
         </w:tc>
@@ -25856,7 +26153,7 @@
               <w:rPr>
                 <w:sz w:val="18"/>
               </w:rPr>
-              <w:t xml:space="preserve">Repeated, deterministic runs of the Fig-3 attentive head (Experiment 1)</w:t>
+              <w:t xml:space="preserve">Permutation tests for Experiment 8's pre-training re-runs</w:t>
             </w:r>
           </w:p>
         </w:tc>
@@ -25870,7 +26167,7 @@
               <w:rPr>
                 <w:sz w:val="18"/>
               </w:rPr>
-              <w:t xml:space="preserve">No conclusion depends on that head's exact value; the argument uses the linear probe and the §4.2 head, which is bit-identical across re-runs.</w:t>
+              <w:t xml:space="preserve">Each needs 1,000 full LOSO re-runs per arm and run, the slowest part of Experiment 8; the re-runs were added in the last revision.</w:t>
             </w:r>
           </w:p>
         </w:tc>
@@ -25884,7 +26181,7 @@
               <w:rPr>
                 <w:sz w:val="18"/>
               </w:rPr>
-              <w:t xml:space="preserve">Both runs are reported (72.1 and 68.7) and Table 7 uses the re-run.</w:t>
+              <w:t xml:space="preserve">Paired bootstrap comparisons of each re-run with the same random-init twin and with BSI over the 15 subjects (§5.3.3).</w:t>
             </w:r>
           </w:p>
         </w:tc>
@@ -25903,7 +26200,7 @@
               <w:rPr>
                 <w:sz w:val="18"/>
               </w:rPr>
-              <w:t xml:space="preserve">Evaluation on the licensed TUAB release</w:t>
+              <w:t xml:space="preserve">Five random-init seeds for the TUAB and stroke twins</w:t>
             </w:r>
           </w:p>
         </w:tc>
@@ -25917,7 +26214,7 @@
               <w:rPr>
                 <w:sz w:val="18"/>
               </w:rPr>
-              <w:t xml:space="preserve">Access needs a data use agreement with TUAB's maintainers (§5.5.3), which we did not have.</w:t>
+              <w:t xml:space="preserve">Not run in the time left before submission; the three-seed twin ensemble is the reference behind every reported TUAB and stroke pre-training gain.</w:t>
             </w:r>
           </w:p>
         </w:tc>
@@ -25931,7 +26228,7 @@
               <w:rPr>
                 <w:sz w:val="18"/>
               </w:rPr>
-              <w:t xml:space="preserve">TUAB numbers are restricted to this submission (§5.5.3); a licensed evaluation is listed as future work.</w:t>
+              <w:t xml:space="preserve">Experiment 6's multi-run bootstrap resamples the three seeds as a level of its own (Table 24), so their variation enters the interval, if coarsely.</w:t>
             </w:r>
           </w:p>
         </w:tc>
@@ -25950,7 +26247,7 @@
               <w:rPr>
                 <w:sz w:val="18"/>
               </w:rPr>
-              <w:t xml:space="preserve">A container image (e.g. Docker)</w:t>
+              <w:t xml:space="preserve">Repeated, deterministic runs of the Fig-3 attentive head (Experiment 1)</w:t>
             </w:r>
           </w:p>
         </w:tc>
@@ -25964,7 +26261,7 @@
               <w:rPr>
                 <w:sz w:val="18"/>
               </w:rPr>
-              <w:t xml:space="preserve">Not built in the time available.</w:t>
+              <w:t xml:space="preserve">No conclusion depends on that head's exact value; the argument uses the linear probe and the §4.2 head, which is bit-identical across re-runs.</w:t>
             </w:r>
           </w:p>
         </w:tc>
@@ -25978,7 +26275,7 @@
               <w:rPr>
                 <w:sz w:val="18"/>
               </w:rPr>
-              <w:t xml:space="preserve">docs/act0_repro/ pins all 111 Python packages and records Python, PyTorch, CUDA, cuDNN, GPU driver and OS (Table 18).</w:t>
+              <w:t xml:space="preserve">Both runs are reported (72.1 and 68.7) and Table 7 uses the re-run.</w:t>
             </w:r>
           </w:p>
         </w:tc>
@@ -25997,7 +26294,7 @@
               <w:rPr>
                 <w:sz w:val="18"/>
               </w:rPr>
-              <w:t xml:space="preserve">Saved embeddings (emb_*.npz, about 446 MB)</w:t>
+              <w:t xml:space="preserve">Evaluation on the licensed TUAB release</w:t>
             </w:r>
           </w:p>
         </w:tc>
@@ -26011,7 +26308,7 @@
               <w:rPr>
                 <w:sz w:val="18"/>
               </w:rPr>
-              <w:t xml:space="preserve">Too large for the repository; each is a forward pass of a published checkpoint or of a seeded random-init twin.</w:t>
+              <w:t xml:space="preserve">Access needs a data use agreement with TUAB's maintainers (§5.5.3), which we did not have.</w:t>
             </w:r>
           </w:p>
         </w:tc>
@@ -26025,7 +26322,7 @@
               <w:rPr>
                 <w:sz w:val="18"/>
               </w:rPr>
-              <w:t xml:space="preserve">The repository holds the per-recording predictions (preds_*.npz, oof_*.npz, kf5_lpo_*.npz, 7.3 MB) behind every reported score, plus the checkpoints that regenerate the embeddings.</w:t>
+              <w:t xml:space="preserve">TUAB numbers are restricted to this submission (§5.5.3); a licensed evaluation is listed as future work.</w:t>
             </w:r>
           </w:p>
         </w:tc>
@@ -26044,7 +26341,7 @@
               <w:rPr>
                 <w:sz w:val="18"/>
               </w:rPr>
-              <w:t xml:space="preserve">An equivalence test between FEI+GTJ and BSI on stroke (Experiment 8)</w:t>
+              <w:t xml:space="preserve">A container image (e.g. Docker)</w:t>
             </w:r>
           </w:p>
         </w:tc>
@@ -26058,7 +26355,7 @@
               <w:rPr>
                 <w:sz w:val="18"/>
               </w:rPr>
-              <w:t xml:space="preserve">No equivalence margin was set in advance, and with 15 subjects the 95% CI of the difference (−0.240 to 0.280) is far wider than any useful margin.</w:t>
+              <w:t xml:space="preserve">Not built in the time available.</w:t>
             </w:r>
           </w:p>
         </w:tc>
@@ -26072,7 +26369,7 @@
               <w:rPr>
                 <w:sz w:val="18"/>
               </w:rPr>
-              <w:t xml:space="preserve">The two are reported as not separable, not as equivalent.</w:t>
+              <w:t xml:space="preserve">docs/act0_repro/ pins all 111 Python packages and records Python, PyTorch, CUDA, cuDNN, GPU driver and OS (Table 18).</w:t>
             </w:r>
           </w:p>
         </w:tc>
@@ -26091,7 +26388,7 @@
               <w:rPr>
                 <w:sz w:val="18"/>
               </w:rPr>
-              <w:t xml:space="preserve">The spectral-matching recipe, frozen, on a new stroke cohort (Experiment 8)</w:t>
+              <w:t xml:space="preserve">Saved embeddings (emb_*.npz, about 446 MB)</w:t>
             </w:r>
           </w:p>
         </w:tc>
@@ -26105,7 +26402,7 @@
               <w:rPr>
                 <w:sz w:val="18"/>
               </w:rPr>
-              <w:t xml:space="preserve">We had no second stroke EEG cohort within the project.</w:t>
+              <w:t xml:space="preserve">Too large for the repository; each is a forward pass of a published checkpoint or of a seeded random-init twin.</w:t>
             </w:r>
           </w:p>
         </w:tc>
@@ -26119,7 +26416,7 @@
               <w:rPr>
                 <w:sz w:val="18"/>
               </w:rPr>
-              <w:t xml:space="preserve">Experiment 8 is reported as a post-hoc repair on the cohort that prompted it; external validation is future work.</w:t>
+              <w:t xml:space="preserve">The repository holds the per-recording predictions (preds_*.npz, oof_*.npz, kf5_lpo_*.npz, 7.3 MB) behind every reported score, plus the checkpoints that regenerate the embeddings.</w:t>
             </w:r>
           </w:p>
         </w:tc>
@@ -26138,6 +26435,100 @@
               <w:rPr>
                 <w:sz w:val="18"/>
               </w:rPr>
+              <w:t xml:space="preserve">An equivalence test between FEI+GTJ and BSI on stroke (Experiment 8)</w:t>
+            </w:r>
+          </w:p>
+        </w:tc>
+        <w:tc>
+          <w:tcPr>
+            <w:tcW w:type="dxa" w:w="3400"/>
+          </w:tcPr>
+          <w:p>
+            <w:r/>
+            <w:r>
+              <w:rPr>
+                <w:sz w:val="18"/>
+              </w:rPr>
+              <w:t xml:space="preserve">No equivalence margin was set in advance, and with 15 subjects the 95% CI of the difference (−0.240 to 0.280) is far wider than any useful margin.</w:t>
+            </w:r>
+          </w:p>
+        </w:tc>
+        <w:tc>
+          <w:tcPr>
+            <w:tcW w:type="dxa" w:w="3211"/>
+          </w:tcPr>
+          <w:p>
+            <w:r/>
+            <w:r>
+              <w:rPr>
+                <w:sz w:val="18"/>
+              </w:rPr>
+              <w:t xml:space="preserve">The two are reported as not separable, not as equivalent.</w:t>
+            </w:r>
+          </w:p>
+        </w:tc>
+      </w:tr>
+      <w:tr>
+        <w:trPr>
+          <w:cantSplit/>
+        </w:trPr>
+        <w:tc>
+          <w:tcPr>
+            <w:tcW w:type="dxa" w:w="2300"/>
+          </w:tcPr>
+          <w:p>
+            <w:r/>
+            <w:r>
+              <w:rPr>
+                <w:sz w:val="18"/>
+              </w:rPr>
+              <w:t xml:space="preserve">The spectral-matching recipe, frozen, on a new stroke cohort (Experiment 8)</w:t>
+            </w:r>
+          </w:p>
+        </w:tc>
+        <w:tc>
+          <w:tcPr>
+            <w:tcW w:type="dxa" w:w="3400"/>
+          </w:tcPr>
+          <w:p>
+            <w:r/>
+            <w:r>
+              <w:rPr>
+                <w:sz w:val="18"/>
+              </w:rPr>
+              <w:t xml:space="preserve">We had no second stroke EEG cohort within the project.</w:t>
+            </w:r>
+          </w:p>
+        </w:tc>
+        <w:tc>
+          <w:tcPr>
+            <w:tcW w:type="dxa" w:w="3211"/>
+          </w:tcPr>
+          <w:p>
+            <w:r/>
+            <w:r>
+              <w:rPr>
+                <w:sz w:val="18"/>
+              </w:rPr>
+              <w:t xml:space="preserve">Experiment 8 is reported as a post-hoc repair on the cohort that prompted it; external validation is future work.</w:t>
+            </w:r>
+          </w:p>
+        </w:tc>
+      </w:tr>
+      <w:tr>
+        <w:trPr>
+          <w:cantSplit/>
+        </w:trPr>
+        <w:tc>
+          <w:tcPr>
+            <w:tcW w:type="dxa" w:w="2300"/>
+          </w:tcPr>
+          <w:p>
+            <w:r/>
+            <w:r>
+              <w:rPr>
+                <w:sz w:val="18"/>
+              </w:rPr>
               <w:t xml:space="preserve">An archived release with a DOI</w:t>
             </w:r>
           </w:p>
@@ -26152,7 +26543,7 @@
               <w:rPr>
                 <w:sz w:val="18"/>
               </w:rPr>
-              <w:t xml:space="preserve">The repository is private for now, and a DOI archive (Zenodo, for example) is public.</w:t>
+              <w:t xml:space="preserve">The repository is private because it holds results from our unofficial TUAB copy (§5.5.3), and a DOI archive (Zenodo, for example) is public.</w:t>
             </w:r>
           </w:p>
         </w:tc>
@@ -26166,7 +26557,7 @@
               <w:rPr>
                 <w:sz w:val="18"/>
               </w:rPr>
-              <w:t xml:space="preserve">§7.2 gives the full 40-character commit SHA, which fixes the exact code, checkpoints and results.</w:t>
+              <w:t xml:space="preserve">§7.2 gives the full 40-character commit SHA, which fixes the exact code, checkpoints and results; course examiners can be given read access to it.</w:t>
             </w:r>
           </w:p>
         </w:tc>
@@ -26188,7 +26579,7 @@
         <w:rPr>
           <w:b w:val="0"/>
         </w:rPr>
-        <w:t>Every encoder pre-trained for this report uses the recipe below. None of the runs uses a learning-rate schedule, mixed precision, gradient clipping or PyTorch's deterministic-algorithm flags, and each keeps its final (60th) epoch's weights, with no checkpoint selection. cuDNN kernels were left non-deterministic, so even the seeded runs are not bit-identical on a re-run. Random-init twins are built from the same architectures with torch seed = twin index (seeds 0–2 on TUAB and stroke, 0–4 on NMT).</w:t>
+        <w:t>Every encoder pre-trained for this report uses the recipe below. None of the runs uses a learning-rate schedule, mixed precision, gradient clipping or PyTorch's deterministic-algorithm flags, and each keeps its final (60th) epoch's weights, with no checkpoint selection. cuDNN kernels were left non-deterministic, so even the seeded runs are not bit-identical on a re-run. Random-init twins are built from the same architectures with torch seed = twin index (seeds 0–2 on TUAB and stroke, 0–4 on NMT); Experiment 6's multi-run bootstrap resamples the three TUAB seeds (Table 24).</w:t>
       </w:r>
     </w:p>
     <w:p>
@@ -26433,7 +26824,7 @@
               <w:rPr>
                 <w:sz w:val="18"/>
               </w:rPr>
-              <w:t xml:space="preserve">FEI and GTJ replicates 1 and 2 (Experiment 5, Table 20)</w:t>
+              <w:t xml:space="preserve">FEI and GTJ replicates 1 and 2 (Experiment 5, Table 20; FEI also in Experiment 6, both in Experiment 8)</w:t>
             </w:r>
           </w:p>
         </w:tc>
@@ -26494,6 +26885,67 @@
               <w:rPr>
                 <w:sz w:val="18"/>
               </w:rPr>
+              <w:t xml:space="preserve">FEI replicates 3 and 4 (Experiment 6 only)</w:t>
+            </w:r>
+          </w:p>
+        </w:tc>
+        <w:tc>
+          <w:tcPr>
+            <w:tcW w:type="dxa" w:w="2600"/>
+          </w:tcPr>
+          <w:p>
+            <w:r/>
+            <w:r>
+              <w:rPr>
+                <w:sz w:val="18"/>
+              </w:rPr>
+              <w:t xml:space="preserve">As for replicates 1 and 2</w:t>
+            </w:r>
+          </w:p>
+        </w:tc>
+        <w:tc>
+          <w:tcPr>
+            <w:tcW w:type="dxa" w:w="1900"/>
+          </w:tcPr>
+          <w:p>
+            <w:r/>
+            <w:r>
+              <w:rPr>
+                <w:sz w:val="18"/>
+              </w:rPr>
+              <w:t xml:space="preserve">As for FEI</w:t>
+            </w:r>
+          </w:p>
+        </w:tc>
+        <w:tc>
+          <w:tcPr>
+            <w:tcW w:type="dxa" w:w="2511"/>
+          </w:tcPr>
+          <w:p>
+            <w:r/>
+            <w:r>
+              <w:rPr>
+                <w:sz w:val="18"/>
+              </w:rPr>
+              <w:t xml:space="preserve">python code/tuab_fei_reps.py → fei_rep{3,4}_enc_cv_s0_f{k}.pt</w:t>
+            </w:r>
+          </w:p>
+        </w:tc>
+      </w:tr>
+      <w:tr>
+        <w:trPr>
+          <w:cantSplit/>
+        </w:trPr>
+        <w:tc>
+          <w:tcPr>
+            <w:tcW w:type="dxa" w:w="1900"/>
+          </w:tcPr>
+          <w:p>
+            <w:r/>
+            <w:r>
+              <w:rPr>
+                <w:sz w:val="18"/>
+              </w:rPr>
               <w:t xml:space="preserve">FEI and GTJ, joint NMT+TUAB (Experiment 6)</w:t>
             </w:r>
           </w:p>
@@ -26537,6 +26989,67 @@
                 <w:sz w:val="18"/>
               </w:rPr>
               <w:t xml:space="preserve">python code/feic_joint.py → fei_joint_enc_cv_s0_f{k}.pt, branchC_h20_joint_enc_cv_s0_f{k}.pt</w:t>
+            </w:r>
+          </w:p>
+        </w:tc>
+      </w:tr>
+      <w:tr>
+        <w:trPr>
+          <w:cantSplit/>
+        </w:trPr>
+        <w:tc>
+          <w:tcPr>
+            <w:tcW w:type="dxa" w:w="1900"/>
+          </w:tcPr>
+          <w:p>
+            <w:r/>
+            <w:r>
+              <w:rPr>
+                <w:sz w:val="18"/>
+              </w:rPr>
+              <w:t xml:space="preserve">FEI and GTJ, joint NMT+TUAB, replicates 1 and 2 (Experiment 6)</w:t>
+            </w:r>
+          </w:p>
+        </w:tc>
+        <w:tc>
+          <w:tcPr>
+            <w:tcW w:type="dxa" w:w="2600"/>
+          </w:tcPr>
+          <w:p>
+            <w:r/>
+            <w:r>
+              <w:rPr>
+                <w:sz w:val="18"/>
+              </w:rPr>
+              <w:t xml:space="preserve">As for the joint encoders; torch, NumPy and Python random seeded with 100 × replicate + fold</w:t>
+            </w:r>
+          </w:p>
+        </w:tc>
+        <w:tc>
+          <w:tcPr>
+            <w:tcW w:type="dxa" w:w="1900"/>
+          </w:tcPr>
+          <w:p>
+            <w:r/>
+            <w:r>
+              <w:rPr>
+                <w:sz w:val="18"/>
+              </w:rPr>
+              <w:t xml:space="preserve">As above</w:t>
+            </w:r>
+          </w:p>
+        </w:tc>
+        <w:tc>
+          <w:tcPr>
+            <w:tcW w:type="dxa" w:w="2511"/>
+          </w:tcPr>
+          <w:p>
+            <w:r/>
+            <w:r>
+              <w:rPr>
+                <w:sz w:val="18"/>
+              </w:rPr>
+              <w:t xml:space="preserve">python code/tuab_feic_joint_reps.py → fei_joint_rep{r}_enc_cv_s0_f{k}.pt, branchC_h20_joint_rep{r}_enc_cv_s0_f{k}.pt</w:t>
             </w:r>
           </w:p>
         </w:tc>
@@ -26748,7 +27261,7 @@
               <w:rPr>
                 <w:sz w:val="18"/>
               </w:rPr>
-              <w:t xml:space="preserve">Released vs random-weight ViT-M across the five training subsets</w:t>
+              <w:t xml:space="preserve">Mean pre-training gain over several pre-training runs (Δ AUROC)</w:t>
             </w:r>
           </w:p>
         </w:tc>
@@ -26762,7 +27275,7 @@
               <w:rPr>
                 <w:sz w:val="18"/>
               </w:rPr>
-              <w:t xml:space="preserve">Two-sided Mann–Whitney U on the per-subset AUROCs</w:t>
+              <w:t xml:space="preserve">Multilevel bootstrap, 2,000 resamples, seed 0: each resample draws, with replacement, the pre-training runs, the random-init twin's three seeds (re-ensembled) and the test recordings; Δ = mean AUROC of the drawn runs minus the drawn twin ensemble's AUROC; CI from the percentiles of Δ, p = share with Δ ≤ 0 (pooled() in code/tuab_fei_reps.py). Against the released ViT-M, one fixed model, only runs and recordings are drawn.</w:t>
             </w:r>
           </w:p>
         </w:tc>
@@ -26776,7 +27289,148 @@
               <w:rPr>
                 <w:sz w:val="18"/>
               </w:rPr>
+              <w:t xml:space="preserve">Experiment 6 (five NMT-only FEI runs; three adapted runs)</w:t>
+            </w:r>
+          </w:p>
+        </w:tc>
+      </w:tr>
+      <w:tr>
+        <w:trPr>
+          <w:cantSplit/>
+        </w:trPr>
+        <w:tc>
+          <w:tcPr>
+            <w:tcW w:type="dxa" w:w="2200"/>
+          </w:tcPr>
+          <w:p>
+            <w:r/>
+            <w:r>
+              <w:rPr>
+                <w:sz w:val="18"/>
+              </w:rPr>
+              <w:t xml:space="preserve">Pre-training re-runs on the stroke cohort</w:t>
+            </w:r>
+          </w:p>
+        </w:tc>
+        <w:tc>
+          <w:tcPr>
+            <w:tcW w:type="dxa" w:w="3700"/>
+          </w:tcPr>
+          <w:p>
+            <w:r/>
+            <w:r>
+              <w:rPr>
+                <w:sz w:val="18"/>
+              </w:rPr>
+              <w:t xml:space="preserve">Each run scored on its own with the paired bootstrap over the same 15 subjects; runs are not pooled, so their spread (seed variation) stays separate from subject-level uncertainty.</w:t>
+            </w:r>
+          </w:p>
+        </w:tc>
+        <w:tc>
+          <w:tcPr>
+            <w:tcW w:type="dxa" w:w="3011"/>
+          </w:tcPr>
+          <w:p>
+            <w:r/>
+            <w:r>
+              <w:rPr>
+                <w:sz w:val="18"/>
+              </w:rPr>
+              <w:t xml:space="preserve">Experiment 8</w:t>
+            </w:r>
+          </w:p>
+        </w:tc>
+      </w:tr>
+      <w:tr>
+        <w:trPr>
+          <w:cantSplit/>
+        </w:trPr>
+        <w:tc>
+          <w:tcPr>
+            <w:tcW w:type="dxa" w:w="2200"/>
+          </w:tcPr>
+          <w:p>
+            <w:r/>
+            <w:r>
+              <w:rPr>
+                <w:sz w:val="18"/>
+              </w:rPr>
+              <w:t xml:space="preserve">Released vs random-weight ViT-M</w:t>
+            </w:r>
+          </w:p>
+        </w:tc>
+        <w:tc>
+          <w:tcPr>
+            <w:tcW w:type="dxa" w:w="3700"/>
+          </w:tcPr>
+          <w:p>
+            <w:r/>
+            <w:r>
+              <w:rPr>
+                <w:sz w:val="18"/>
+              </w:rPr>
+              <w:t xml:space="preserve">One-sided exact Mann–Whitney U on per-run final AUROCs: 5 released-checkpoint runs (one head per training subset, s0–s4) against 3 random-weight runs (s0–s2, each with its own random weights, torch seed = subset number). Alternative: released below random in Experiment 1, above random in Experiment 4. With 5 and 3 runs the smallest possible p is 1/56 = 0.018; two-sided p-values are twice the one-sided ones.</w:t>
+            </w:r>
+          </w:p>
+        </w:tc>
+        <w:tc>
+          <w:tcPr>
+            <w:tcW w:type="dxa" w:w="3011"/>
+          </w:tcPr>
+          <w:p>
+            <w:r/>
+            <w:r>
+              <w:rPr>
+                <w:sz w:val="18"/>
+              </w:rPr>
               <w:t xml:space="preserve">Experiments 1 and 4</w:t>
+            </w:r>
+          </w:p>
+        </w:tc>
+      </w:tr>
+      <w:tr>
+        <w:trPr>
+          <w:cantSplit/>
+        </w:trPr>
+        <w:tc>
+          <w:tcPr>
+            <w:tcW w:type="dxa" w:w="2200"/>
+          </w:tcPr>
+          <w:p>
+            <w:r/>
+            <w:r>
+              <w:rPr>
+                <w:sz w:val="18"/>
+              </w:rPr>
+              <w:t xml:space="preserve">Fine-tuned vs from-scratch ViT-M on the same five training subsets</w:t>
+            </w:r>
+          </w:p>
+        </w:tc>
+        <w:tc>
+          <w:tcPr>
+            <w:tcW w:type="dxa" w:w="3700"/>
+          </w:tcPr>
+          <w:p>
+            <w:r/>
+            <w:r>
+              <w:rPr>
+                <w:sz w:val="18"/>
+              </w:rPr>
+              <w:t xml:space="preserve">Two-sided paired t-test and Wilcoxon signed-rank over the 5 subsets. Any two subsets share 98–134 of their 546 recordings, which both tests ignore, so their p-values lean small; at p = 0.81 that cannot change the conclusion.</w:t>
+            </w:r>
+          </w:p>
+        </w:tc>
+        <w:tc>
+          <w:tcPr>
+            <w:tcW w:type="dxa" w:w="3011"/>
+          </w:tcPr>
+          <w:p>
+            <w:r/>
+            <w:r>
+              <w:rPr>
+                <w:sz w:val="18"/>
+              </w:rPr>
+              <w:t xml:space="preserve">Experiment 2</w:t>
             </w:r>
           </w:p>
         </w:tc>
@@ -27340,7 +27994,7 @@
               <w:rPr>
                 <w:sz w:val="18"/>
               </w:rPr>
-              <w:t xml:space="preserve">The five NMT-only fold encoders of Experiment 5</w:t>
+              <w:t xml:space="preserve">The NMT-only FEI fold encoders of Experiment 5's three pre-training runs, plus two further FEI-only runs</w:t>
             </w:r>
           </w:p>
         </w:tc>
@@ -27401,7 +28055,7 @@
               <w:rPr>
                 <w:sz w:val="18"/>
               </w:rPr>
-              <w:t xml:space="preserve">NMT training fold plus TUAB's 2,717 unlabelled training recordings</w:t>
+              <w:t xml:space="preserve">NMT training fold plus TUAB's 2,717 unlabelled training recordings (three pre-training runs)</w:t>
             </w:r>
           </w:p>
         </w:tc>
@@ -27523,7 +28177,7 @@
               <w:rPr>
                 <w:sz w:val="18"/>
               </w:rPr>
-              <w:t xml:space="preserve">The NMT-only fold encoders of Experiment 5; released ViT-M</w:t>
+              <w:t xml:space="preserve">The NMT-only fold encoders of Experiment 5 (all three pre-training runs); released ViT-M</w:t>
             </w:r>
           </w:p>
         </w:tc>

</xml_diff>

<commit_message>
Act 0 report round 15d: adapted FEI's own gain over its twin; "no better" wording
The adapted (NMT+TUAB-unlabelled) FEI encoder stays above its random-init twin in all three runs (+0.038 averaged,
95% CI [-0.0003, 0.104]); the report now says so and scopes "no adapted gain" to GTJ and FEI+GTJ. Code, checkpoints
and results unchanged (commit d9cfacc).
</commit_message>
<xml_diff>
--- a/docs/Act0_Final_Report.docx
+++ b/docs/Act0_Final_Report.docx
@@ -6865,7 +6865,7 @@
         <w:rPr>
           <w:b w:val="0"/>
         </w:rPr>
-        <w:t xml:space="preserve"> on five-fold cross-validation on the NMT dataset (2,417 recordings). Averaged over that run and two independently seeded re-runs it scores 0.861, ahead of a classical hand-crafted band-power baseline scored on the identical folds (0.786 ± 0.009; better in all 5 folds, Holm-corrected p = 0.029). An untrained twin of the same fused architecture, averaged over five random seeds, already reaches 0.834, though, so most of that margin comes from the architecture: pre-training adds +0.027 AUROC (0.861 against 0.834), better in all 5 folds but not statistically significant after correction. On a completely different hospital's data (TUAB), FEI pre-trained on NMT alone, with no TUAB recording in its pre-training (only the linear classifier on top is trained on labelled TUAB data), scored above a random-weight twin by +0.048 (95% CI [0.015, 0.108], p = 0.0055) AUROC, averaged over five independently seeded pre-training runs scored on the same test set, with runs, random-init seeds and test recordings resampled together (the original run alone: +0.059, p = 0.002). GTJ did not survive that NMT-only transfer (0.840 vs 0.863 for its random twin), so we also re-pre-trained both encoders on NMT plus TUAB's unlabelled training recordings: the fused model then scored close to the released ViT-M checkpoint under our linear probe (0.862 vs 0.838, difference not significant) and beat band power (0.757), but did no better than its own random-weight twin (0.861), in any of three pre-training runs. We then took the NMT-only encoders to a third, unrelated task: telling stroke patients apart from healthy controls in a small resting-state EEG cohort. There, after a spectrum-matching step we designed post hoc on this same cohort (the input fixed in advance gave 0.833), FEI+GTJ scored close to the clinical Brain Symmetry Index (BSI) baseline (0.926 vs 0.907 AUROC, leave-one-subject-out: a model is validated on one subject it never saw any data from, repeated once per subject). With 15 subjects that difference is far too uncertain to show either superiority or equivalence. Two seeded re-runs of its NMT pre-training scored 0.963 and 0.981 on the same 15 subjects: a check on the pre-training seed, not a larger sample.</w:t>
+        <w:t xml:space="preserve"> on five-fold cross-validation on the NMT dataset (2,417 recordings). Averaged over that run and two independently seeded re-runs it scores 0.861, ahead of a classical hand-crafted band-power baseline scored on the identical folds (0.786 ± 0.009; better in all 5 folds, Holm-corrected p = 0.029). An untrained twin of the same fused architecture, averaged over five random seeds, already reaches 0.834, though, so most of that margin comes from the architecture: pre-training adds +0.027 AUROC (0.861 against 0.834), better in all 5 folds but not statistically significant after correction. On a completely different hospital's data (TUAB), FEI pre-trained on NMT alone, with no TUAB recording in its pre-training (only the linear classifier on top is trained on labelled TUAB data), scored above a random-weight twin by +0.048 (95% CI [0.015, 0.108], p = 0.0055) AUROC, averaged over five independently seeded pre-training runs scored on the same test set, with runs, random-init seeds and test recordings resampled together (the original run alone: +0.059, p = 0.002). GTJ did not survive that NMT-only transfer (0.840 vs 0.863 for its random twin), so we also re-pre-trained both encoders on NMT plus TUAB's unlabelled training recordings: the fused model then scored close to the released ViT-M checkpoint under our linear probe (0.862 vs 0.838, difference not significant) and beat band power (0.757), but was not significantly better than its own random-weight twin (0.861) in any of three pre-training runs. We then took the NMT-only encoders to a third, unrelated task: telling stroke patients apart from healthy controls in a small resting-state EEG cohort. There, after a spectrum-matching step we designed post hoc on this same cohort (the input fixed in advance gave 0.833), FEI+GTJ scored close to the clinical Brain Symmetry Index (BSI) baseline (0.926 vs 0.907 AUROC, leave-one-subject-out: a model is validated on one subject it never saw any data from, repeated once per subject). With 15 subjects that difference is far too uncertain to show either superiority or equivalence. Two seeded re-runs of its NMT pre-training scored 0.963 and 0.981 on the same 15 subjects: a check on the pre-training seed, not a larger sample.</w:t>
       </w:r>
     </w:p>
     <w:p>
@@ -18510,7 +18510,7 @@
         <w:rPr>
           <w:b w:val="0"/>
         </w:rPr>
-        <w:t>GTJ is the more sobering half of the same table. Adapted GTJ vs. its random twin is −0.005 (p = 0.642, not significant), adapted FEI+GTJ vs. its random twin is only +0.001 (p = 0.455), and NMT-only GTJ is below its twin outright (0.840 vs 0.863). Two seeded re-runs of the adapted pre-training tell the same story: GTJ −0.017 (p = 0.879) and −0.023 (p = 0.944), FEI+GTJ −0.010 (p = 0.734) and −0.006 (p = 0.665) against the same twins, and the bootstrap over the three runs, the twins' random-init seeds and the test recordings gives −0.015 (95% CI [−0.040, 0.031], p = 0.671) for GTJ and −0.005 (95% CI [−0.033, 0.043], p = 0.431) for FEI+GTJ. No adapted pre-training gain appears in any of the three runs: consistent across three initialisations, which is not proof that none exists. The same collapse diagnostics as Experiment 3 show this isn't collapse in disguise: on the TUAB test recordings the adapted GTJ encoders of all three runs keep an embedding std of 0.33–0.39 (cosine 0.59–0.71), and every FEI encoder, NMT-only or adapted, re-runs included, 0.45–1.08 (0.64–0.84). NMT-only GTJ is the one compressed case (std 0.04–0.07, cosine 0.96–0.99, below every random-init twin's 0.11), far less so than the released checkpoint (Experiment 3) and in line with the spectrum shift described above. GTJ's spectrogram input and architecture are doing useful work on TUAB: the pre-training itself just isn't the reason why, a distinction the failure-axis analysis below returns to.</w:t>
+        <w:t>GTJ is the more sobering half of the same table. Adapted GTJ vs. its random twin is −0.005 (p = 0.642, not significant), adapted FEI+GTJ vs. its random twin is only +0.001 (p = 0.455), and NMT-only GTJ is below its twin outright (0.840 vs 0.863). Two seeded re-runs of the adapted pre-training tell the same story: GTJ −0.017 (p = 0.879) and −0.023 (p = 0.944), FEI+GTJ −0.010 (p = 0.734) and −0.006 (p = 0.665) against the same twins, and the bootstrap over the three runs, the twins' random-init seeds and the test recordings gives −0.015 (95% CI [−0.040, 0.031], p = 0.671) for GTJ and −0.005 (95% CI [−0.033, 0.043], p = 0.431) for FEI+GTJ. Neither adapted GTJ nor adapted FEI+GTJ shows a pre-training gain in any of the three runs: consistent across three initialisations, which is not proof that none exists. FEI on its own, from the same adapted pre-training runs, stays above its random-init twin in all three (AUROC 0.840–0.859): +0.046 (p = 0.0085), +0.027 (p = 0.113) and +0.041 (p = 0.020). The same bootstrap over runs, random-init seeds and test recordings gives +0.038 (95% CI [−0.0003, 0.104], p = 0.026; the interval only just reaches zero), a little below the NMT-only runs' +0.048. That gain does not show in the fused comparison: the fused model's twin contains random-init GTJ, which on its own already reaches 0.863, above all three adapted FEI runs. The same collapse diagnostics as Experiment 3 show this isn't collapse in disguise: on the TUAB test recordings the adapted GTJ encoders of all three runs keep an embedding std of 0.33–0.39 (cosine 0.59–0.71), and every FEI encoder, NMT-only or adapted, re-runs included, 0.45–1.08 (0.64–0.84). NMT-only GTJ is the one compressed case (std 0.04–0.07, cosine 0.96–0.99, below every random-init twin's 0.11), far less so than the released checkpoint (Experiment 3) and in line with the spectrum shift described above. GTJ's spectrogram input and architecture are doing useful work on TUAB: the pre-training itself just isn't the reason why, a distinction the failure-axis analysis below returns to.</w:t>
       </w:r>
     </w:p>
     <w:p>
@@ -22294,7 +22294,7 @@
         <w:rPr>
           <w:b w:val="0"/>
         </w:rPr>
-        <w:t>A recently published AI model, EEG-VJEPA, claimed to automatically tell healthy brain recordings apart from abnormal ones by adapting a video-understanding technique to EEG. Our team tested this claim and found that the publicly released version does not actually work as described: it gives almost the same answer for every patient. We could show this directly. We built two smaller models instead: one for frequency content and one for how a signal's rhythm changes over time. Together they beat a simple classical measurement on the dataset they were trained on (an untrained copy of the same design already does most of that) and score close to an established clinical measurement, with too few patients to tell the two apart, on a third task: telling stroke patients apart from healthy volunteers. On a different hospital's data, the frequency model's training still helped on its own, across five training runs. The rhythm model's training did not carry over, and retraining both models with that hospital's unlabelled recordings changed little: either way the combined model scored close to the released model and no better than an untrained copy of itself.</w:t>
+        <w:t>A recently published AI model, EEG-VJEPA, claimed to automatically tell healthy brain recordings apart from abnormal ones by adapting a video-understanding technique to EEG. Our team tested this claim and found that the publicly released version does not actually work as described: it gives almost the same answer for every patient. We could show this directly. We built two smaller models instead: one for frequency content and one for how a signal's rhythm changes over time. Together they beat a simple classical measurement on the dataset they were trained on (an untrained copy of the same design already does most of that) and score close to an established clinical measurement, with too few patients to tell the two apart, on a third task: telling stroke patients apart from healthy volunteers. On a different hospital's data, the frequency model's training still helped on its own, across five training runs. The rhythm model's training did not carry over, and retraining both models with that hospital's unlabelled recordings changed little: either way the combined model scored close to the released model and not measurably better than an untrained copy of itself.</w:t>
       </w:r>
     </w:p>
     <w:p>
@@ -22312,7 +22312,7 @@
         <w:rPr>
           <w:b w:val="0"/>
         </w:rPr>
-        <w:t>All code, saved model checkpoints, and saved per-recording predictions used to produce every number, table, and figure in this report are organized as a set of scripts, one per experiment (Table 5). Table 4 gives the script behind each experiment's input. The 200 Hz NMT copy that FEI and GTJ read (per-channel z-scored at NMT's native rate, stored as 2.5-second frames) was first written in August 2026 by a script that was not kept; we reconstructed its recipe as code/preprocess_nmt_200hz.py, which reproduces all 2,417 stored files byte for byte. From those inputs, pre-train an encoder (`fei_pretrain.py` or `fei_branchC.py`, both with a `--selftest` flag for a fast sanity check with no real data and a `--cv` flag for the full five-fold cross-validation reported here), score it with `feic_nmt_anchor.py` (Experiment 5) or `tuab_feic.py` (Experiment 6), and evaluate a frozen or fine-tuned released checkpoint with the corresponding `tuab_*_eval.py` script. Every long-running script checkpoints its progress after each cross-validation fold and can be safely re-run to resume after an interruption, and each accepts command-line flags for every experiment variant reported here. The code is in github.com/mashfiqurrahman2020-coder/EEG-VJEPA-act-0, a private repository because it holds results computed on our unofficial TUAB copy (§5.5.3); course examiners can be given read access to the exact commit below. Its docs/act0_repro/ folder holds the fold, subset and cohort lists, the SHA-256 of every checkpoint and result file, and the pinned environment (Appendix §11). The code, checkpoints and results behind this report are commit 424cae1cc560cff32f1128f50c066e8c2f8e5ee5, which unlike a tag cannot be moved: git clone https://github.com/mashfiqurrahman2020-coder/EEG-VJEPA-act-0.git, then git checkout 424cae1cc560, then pip install -r docs/act0_repro/requirements-act0.txt under Python 3.9. Appendix §11.6 gives the pre-training commands and §11.9 the data each experiment uses. The report itself is added one commit later, under the tag act0-report-round15c. All 70 FEI/GTJ checkpoints are committed in the repository (code/*.pt, about 180 MB), so nothing needs a separate download except the data and the released EEG-VJEPA weights. Two kinds of reproduction follow. The saved checkpoints and predictions reproduce every reported number exactly. Re-training does not: the original FEI and GTJ runs set no random seed, so they cannot be regenerated bit for bit, and cuDNN kernels were left non-deterministic, so even the seeded re-runs should be expected to reproduce the results statistically, not bit for bit.</w:t>
+        <w:t>All code, saved model checkpoints, and saved per-recording predictions used to produce every number, table, and figure in this report are organized as a set of scripts, one per experiment (Table 5). Table 4 gives the script behind each experiment's input. The 200 Hz NMT copy that FEI and GTJ read (per-channel z-scored at NMT's native rate, stored as 2.5-second frames) was first written in August 2026 by a script that was not kept; we reconstructed its recipe as code/preprocess_nmt_200hz.py, which reproduces all 2,417 stored files byte for byte. From those inputs, pre-train an encoder (`fei_pretrain.py` or `fei_branchC.py`, both with a `--selftest` flag for a fast sanity check with no real data and a `--cv` flag for the full five-fold cross-validation reported here), score it with `feic_nmt_anchor.py` (Experiment 5) or `tuab_feic.py` (Experiment 6), and evaluate a frozen or fine-tuned released checkpoint with the corresponding `tuab_*_eval.py` script. Every long-running script checkpoints its progress after each cross-validation fold and can be safely re-run to resume after an interruption, and each accepts command-line flags for every experiment variant reported here. The code is in github.com/mashfiqurrahman2020-coder/EEG-VJEPA-act-0, a private repository because it holds results computed on our unofficial TUAB copy (§5.5.3); course examiners can be given read access to the exact commit below. Its docs/act0_repro/ folder holds the fold, subset and cohort lists, the SHA-256 of every checkpoint and result file, and the pinned environment (Appendix §11). The code, checkpoints and results behind this report are commit 424cae1cc560cff32f1128f50c066e8c2f8e5ee5, which unlike a tag cannot be moved: git clone https://github.com/mashfiqurrahman2020-coder/EEG-VJEPA-act-0.git, then git checkout 424cae1cc560, then pip install -r docs/act0_repro/requirements-act0.txt under Python 3.9. Appendix §11.6 gives the pre-training commands and §11.9 the data each experiment uses. The report itself is in a later commit, under the tag act0-report-round15d. All 70 FEI/GTJ checkpoints are committed in the repository (code/*.pt, about 180 MB), so nothing needs a separate download except the data and the released EEG-VJEPA weights. Two kinds of reproduction follow. The saved checkpoints and predictions reproduce every reported number exactly. Re-training does not: the original FEI and GTJ runs set no random seed, so they cannot be regenerated bit for bit, and cuDNN kernels were left non-deterministic, so even the seeded re-runs should be expected to reproduce the results statistically, not bit for bit.</w:t>
       </w:r>
     </w:p>
     <w:p>

</xml_diff>

<commit_message>
Act 0 report round 15e: remove the program-outcome table from the front matter
56 pages. The PO letters stay on the section headings, as the course template requires; the acronym list says what they
mean. Code, checkpoints and results unchanged (commit d9cfacc).
</commit_message>
<xml_diff>
--- a/docs/Act0_Final_Report.docx
+++ b/docs/Act0_Final_Report.docx
@@ -5249,7 +5249,7 @@
               <w:rPr>
                 <w:sz w:val="18"/>
               </w:rPr>
-              <w:t xml:space="preserve">Program outcome (see the last table of this section)</w:t>
+              <w:t>Program outcome: the letter in a section heading, e.g. PO(d), names the course outcome that section addresses</w:t>
             </w:r>
           </w:p>
         </w:tc>
@@ -6110,665 +6110,6 @@
                 <w:sz w:val="18"/>
               </w:rPr>
               <w:t xml:space="preserve">Mean ± standard deviation, over folds, training subsets or seeds as each table states</w:t>
-            </w:r>
-          </w:p>
-        </w:tc>
-      </w:tr>
-    </w:tbl>
-    <w:p>
-      <w:pPr>
-        <w:keepNext/>
-        <w:spacing w:after="120" w:before="280"/>
-        <w:jc w:val="left"/>
-      </w:pPr>
-      <w:r>
-        <w:rPr>
-          <w:b/>
-          <w:sz w:val="24"/>
-        </w:rPr>
-        <w:t>Program outcomes (POs)</w:t>
-      </w:r>
-    </w:p>
-    <w:p>
-      <w:r>
-        <w:rPr>
-          <w:b w:val="0"/>
-        </w:rPr>
-        <w:t>Section headings mark which of the course's twelve program outcomes (POs) each section addresses; the short descriptions below are our own paraphrases.</w:t>
-      </w:r>
-    </w:p>
-    <w:tbl>
-      <w:tblPr>
-        <w:tblStyle w:val="TableGrid"/>
-        <w:tblW w:type="dxa" w:w="8911"/>
-        <w:tblLayout w:type="fixed"/>
-        <w:tblLook w:firstColumn="1" w:firstRow="1" w:lastColumn="0" w:lastRow="0" w:noHBand="0" w:noVBand="1" w:val="04A0"/>
-      </w:tblPr>
-      <w:tblGrid>
-        <w:gridCol w:w="900"/>
-        <w:gridCol w:w="6211"/>
-        <w:gridCol w:w="1800"/>
-      </w:tblGrid>
-      <w:tr>
-        <w:trPr>
-          <w:cantSplit/>
-          <w:tblHeader/>
-        </w:trPr>
-        <w:tc>
-          <w:tcPr>
-            <w:tcW w:type="dxa" w:w="900"/>
-          </w:tcPr>
-          <w:p>
-            <w:pPr>
-              <w:keepNext/>
-            </w:pPr>
-            <w:r/>
-            <w:r>
-              <w:rPr>
-                <w:b/>
-                <w:sz w:val="18"/>
-              </w:rPr>
-              <w:t xml:space="preserve">PO</w:t>
-            </w:r>
-          </w:p>
-        </w:tc>
-        <w:tc>
-          <w:tcPr>
-            <w:tcW w:type="dxa" w:w="6211"/>
-          </w:tcPr>
-          <w:p>
-            <w:pPr>
-              <w:keepNext/>
-            </w:pPr>
-            <w:r/>
-            <w:r>
-              <w:rPr>
-                <w:b/>
-                <w:sz w:val="18"/>
-              </w:rPr>
-              <w:t xml:space="preserve">Outcome (our paraphrase)</w:t>
-            </w:r>
-          </w:p>
-        </w:tc>
-        <w:tc>
-          <w:tcPr>
-            <w:tcW w:type="dxa" w:w="1800"/>
-          </w:tcPr>
-          <w:p>
-            <w:pPr>
-              <w:keepNext/>
-            </w:pPr>
-            <w:r/>
-            <w:r>
-              <w:rPr>
-                <w:b/>
-                <w:sz w:val="18"/>
-              </w:rPr>
-              <w:t xml:space="preserve">Section</w:t>
-            </w:r>
-          </w:p>
-        </w:tc>
-      </w:tr>
-      <w:tr>
-        <w:trPr>
-          <w:cantSplit/>
-        </w:trPr>
-        <w:tc>
-          <w:tcPr>
-            <w:tcW w:type="dxa" w:w="900"/>
-          </w:tcPr>
-          <w:p>
-            <w:r/>
-            <w:r>
-              <w:rPr>
-                <w:sz w:val="18"/>
-              </w:rPr>
-              <w:t xml:space="preserve">(a)</w:t>
-            </w:r>
-          </w:p>
-        </w:tc>
-        <w:tc>
-          <w:tcPr>
-            <w:tcW w:type="dxa" w:w="6211"/>
-          </w:tcPr>
-          <w:p>
-            <w:r/>
-            <w:r>
-              <w:rPr>
-                <w:sz w:val="18"/>
-              </w:rPr>
-              <w:t xml:space="preserve">Engineering knowledge: applying mathematics, science and engineering fundamentals to the problem</w:t>
-            </w:r>
-          </w:p>
-        </w:tc>
-        <w:tc>
-          <w:tcPr>
-            <w:tcW w:type="dxa" w:w="1800"/>
-          </w:tcPr>
-          <w:p>
-            <w:r/>
-            <w:r>
-              <w:rPr>
-                <w:sz w:val="18"/>
-              </w:rPr>
-              <w:t xml:space="preserve">§3.2</w:t>
-            </w:r>
-          </w:p>
-        </w:tc>
-      </w:tr>
-      <w:tr>
-        <w:trPr>
-          <w:cantSplit/>
-        </w:trPr>
-        <w:tc>
-          <w:tcPr>
-            <w:tcW w:type="dxa" w:w="900"/>
-          </w:tcPr>
-          <w:p>
-            <w:r/>
-            <w:r>
-              <w:rPr>
-                <w:sz w:val="18"/>
-              </w:rPr>
-              <w:t xml:space="preserve">(b)</w:t>
-            </w:r>
-          </w:p>
-        </w:tc>
-        <w:tc>
-          <w:tcPr>
-            <w:tcW w:type="dxa" w:w="6211"/>
-          </w:tcPr>
-          <w:p>
-            <w:r/>
-            <w:r>
-              <w:rPr>
-                <w:sz w:val="18"/>
-              </w:rPr>
-              <w:t xml:space="preserve">Problem analysis: identifying and formulating the problem from first principles and the literature</w:t>
-            </w:r>
-          </w:p>
-        </w:tc>
-        <w:tc>
-          <w:tcPr>
-            <w:tcW w:type="dxa" w:w="1800"/>
-          </w:tcPr>
-          <w:p>
-            <w:r/>
-            <w:r>
-              <w:rPr>
-                <w:sz w:val="18"/>
-              </w:rPr>
-              <w:t xml:space="preserve">§3.1</w:t>
-            </w:r>
-          </w:p>
-        </w:tc>
-      </w:tr>
-      <w:tr>
-        <w:trPr>
-          <w:cantSplit/>
-        </w:trPr>
-        <w:tc>
-          <w:tcPr>
-            <w:tcW w:type="dxa" w:w="900"/>
-          </w:tcPr>
-          <w:p>
-            <w:r/>
-            <w:r>
-              <w:rPr>
-                <w:sz w:val="18"/>
-              </w:rPr>
-              <w:t xml:space="preserve">(c)</w:t>
-            </w:r>
-          </w:p>
-        </w:tc>
-        <w:tc>
-          <w:tcPr>
-            <w:tcW w:type="dxa" w:w="6211"/>
-          </w:tcPr>
-          <w:p>
-            <w:r/>
-            <w:r>
-              <w:rPr>
-                <w:sz w:val="18"/>
-              </w:rPr>
-              <w:t xml:space="preserve">Design and development of solutions: a design that meets stated needs, with regard for health, safety, society and the environment</w:t>
-            </w:r>
-          </w:p>
-        </w:tc>
-        <w:tc>
-          <w:tcPr>
-            <w:tcW w:type="dxa" w:w="1800"/>
-          </w:tcPr>
-          <w:p>
-            <w:r/>
-            <w:r>
-              <w:rPr>
-                <w:sz w:val="18"/>
-              </w:rPr>
-              <w:t xml:space="preserve">§5.2</w:t>
-            </w:r>
-          </w:p>
-        </w:tc>
-      </w:tr>
-      <w:tr>
-        <w:trPr>
-          <w:cantSplit/>
-        </w:trPr>
-        <w:tc>
-          <w:tcPr>
-            <w:tcW w:type="dxa" w:w="900"/>
-          </w:tcPr>
-          <w:p>
-            <w:r/>
-            <w:r>
-              <w:rPr>
-                <w:sz w:val="18"/>
-              </w:rPr>
-              <w:t xml:space="preserve">(d)</w:t>
-            </w:r>
-          </w:p>
-        </w:tc>
-        <w:tc>
-          <w:tcPr>
-            <w:tcW w:type="dxa" w:w="6211"/>
-          </w:tcPr>
-          <w:p>
-            <w:r/>
-            <w:r>
-              <w:rPr>
-                <w:sz w:val="18"/>
-              </w:rPr>
-              <w:t xml:space="preserve">Investigation: research-based experiments, analysis and interpretation of data</w:t>
-            </w:r>
-          </w:p>
-        </w:tc>
-        <w:tc>
-          <w:tcPr>
-            <w:tcW w:type="dxa" w:w="1800"/>
-          </w:tcPr>
-          <w:p>
-            <w:r/>
-            <w:r>
-              <w:rPr>
-                <w:sz w:val="18"/>
-              </w:rPr>
-              <w:t xml:space="preserve">§5.3</w:t>
-            </w:r>
-          </w:p>
-        </w:tc>
-      </w:tr>
-      <w:tr>
-        <w:trPr>
-          <w:cantSplit/>
-        </w:trPr>
-        <w:tc>
-          <w:tcPr>
-            <w:tcW w:type="dxa" w:w="900"/>
-          </w:tcPr>
-          <w:p>
-            <w:r/>
-            <w:r>
-              <w:rPr>
-                <w:sz w:val="18"/>
-              </w:rPr>
-              <w:t xml:space="preserve">(e)</w:t>
-            </w:r>
-          </w:p>
-        </w:tc>
-        <w:tc>
-          <w:tcPr>
-            <w:tcW w:type="dxa" w:w="6211"/>
-          </w:tcPr>
-          <w:p>
-            <w:r/>
-            <w:r>
-              <w:rPr>
-                <w:sz w:val="18"/>
-              </w:rPr>
-              <w:t xml:space="preserve">Modern tool usage: choosing and using suitable tools, with their limits understood</w:t>
-            </w:r>
-          </w:p>
-        </w:tc>
-        <w:tc>
-          <w:tcPr>
-            <w:tcW w:type="dxa" w:w="1800"/>
-          </w:tcPr>
-          <w:p>
-            <w:r/>
-            <w:r>
-              <w:rPr>
-                <w:sz w:val="18"/>
-              </w:rPr>
-              <w:t xml:space="preserve">§5.4</w:t>
-            </w:r>
-          </w:p>
-        </w:tc>
-      </w:tr>
-      <w:tr>
-        <w:trPr>
-          <w:cantSplit/>
-        </w:trPr>
-        <w:tc>
-          <w:tcPr>
-            <w:tcW w:type="dxa" w:w="900"/>
-          </w:tcPr>
-          <w:p>
-            <w:r/>
-            <w:r>
-              <w:rPr>
-                <w:sz w:val="18"/>
-              </w:rPr>
-              <w:t xml:space="preserve">(f)</w:t>
-            </w:r>
-          </w:p>
-        </w:tc>
-        <w:tc>
-          <w:tcPr>
-            <w:tcW w:type="dxa" w:w="6211"/>
-          </w:tcPr>
-          <w:p>
-            <w:r/>
-            <w:r>
-              <w:rPr>
-                <w:sz w:val="18"/>
-              </w:rPr>
-              <w:t xml:space="preserve">The engineer and society: assessing societal, health, legal and cultural impact</w:t>
-            </w:r>
-          </w:p>
-        </w:tc>
-        <w:tc>
-          <w:tcPr>
-            <w:tcW w:type="dxa" w:w="1800"/>
-          </w:tcPr>
-          <w:p>
-            <w:r/>
-            <w:r>
-              <w:rPr>
-                <w:sz w:val="18"/>
-              </w:rPr>
-              <w:t xml:space="preserve">§5.5</w:t>
-            </w:r>
-          </w:p>
-        </w:tc>
-      </w:tr>
-      <w:tr>
-        <w:trPr>
-          <w:cantSplit/>
-        </w:trPr>
-        <w:tc>
-          <w:tcPr>
-            <w:tcW w:type="dxa" w:w="900"/>
-          </w:tcPr>
-          <w:p>
-            <w:r/>
-            <w:r>
-              <w:rPr>
-                <w:sz w:val="18"/>
-              </w:rPr>
-              <w:t xml:space="preserve">(g)</w:t>
-            </w:r>
-          </w:p>
-        </w:tc>
-        <w:tc>
-          <w:tcPr>
-            <w:tcW w:type="dxa" w:w="6211"/>
-          </w:tcPr>
-          <w:p>
-            <w:r/>
-            <w:r>
-              <w:rPr>
-                <w:sz w:val="18"/>
-              </w:rPr>
-              <w:t xml:space="preserve">Environment and sustainability: evaluating the work's sustainability and environmental impact</w:t>
-            </w:r>
-          </w:p>
-        </w:tc>
-        <w:tc>
-          <w:tcPr>
-            <w:tcW w:type="dxa" w:w="1800"/>
-          </w:tcPr>
-          <w:p>
-            <w:r/>
-            <w:r>
-              <w:rPr>
-                <w:sz w:val="18"/>
-              </w:rPr>
-              <w:t xml:space="preserve">§5.6</w:t>
-            </w:r>
-          </w:p>
-        </w:tc>
-      </w:tr>
-      <w:tr>
-        <w:trPr>
-          <w:cantSplit/>
-        </w:trPr>
-        <w:tc>
-          <w:tcPr>
-            <w:tcW w:type="dxa" w:w="900"/>
-          </w:tcPr>
-          <w:p>
-            <w:r/>
-            <w:r>
-              <w:rPr>
-                <w:sz w:val="18"/>
-              </w:rPr>
-              <w:t xml:space="preserve">(h)</w:t>
-            </w:r>
-          </w:p>
-        </w:tc>
-        <w:tc>
-          <w:tcPr>
-            <w:tcW w:type="dxa" w:w="6211"/>
-          </w:tcPr>
-          <w:p>
-            <w:r/>
-            <w:r>
-              <w:rPr>
-                <w:sz w:val="18"/>
-              </w:rPr>
-              <w:t xml:space="preserve">Ethics: applying ethical principles and professional responsibility</w:t>
-            </w:r>
-          </w:p>
-        </w:tc>
-        <w:tc>
-          <w:tcPr>
-            <w:tcW w:type="dxa" w:w="1800"/>
-          </w:tcPr>
-          <w:p>
-            <w:r/>
-            <w:r>
-              <w:rPr>
-                <w:sz w:val="18"/>
-              </w:rPr>
-              <w:t xml:space="preserve">§5.7</w:t>
-            </w:r>
-          </w:p>
-        </w:tc>
-      </w:tr>
-      <w:tr>
-        <w:trPr>
-          <w:cantSplit/>
-        </w:trPr>
-        <w:tc>
-          <w:tcPr>
-            <w:tcW w:type="dxa" w:w="900"/>
-          </w:tcPr>
-          <w:p>
-            <w:r/>
-            <w:r>
-              <w:rPr>
-                <w:sz w:val="18"/>
-              </w:rPr>
-              <w:t xml:space="preserve">(i)</w:t>
-            </w:r>
-          </w:p>
-        </w:tc>
-        <w:tc>
-          <w:tcPr>
-            <w:tcW w:type="dxa" w:w="6211"/>
-          </w:tcPr>
-          <w:p>
-            <w:r/>
-            <w:r>
-              <w:rPr>
-                <w:sz w:val="18"/>
-              </w:rPr>
-              <w:t xml:space="preserve">Individual work and teamwork: working effectively alone and as part of a team</w:t>
-            </w:r>
-          </w:p>
-        </w:tc>
-        <w:tc>
-          <w:tcPr>
-            <w:tcW w:type="dxa" w:w="1800"/>
-          </w:tcPr>
-          <w:p>
-            <w:r/>
-            <w:r>
-              <w:rPr>
-                <w:sz w:val="18"/>
-              </w:rPr>
-              <w:t xml:space="preserve">§6</w:t>
-            </w:r>
-          </w:p>
-        </w:tc>
-      </w:tr>
-      <w:tr>
-        <w:trPr>
-          <w:cantSplit/>
-        </w:trPr>
-        <w:tc>
-          <w:tcPr>
-            <w:tcW w:type="dxa" w:w="900"/>
-          </w:tcPr>
-          <w:p>
-            <w:r/>
-            <w:r>
-              <w:rPr>
-                <w:sz w:val="18"/>
-              </w:rPr>
-              <w:t xml:space="preserve">(j)</w:t>
-            </w:r>
-          </w:p>
-        </w:tc>
-        <w:tc>
-          <w:tcPr>
-            <w:tcW w:type="dxa" w:w="6211"/>
-          </w:tcPr>
-          <w:p>
-            <w:r/>
-            <w:r>
-              <w:rPr>
-                <w:sz w:val="18"/>
-              </w:rPr>
-              <w:t xml:space="preserve">Communication: communicating the work to stakeholders and the public</w:t>
-            </w:r>
-          </w:p>
-        </w:tc>
-        <w:tc>
-          <w:tcPr>
-            <w:tcW w:type="dxa" w:w="1800"/>
-          </w:tcPr>
-          <w:p>
-            <w:r/>
-            <w:r>
-              <w:rPr>
-                <w:sz w:val="18"/>
-              </w:rPr>
-              <w:t xml:space="preserve">§7</w:t>
-            </w:r>
-          </w:p>
-        </w:tc>
-      </w:tr>
-      <w:tr>
-        <w:trPr>
-          <w:cantSplit/>
-        </w:trPr>
-        <w:tc>
-          <w:tcPr>
-            <w:tcW w:type="dxa" w:w="900"/>
-          </w:tcPr>
-          <w:p>
-            <w:r/>
-            <w:r>
-              <w:rPr>
-                <w:sz w:val="18"/>
-              </w:rPr>
-              <w:t xml:space="preserve">(k)</w:t>
-            </w:r>
-          </w:p>
-        </w:tc>
-        <w:tc>
-          <w:tcPr>
-            <w:tcW w:type="dxa" w:w="6211"/>
-          </w:tcPr>
-          <w:p>
-            <w:r/>
-            <w:r>
-              <w:rPr>
-                <w:sz w:val="18"/>
-              </w:rPr>
-              <w:t xml:space="preserve">Project management and finance: planning time, compute and cost</w:t>
-            </w:r>
-          </w:p>
-        </w:tc>
-        <w:tc>
-          <w:tcPr>
-            <w:tcW w:type="dxa" w:w="1800"/>
-          </w:tcPr>
-          <w:p>
-            <w:r/>
-            <w:r>
-              <w:rPr>
-                <w:sz w:val="18"/>
-              </w:rPr>
-              <w:t xml:space="preserve">§8</w:t>
-            </w:r>
-          </w:p>
-        </w:tc>
-      </w:tr>
-      <w:tr>
-        <w:trPr>
-          <w:cantSplit/>
-        </w:trPr>
-        <w:tc>
-          <w:tcPr>
-            <w:tcW w:type="dxa" w:w="900"/>
-          </w:tcPr>
-          <w:p>
-            <w:r/>
-            <w:r>
-              <w:rPr>
-                <w:sz w:val="18"/>
-              </w:rPr>
-              <w:t xml:space="preserve">(l)</w:t>
-            </w:r>
-          </w:p>
-        </w:tc>
-        <w:tc>
-          <w:tcPr>
-            <w:tcW w:type="dxa" w:w="6211"/>
-          </w:tcPr>
-          <w:p>
-            <w:r/>
-            <w:r>
-              <w:rPr>
-                <w:sz w:val="18"/>
-              </w:rPr>
-              <w:t xml:space="preserve">Lifelong learning: recognising and planning the further learning the work calls for</w:t>
-            </w:r>
-          </w:p>
-        </w:tc>
-        <w:tc>
-          <w:tcPr>
-            <w:tcW w:type="dxa" w:w="1800"/>
-          </w:tcPr>
-          <w:p>
-            <w:r/>
-            <w:r>
-              <w:rPr>
-                <w:sz w:val="18"/>
-              </w:rPr>
-              <w:t xml:space="preserve">§9</w:t>
             </w:r>
           </w:p>
         </w:tc>
@@ -22312,7 +21653,7 @@
         <w:rPr>
           <w:b w:val="0"/>
         </w:rPr>
-        <w:t>All code, saved model checkpoints, and saved per-recording predictions used to produce every number, table, and figure in this report are organized as a set of scripts, one per experiment (Table 5). Table 4 gives the script behind each experiment's input. The 200 Hz NMT copy that FEI and GTJ read (per-channel z-scored at NMT's native rate, stored as 2.5-second frames) was first written in August 2026 by a script that was not kept; we reconstructed its recipe as code/preprocess_nmt_200hz.py, which reproduces all 2,417 stored files byte for byte. From those inputs, pre-train an encoder (`fei_pretrain.py` or `fei_branchC.py`, both with a `--selftest` flag for a fast sanity check with no real data and a `--cv` flag for the full five-fold cross-validation reported here), score it with `feic_nmt_anchor.py` (Experiment 5) or `tuab_feic.py` (Experiment 6), and evaluate a frozen or fine-tuned released checkpoint with the corresponding `tuab_*_eval.py` script. Every long-running script checkpoints its progress after each cross-validation fold and can be safely re-run to resume after an interruption, and each accepts command-line flags for every experiment variant reported here. The code is in github.com/mashfiqurrahman2020-coder/EEG-VJEPA-act-0, a private repository because it holds results computed on our unofficial TUAB copy (§5.5.3); course examiners can be given read access to the exact commit below. Its docs/act0_repro/ folder holds the fold, subset and cohort lists, the SHA-256 of every checkpoint and result file, and the pinned environment (Appendix §11). The code, checkpoints and results behind this report are commit 424cae1cc560cff32f1128f50c066e8c2f8e5ee5, which unlike a tag cannot be moved: git clone https://github.com/mashfiqurrahman2020-coder/EEG-VJEPA-act-0.git, then git checkout 424cae1cc560, then pip install -r docs/act0_repro/requirements-act0.txt under Python 3.9. Appendix §11.6 gives the pre-training commands and §11.9 the data each experiment uses. The report itself is in a later commit, under the tag act0-report-round15d. All 70 FEI/GTJ checkpoints are committed in the repository (code/*.pt, about 180 MB), so nothing needs a separate download except the data and the released EEG-VJEPA weights. Two kinds of reproduction follow. The saved checkpoints and predictions reproduce every reported number exactly. Re-training does not: the original FEI and GTJ runs set no random seed, so they cannot be regenerated bit for bit, and cuDNN kernels were left non-deterministic, so even the seeded re-runs should be expected to reproduce the results statistically, not bit for bit.</w:t>
+        <w:t>All code, saved model checkpoints, and saved per-recording predictions used to produce every number, table, and figure in this report are organized as a set of scripts, one per experiment (Table 5). Table 4 gives the script behind each experiment's input. The 200 Hz NMT copy that FEI and GTJ read (per-channel z-scored at NMT's native rate, stored as 2.5-second frames) was first written in August 2026 by a script that was not kept; we reconstructed its recipe as code/preprocess_nmt_200hz.py, which reproduces all 2,417 stored files byte for byte. From those inputs, pre-train an encoder (`fei_pretrain.py` or `fei_branchC.py`, both with a `--selftest` flag for a fast sanity check with no real data and a `--cv` flag for the full five-fold cross-validation reported here), score it with `feic_nmt_anchor.py` (Experiment 5) or `tuab_feic.py` (Experiment 6), and evaluate a frozen or fine-tuned released checkpoint with the corresponding `tuab_*_eval.py` script. Every long-running script checkpoints its progress after each cross-validation fold and can be safely re-run to resume after an interruption, and each accepts command-line flags for every experiment variant reported here. The code is in github.com/mashfiqurrahman2020-coder/EEG-VJEPA-act-0, a private repository because it holds results computed on our unofficial TUAB copy (§5.5.3); course examiners can be given read access to the exact commit below. Its docs/act0_repro/ folder holds the fold, subset and cohort lists, the SHA-256 of every checkpoint and result file, and the pinned environment (Appendix §11). The code, checkpoints and results behind this report are commit 424cae1cc560cff32f1128f50c066e8c2f8e5ee5, which unlike a tag cannot be moved: git clone https://github.com/mashfiqurrahman2020-coder/EEG-VJEPA-act-0.git, then git checkout 424cae1cc560, then pip install -r docs/act0_repro/requirements-act0.txt under Python 3.9. Appendix §11.6 gives the pre-training commands and §11.9 the data each experiment uses. The report itself is in a later commit, under the tag act0-report-round15e. All 70 FEI/GTJ checkpoints are committed in the repository (code/*.pt, about 180 MB), so nothing needs a separate download except the data and the released EEG-VJEPA weights. Two kinds of reproduction follow. The saved checkpoints and predictions reproduce every reported number exactly. Re-training does not: the original FEI and GTJ runs set no random seed, so they cannot be regenerated bit for bit, and cuDNN kernels were left non-deterministic, so even the seeded re-runs should be expected to reproduce the results statistically, not bit for bit.</w:t>
       </w:r>
     </w:p>
     <w:p>

</xml_diff>

<commit_message>
Report round 15f: drop PO letters from headings; ToC page numbers re-checked
Removes the " (PO(x))" suffix from the 12 section headings and their ToC
entries, and the PO row of the acronym table. The ToC page numbers are now
checked against the exported PDF itself (the checker had been reading an
older copy), so 35 entries from 3.3 onward moved by 1-3 pages.
</commit_message>
<xml_diff>
--- a/docs/Act0_Final_Report.docx
+++ b/docs/Act0_Final_Report.docx
@@ -3139,7 +3139,7 @@
           <w:b w:val="0"/>
           <w:sz w:val="19"/>
         </w:rPr>
-        <w:t>3.1  Problem Formulation (PO(b))</w:t>
+        <w:t>3.1  Problem Formulation</w:t>
         <w:tab/>
         <w:t>3</w:t>
       </w:r>
@@ -3158,7 +3158,7 @@
           <w:b w:val="0"/>
           <w:sz w:val="19"/>
         </w:rPr>
-        <w:t>3.2  Design Method (PO(a))</w:t>
+        <w:t>3.2  Design Method</w:t>
         <w:tab/>
         <w:t>4</w:t>
       </w:r>
@@ -3179,7 +3179,7 @@
         </w:rPr>
         <w:t>3.3  Data and Preprocessing Pipeline</w:t>
         <w:tab/>
-        <w:t>16</w:t>
+        <w:t>17</w:t>
       </w:r>
     </w:p>
     <w:p>
@@ -3198,7 +3198,7 @@
         </w:rPr>
         <w:t>3.4  Core Source Code and Reproducibility</w:t>
         <w:tab/>
-        <w:t>19</w:t>
+        <w:t>20</w:t>
       </w:r>
     </w:p>
     <w:p>
@@ -3217,7 +3217,7 @@
         </w:rPr>
         <w:t>4  Implementation</w:t>
         <w:tab/>
-        <w:t>21</w:t>
+        <w:t>22</w:t>
       </w:r>
     </w:p>
     <w:p>
@@ -3236,7 +3236,7 @@
         </w:rPr>
         <w:t>4.1  Description</w:t>
         <w:tab/>
-        <w:t>21</w:t>
+        <w:t>22</w:t>
       </w:r>
     </w:p>
     <w:p>
@@ -3255,7 +3255,7 @@
         </w:rPr>
         <w:t>5  Design Analysis and Evaluation</w:t>
         <w:tab/>
-        <w:t>22</w:t>
+        <w:t>23</w:t>
       </w:r>
     </w:p>
     <w:p>
@@ -3274,7 +3274,7 @@
         </w:rPr>
         <w:t>5.1  Novelty</w:t>
         <w:tab/>
-        <w:t>22</w:t>
+        <w:t>23</w:t>
       </w:r>
     </w:p>
     <w:p>
@@ -3291,9 +3291,9 @@
           <w:b w:val="0"/>
           <w:sz w:val="19"/>
         </w:rPr>
-        <w:t>5.2  Design Considerations (PO(c))</w:t>
+        <w:t>5.2  Design Considerations</w:t>
         <w:tab/>
-        <w:t>22</w:t>
+        <w:t>23</w:t>
       </w:r>
     </w:p>
     <w:p>
@@ -3310,9 +3310,9 @@
           <w:b w:val="0"/>
           <w:sz w:val="19"/>
         </w:rPr>
-        <w:t>5.3  Investigations (PO(d))</w:t>
+        <w:t>5.3  Investigations</w:t>
         <w:tab/>
-        <w:t>23</w:t>
+        <w:t>24</w:t>
       </w:r>
     </w:p>
     <w:p>
@@ -3329,9 +3329,9 @@
           <w:b w:val="0"/>
           <w:sz w:val="19"/>
         </w:rPr>
-        <w:t>5.4  Limitations of Tools (PO(e))</w:t>
+        <w:t>5.4  Limitations of Tools</w:t>
         <w:tab/>
-        <w:t>38</w:t>
+        <w:t>40</w:t>
       </w:r>
     </w:p>
     <w:p>
@@ -3348,9 +3348,9 @@
           <w:b w:val="0"/>
           <w:sz w:val="19"/>
         </w:rPr>
-        <w:t>5.5  Impact Assessment (PO(f))</w:t>
+        <w:t>5.5  Impact Assessment</w:t>
         <w:tab/>
-        <w:t>38</w:t>
+        <w:t>41</w:t>
       </w:r>
     </w:p>
     <w:p>
@@ -3367,9 +3367,9 @@
           <w:b w:val="0"/>
           <w:sz w:val="19"/>
         </w:rPr>
-        <w:t>5.6  Sustainability Evaluation (PO(g))</w:t>
+        <w:t>5.6  Sustainability Evaluation</w:t>
         <w:tab/>
-        <w:t>39</w:t>
+        <w:t>41</w:t>
       </w:r>
     </w:p>
     <w:p>
@@ -3386,9 +3386,9 @@
           <w:b w:val="0"/>
           <w:sz w:val="19"/>
         </w:rPr>
-        <w:t>5.7  Ethical Issues (PO(h))</w:t>
+        <w:t>5.7  Ethical Issues</w:t>
         <w:tab/>
-        <w:t>39</w:t>
+        <w:t>41</w:t>
       </w:r>
     </w:p>
     <w:p>
@@ -3405,9 +3405,9 @@
           <w:b/>
           <w:sz w:val="20"/>
         </w:rPr>
-        <w:t>6  Reflection on Individual and Team work (PO(i))</w:t>
+        <w:t>6  Reflection on Individual and Team work</w:t>
         <w:tab/>
-        <w:t>39</w:t>
+        <w:t>42</w:t>
       </w:r>
     </w:p>
     <w:p>
@@ -3426,7 +3426,7 @@
         </w:rPr>
         <w:t>6.1  Individual Contribution of Each Member</w:t>
         <w:tab/>
-        <w:t>39</w:t>
+        <w:t>42</w:t>
       </w:r>
     </w:p>
     <w:p>
@@ -3441,7 +3441,7 @@
       <w:r>
         <w:t>6.2  Mode of TeamWork</w:t>
         <w:tab/>
-        <w:t>40</w:t>
+        <w:t>42</w:t>
       </w:r>
     </w:p>
     <w:p>
@@ -3456,7 +3456,7 @@
       <w:r>
         <w:t>6.3  Diversity Statement of Team</w:t>
         <w:tab/>
-        <w:t>40</w:t>
+        <w:t>42</w:t>
       </w:r>
     </w:p>
     <w:p>
@@ -3475,7 +3475,7 @@
         </w:rPr>
         <w:t>6.4  Log Book of Project Implementation</w:t>
         <w:tab/>
-        <w:t>40</w:t>
+        <w:t>42</w:t>
       </w:r>
     </w:p>
     <w:p>
@@ -3492,9 +3492,9 @@
           <w:b/>
           <w:sz w:val="20"/>
         </w:rPr>
-        <w:t>7  Communication to External Stakeholders (PO(j))</w:t>
+        <w:t>7  Communication to External Stakeholders</w:t>
         <w:tab/>
-        <w:t>41</w:t>
+        <w:t>43</w:t>
       </w:r>
     </w:p>
     <w:p>
@@ -3513,7 +3513,7 @@
         </w:rPr>
         <w:t>7.1  Executive Summary</w:t>
         <w:tab/>
-        <w:t>41</w:t>
+        <w:t>43</w:t>
       </w:r>
     </w:p>
     <w:p>
@@ -3532,7 +3532,7 @@
         </w:rPr>
         <w:t>7.2  Reproducing Our Results</w:t>
         <w:tab/>
-        <w:t>41</w:t>
+        <w:t>44</w:t>
       </w:r>
     </w:p>
     <w:p>
@@ -3549,9 +3549,9 @@
           <w:b/>
           <w:sz w:val="20"/>
         </w:rPr>
-        <w:t>8  Project Management and Cost Analysis (PO(k))</w:t>
+        <w:t>8  Project Management and Cost Analysis</w:t>
         <w:tab/>
-        <w:t>42</w:t>
+        <w:t>44</w:t>
       </w:r>
     </w:p>
     <w:p>
@@ -3570,7 +3570,7 @@
         </w:rPr>
         <w:t>8.1  Computational Resources Used</w:t>
         <w:tab/>
-        <w:t>42</w:t>
+        <w:t>44</w:t>
       </w:r>
     </w:p>
     <w:p>
@@ -3589,7 +3589,7 @@
         </w:rPr>
         <w:t>8.2  Timeline of Project Implementation</w:t>
         <w:tab/>
-        <w:t>42</w:t>
+        <w:t>45</w:t>
       </w:r>
     </w:p>
     <w:p>
@@ -3606,9 +3606,9 @@
           <w:b/>
           <w:sz w:val="20"/>
         </w:rPr>
-        <w:t>9  Future Work (PO(l))</w:t>
+        <w:t>9  Future Work</w:t>
         <w:tab/>
-        <w:t>42</w:t>
+        <w:t>45</w:t>
       </w:r>
     </w:p>
     <w:p>
@@ -3627,7 +3627,7 @@
         </w:rPr>
         <w:t>10  References</w:t>
         <w:tab/>
-        <w:t>43</w:t>
+        <w:t>45</w:t>
       </w:r>
     </w:p>
     <w:p>
@@ -3646,7 +3646,7 @@
         </w:rPr>
         <w:t>11  Appendix: Reproducibility Records</w:t>
         <w:tab/>
-        <w:t>44</w:t>
+        <w:t>47</w:t>
       </w:r>
     </w:p>
     <w:p>
@@ -3665,7 +3665,7 @@
         </w:rPr>
         <w:t>11.1  Environment and Checkpoint Provenance</w:t>
         <w:tab/>
-        <w:t>44</w:t>
+        <w:t>47</w:t>
       </w:r>
     </w:p>
     <w:p>
@@ -3684,7 +3684,7 @@
         </w:rPr>
         <w:t>11.2  Stroke Cohort: Pre-registration, Post-hoc Input and Fold-local Check</w:t>
         <w:tab/>
-        <w:t>45</w:t>
+        <w:t>47</w:t>
       </w:r>
     </w:p>
     <w:p>
@@ -3703,7 +3703,7 @@
         </w:rPr>
         <w:t>11.3  Experiment 5 Corrected Statistics</w:t>
         <w:tab/>
-        <w:t>45</w:t>
+        <w:t>48</w:t>
       </w:r>
     </w:p>
     <w:p>
@@ -3722,7 +3722,7 @@
         </w:rPr>
         <w:t>11.4  Reproducibility Files</w:t>
         <w:tab/>
-        <w:t>46</w:t>
+        <w:t>48</w:t>
       </w:r>
     </w:p>
     <w:p>
@@ -3741,7 +3741,7 @@
         </w:rPr>
         <w:t>11.5  Checks Not Run</w:t>
         <w:tab/>
-        <w:t>46</w:t>
+        <w:t>49</w:t>
       </w:r>
     </w:p>
     <w:p>
@@ -3760,7 +3760,7 @@
         </w:rPr>
         <w:t>11.6  Pre-training Configuration and Commands</w:t>
         <w:tab/>
-        <w:t>47</w:t>
+        <w:t>50</w:t>
       </w:r>
     </w:p>
     <w:p>
@@ -3779,7 +3779,7 @@
         </w:rPr>
         <w:t>11.7  Statistical Procedures</w:t>
         <w:tab/>
-        <w:t>48</w:t>
+        <w:t>50</w:t>
       </w:r>
     </w:p>
     <w:p>
@@ -3798,7 +3798,7 @@
         </w:rPr>
         <w:t>11.8  Stroke Spectral-Matching Filter</w:t>
         <w:tab/>
-        <w:t>48</w:t>
+        <w:t>51</w:t>
       </w:r>
     </w:p>
     <w:p>
@@ -3817,7 +3817,7 @@
         </w:rPr>
         <w:t>11.9  Data Used by Each Experiment</w:t>
         <w:tab/>
-        <w:t>49</w:t>
+        <w:t>52</w:t>
       </w:r>
     </w:p>
     <w:p>
@@ -5217,39 +5217,6 @@
                 <w:sz w:val="18"/>
               </w:rPr>
               <w:t xml:space="preserve">The NMT Scalp EEG Dataset, an open clinical EEG corpus from Pakistan</w:t>
-            </w:r>
-          </w:p>
-        </w:tc>
-      </w:tr>
-      <w:tr>
-        <w:trPr>
-          <w:cantSplit/>
-        </w:trPr>
-        <w:tc>
-          <w:tcPr>
-            <w:tcW w:type="dxa" w:w="1800"/>
-          </w:tcPr>
-          <w:p>
-            <w:r/>
-            <w:r>
-              <w:rPr>
-                <w:sz w:val="18"/>
-              </w:rPr>
-              <w:t xml:space="preserve">PO</w:t>
-            </w:r>
-          </w:p>
-        </w:tc>
-        <w:tc>
-          <w:tcPr>
-            <w:tcW w:type="dxa" w:w="7111"/>
-          </w:tcPr>
-          <w:p>
-            <w:r/>
-            <w:r>
-              <w:rPr>
-                <w:sz w:val="18"/>
-              </w:rPr>
-              <w:t>Program outcome: the letter in a section heading, e.g. PO(d), names the course outcome that section addresses</w:t>
             </w:r>
           </w:p>
         </w:tc>
@@ -6369,7 +6336,7 @@
         <w:spacing w:before="180" w:after="120"/>
       </w:pPr>
       <w:r>
-        <w:t>Problem Formulation (PO(b))</w:t>
+        <w:t>Problem Formulation</w:t>
       </w:r>
     </w:p>
     <w:p>
@@ -6532,7 +6499,7 @@
         <w:spacing w:before="180" w:after="120"/>
       </w:pPr>
       <w:r>
-        <w:t>Design Method (PO(a))</w:t>
+        <w:t>Design Method</w:t>
       </w:r>
     </w:p>
     <w:p>
@@ -12582,7 +12549,7 @@
         <w:spacing w:before="180" w:after="120"/>
       </w:pPr>
       <w:r>
-        <w:t>Design Considerations (PO(c))</w:t>
+        <w:t>Design Considerations</w:t>
       </w:r>
     </w:p>
     <w:p>
@@ -12646,7 +12613,7 @@
         <w:spacing w:before="180" w:after="120"/>
       </w:pPr>
       <w:r>
-        <w:t>Investigations (PO(d))</w:t>
+        <w:t>Investigations</w:t>
       </w:r>
     </w:p>
     <w:p>
@@ -20472,7 +20439,7 @@
         <w:spacing w:before="180" w:after="120"/>
       </w:pPr>
       <w:r>
-        <w:t>Limitations of Tools (PO(e))</w:t>
+        <w:t>Limitations of Tools</w:t>
       </w:r>
     </w:p>
     <w:p/>
@@ -20590,7 +20557,7 @@
         <w:spacing w:before="180" w:after="120"/>
       </w:pPr>
       <w:r>
-        <w:t>Impact Assessment (PO(f))</w:t>
+        <w:t>Impact Assessment</w:t>
       </w:r>
     </w:p>
     <w:p>
@@ -20678,7 +20645,7 @@
         <w:spacing w:before="180" w:after="120"/>
       </w:pPr>
       <w:r>
-        <w:t>Sustainability Evaluation (PO(g))</w:t>
+        <w:t>Sustainability Evaluation</w:t>
       </w:r>
     </w:p>
     <w:p>
@@ -20696,7 +20663,7 @@
         <w:spacing w:before="180" w:after="120"/>
       </w:pPr>
       <w:r>
-        <w:t>Ethical Issues (PO(h))</w:t>
+        <w:t>Ethical Issues</w:t>
       </w:r>
     </w:p>
     <w:p>
@@ -20714,7 +20681,7 @@
         <w:spacing w:before="240" w:after="120"/>
       </w:pPr>
       <w:r>
-        <w:t>Reflection on Individual and Team work (PO(i))</w:t>
+        <w:t>Reflection on Individual and Team work</w:t>
       </w:r>
     </w:p>
     <w:p>
@@ -21617,7 +21584,7 @@
         <w:spacing w:before="240" w:after="120"/>
       </w:pPr>
       <w:r>
-        <w:t>Communication to External Stakeholders (PO(j))</w:t>
+        <w:t>Communication to External Stakeholders</w:t>
       </w:r>
     </w:p>
     <w:p>
@@ -21653,7 +21620,7 @@
         <w:rPr>
           <w:b w:val="0"/>
         </w:rPr>
-        <w:t>All code, saved model checkpoints, and saved per-recording predictions used to produce every number, table, and figure in this report are organized as a set of scripts, one per experiment (Table 5). Table 4 gives the script behind each experiment's input. The 200 Hz NMT copy that FEI and GTJ read (per-channel z-scored at NMT's native rate, stored as 2.5-second frames) was first written in August 2026 by a script that was not kept; we reconstructed its recipe as code/preprocess_nmt_200hz.py, which reproduces all 2,417 stored files byte for byte. From those inputs, pre-train an encoder (`fei_pretrain.py` or `fei_branchC.py`, both with a `--selftest` flag for a fast sanity check with no real data and a `--cv` flag for the full five-fold cross-validation reported here), score it with `feic_nmt_anchor.py` (Experiment 5) or `tuab_feic.py` (Experiment 6), and evaluate a frozen or fine-tuned released checkpoint with the corresponding `tuab_*_eval.py` script. Every long-running script checkpoints its progress after each cross-validation fold and can be safely re-run to resume after an interruption, and each accepts command-line flags for every experiment variant reported here. The code is in github.com/mashfiqurrahman2020-coder/EEG-VJEPA-act-0, a private repository because it holds results computed on our unofficial TUAB copy (§5.5.3); course examiners can be given read access to the exact commit below. Its docs/act0_repro/ folder holds the fold, subset and cohort lists, the SHA-256 of every checkpoint and result file, and the pinned environment (Appendix §11). The code, checkpoints and results behind this report are commit 424cae1cc560cff32f1128f50c066e8c2f8e5ee5, which unlike a tag cannot be moved: git clone https://github.com/mashfiqurrahman2020-coder/EEG-VJEPA-act-0.git, then git checkout 424cae1cc560, then pip install -r docs/act0_repro/requirements-act0.txt under Python 3.9. Appendix §11.6 gives the pre-training commands and §11.9 the data each experiment uses. The report itself is in a later commit, under the tag act0-report-round15e. All 70 FEI/GTJ checkpoints are committed in the repository (code/*.pt, about 180 MB), so nothing needs a separate download except the data and the released EEG-VJEPA weights. Two kinds of reproduction follow. The saved checkpoints and predictions reproduce every reported number exactly. Re-training does not: the original FEI and GTJ runs set no random seed, so they cannot be regenerated bit for bit, and cuDNN kernels were left non-deterministic, so even the seeded re-runs should be expected to reproduce the results statistically, not bit for bit.</w:t>
+        <w:t>All code, saved model checkpoints, and saved per-recording predictions used to produce every number, table, and figure in this report are organized as a set of scripts, one per experiment (Table 5). Table 4 gives the script behind each experiment's input. The 200 Hz NMT copy that FEI and GTJ read (per-channel z-scored at NMT's native rate, stored as 2.5-second frames) was first written in August 2026 by a script that was not kept; we reconstructed its recipe as code/preprocess_nmt_200hz.py, which reproduces all 2,417 stored files byte for byte. From those inputs, pre-train an encoder (`fei_pretrain.py` or `fei_branchC.py`, both with a `--selftest` flag for a fast sanity check with no real data and a `--cv` flag for the full five-fold cross-validation reported here), score it with `feic_nmt_anchor.py` (Experiment 5) or `tuab_feic.py` (Experiment 6), and evaluate a frozen or fine-tuned released checkpoint with the corresponding `tuab_*_eval.py` script. Every long-running script checkpoints its progress after each cross-validation fold and can be safely re-run to resume after an interruption, and each accepts command-line flags for every experiment variant reported here. The code is in github.com/mashfiqurrahman2020-coder/EEG-VJEPA-act-0, a private repository because it holds results computed on our unofficial TUAB copy (§5.5.3); course examiners can be given read access to the exact commit below. Its docs/act0_repro/ folder holds the fold, subset and cohort lists, the SHA-256 of every checkpoint and result file, and the pinned environment (Appendix §11). The code, checkpoints and results behind this report are commit 424cae1cc560cff32f1128f50c066e8c2f8e5ee5, which unlike a tag cannot be moved: git clone https://github.com/mashfiqurrahman2020-coder/EEG-VJEPA-act-0.git, then git checkout 424cae1cc560, then pip install -r docs/act0_repro/requirements-act0.txt under Python 3.9. Appendix §11.6 gives the pre-training commands and §11.9 the data each experiment uses. The report itself is in a later commit, under the tag act0-report-round15f. All 70 FEI/GTJ checkpoints are committed in the repository (code/*.pt, about 180 MB), so nothing needs a separate download except the data and the released EEG-VJEPA weights. Two kinds of reproduction follow. The saved checkpoints and predictions reproduce every reported number exactly. Re-training does not: the original FEI and GTJ runs set no random seed, so they cannot be regenerated bit for bit, and cuDNN kernels were left non-deterministic, so even the seeded re-runs should be expected to reproduce the results statistically, not bit for bit.</w:t>
       </w:r>
     </w:p>
     <w:p>
@@ -21663,7 +21630,7 @@
         <w:spacing w:before="240" w:after="120"/>
       </w:pPr>
       <w:r>
-        <w:t>Project Management and Cost Analysis (PO(k))</w:t>
+        <w:t>Project Management and Cost Analysis</w:t>
       </w:r>
     </w:p>
     <w:p>
@@ -21729,7 +21696,7 @@
         <w:spacing w:before="240" w:after="120"/>
       </w:pPr>
       <w:r>
-        <w:t>Future Work (PO(l))</w:t>
+        <w:t>Future Work</w:t>
       </w:r>
     </w:p>
     <w:p/>

</xml_diff>